<commit_message>
docs: update project doc
</commit_message>
<xml_diff>
--- a/doc/documentation-projet-iray.docx
+++ b/doc/documentation-projet-iray.docx
@@ -542,10 +542,11 @@
       </w:pPr>
       <w:r>
         <w:rPr>
-          <w:rFonts w:eastAsia="Times New Roman" w:cs="Times New Roman"/>
+          <w:rFonts w:ascii="Times New Roman" w:hAnsi="Times New Roman" w:eastAsia="Times New Roman" w:cs="Times New Roman"/>
+          <w:b w:val="0"/>
           <w:sz w:val="22"/>
         </w:rPr>
-        <w:t>État au 16 septembre 2026 : application citoyenne offline-first opérationnelle en debug.</w:t>
+        <w:t>État au 17 septembre 2026 : application citoyenne offline-first opérationnelle en debug.</w:t>
       </w:r>
     </w:p>
     <w:p>
@@ -668,15 +669,11 @@
       </w:pPr>
       <w:r>
         <w:rPr>
-          <w:rFonts w:cs="Times New Roman"/>
-        </w:rPr>
-        <w:t>Signalements : catégories, sous-catégories, carte Google Maps + GPS (latitude / longitude), photos, confi</w:t>
-      </w:r>
-      <w:r>
-        <w:rPr>
-          <w:rFonts w:cs="Times New Roman"/>
-        </w:rPr>
-        <w:t>rmation, Mes signalements.</w:t>
+          <w:rFonts w:ascii="Times New Roman" w:hAnsi="Times New Roman" w:eastAsia="Times New Roman" w:cs="Times New Roman"/>
+          <w:b w:val="0"/>
+          <w:sz w:val="22"/>
+        </w:rPr>
+        <w:t>Signalements : catégories, sous-catégories, carte MapLibre + OpenStreetMap + GPS (latitude / longitude), photos, confirmation, Mes signalements.</w:t>
       </w:r>
     </w:p>
     <w:p>
@@ -792,15 +789,11 @@
       </w:pPr>
       <w:r>
         <w:rPr>
-          <w:rFonts w:cs="Times New Roman"/>
-        </w:rPr>
-        <w:t>Tuiles carte Google : activer Maps SDK for Android + restriction clé API (package + SHA-1) sur le compte Firebase iray-mobile</w:t>
-      </w:r>
-      <w:r>
-        <w:rPr>
-          <w:rFonts w:cs="Times New Roman"/>
-        </w:rPr>
-        <w:t>.</w:t>
+          <w:rFonts w:ascii="Times New Roman" w:hAnsi="Times New Roman" w:eastAsia="Times New Roman" w:cs="Times New Roman"/>
+          <w:b w:val="0"/>
+          <w:sz w:val="22"/>
+        </w:rPr>
+        <w:t>Packs carte hors-ligne : premier téléchargement Internet (Madagascar aperçu + Antananarivo détail) ; hors zone préchargée = réseau encore requis.</w:t>
       </w:r>
     </w:p>
     <w:p>
@@ -812,9 +805,11 @@
       </w:pPr>
       <w:r>
         <w:rPr>
-          <w:rFonts w:cs="Times New Roman"/>
-        </w:rPr>
-        <w:t>Réseau téléphone : VPN / DNS peuvent empêcher le chargement des tuiles (carte grise).</w:t>
+          <w:rFonts w:ascii="Times New Roman" w:hAnsi="Times New Roman" w:eastAsia="Times New Roman" w:cs="Times New Roman"/>
+          <w:b w:val="0"/>
+          <w:sz w:val="22"/>
+        </w:rPr>
+        <w:t>Réseau téléphone : VPN / DNS peuvent empêcher le chargement des tuiles OSM si le pack hors-ligne n’est pas encore prêt.</w:t>
       </w:r>
     </w:p>
     <w:p>
@@ -963,17 +958,11 @@
       </w:pPr>
       <w:r>
         <w:rPr>
-          <w:rFonts w:eastAsia="Times New Roman" w:cs="Times New Roman"/>
+          <w:rFonts w:ascii="Times New Roman" w:hAnsi="Times New Roman" w:eastAsia="Times New Roman" w:cs="Times New Roman"/>
+          <w:b w:val="0"/>
           <w:sz w:val="22"/>
         </w:rPr>
-        <w:t>Stack mobile : Kotlin, Jetpack Compose, Navigation Compose, Room, Firebase (Auth, Firestore, S</w:t>
-      </w:r>
-      <w:r>
-        <w:rPr>
-          <w:rFonts w:eastAsia="Times New Roman" w:cs="Times New Roman"/>
-          <w:sz w:val="22"/>
-        </w:rPr>
-        <w:t>torage), WorkManager, Google Maps Compose, Play Services Location.</w:t>
+        <w:t>Stack mobile : Kotlin, Jetpack Compose, Navigation Compose, Room, Firebase (Auth, Firestore, Storage), WorkManager, MapLibre Native (OpenStreetMap), Play Services Location.</w:t>
       </w:r>
     </w:p>
     <w:p>
@@ -1867,9 +1856,11 @@
       </w:pPr>
       <w:r>
         <w:rPr>
-          <w:rFonts w:cs="Times New Roman"/>
-        </w:rPr>
-        <w:t>Indiquer la localisation avec la position actuelle (GPS) ou un tap sur la carte Google Maps.</w:t>
+          <w:rFonts w:ascii="Times New Roman" w:hAnsi="Times New Roman" w:eastAsia="Times New Roman" w:cs="Times New Roman"/>
+          <w:b w:val="0"/>
+          <w:sz w:val="22"/>
+        </w:rPr>
+        <w:t>Indiquer la localisation avec la position actuelle (GPS) ou un tap sur la carte MapLibre / OpenStreetMap.</w:t>
       </w:r>
     </w:p>
     <w:p>
@@ -1942,10 +1933,7 @@
         </w:rPr>
       </w:pPr>
       <w:r>
-        <w:rPr>
-          <w:rFonts w:ascii="Times New Roman" w:hAnsi="Times New Roman" w:cs="Times New Roman"/>
-        </w:rPr>
-        <w:t>7.3. Carte (implémentation actuelle)</w:t>
+        <w:t>7.3. Carte MapLibre / OpenStreetMap (implémentation actuelle)</w:t>
       </w:r>
     </w:p>
     <w:p>
@@ -1957,15 +1945,11 @@
       </w:pPr>
       <w:r>
         <w:rPr>
-          <w:rFonts w:cs="Times New Roman"/>
-        </w:rPr>
-        <w:t xml:space="preserve">Écran Toerana : carte </w:t>
-      </w:r>
-      <w:r>
-        <w:rPr>
-          <w:rFonts w:cs="Times New Roman"/>
-        </w:rPr>
-        <w:t>interactive, tap pour poser un pin, bouton GPS.</w:t>
+          <w:rFonts w:ascii="Times New Roman" w:hAnsi="Times New Roman" w:eastAsia="Times New Roman" w:cs="Times New Roman"/>
+          <w:b w:val="0"/>
+          <w:sz w:val="22"/>
+        </w:rPr>
+        <w:t>Écran Toerana : carte interactive MapLibre + tuiles OpenStreetMap, tap pour poser un pin, bouton GPS.</w:t>
       </w:r>
     </w:p>
     <w:p>
@@ -1991,9 +1975,11 @@
       </w:pPr>
       <w:r>
         <w:rPr>
-          <w:rFonts w:cs="Times New Roman"/>
-        </w:rPr>
-        <w:t>Clé API : meta-data com.google.android.geo.API_KEY (MAPS_API_KEY).</w:t>
+          <w:rFonts w:ascii="Times New Roman" w:hAnsi="Times New Roman" w:eastAsia="Times New Roman" w:cs="Times New Roman"/>
+          <w:b w:val="0"/>
+          <w:sz w:val="22"/>
+        </w:rPr>
+        <w:t>Style : assets/map/osm_raster_style.json (pas de clé Google Maps).</w:t>
       </w:r>
     </w:p>
     <w:p>
@@ -2005,15 +1991,11 @@
       </w:pPr>
       <w:r>
         <w:rPr>
-          <w:rFonts w:cs="Times New Roman"/>
-        </w:rPr>
-        <w:t xml:space="preserve">À configurer sur le compte Google du projet iray-mobile : Maps SDK for </w:t>
-      </w:r>
-      <w:r>
-        <w:rPr>
-          <w:rFonts w:cs="Times New Roman"/>
-        </w:rPr>
-        <w:t>Android + restriction Android (mg.iray.app + SHA-1).</w:t>
+          <w:rFonts w:ascii="Times New Roman" w:hAnsi="Times New Roman" w:eastAsia="Times New Roman" w:cs="Times New Roman"/>
+          <w:b w:val="0"/>
+          <w:sz w:val="22"/>
+        </w:rPr>
+        <w:t>Hors-ligne : MapOfflinePackager précharge Madagascar (zoom 4-8) et Antananarivo (zoom 11-15) au démarrage si Internet.</w:t>
       </w:r>
     </w:p>
     <w:p>
@@ -2881,15 +2863,11 @@
       </w:pPr>
       <w:r>
         <w:rPr>
-          <w:rFonts w:cs="Times New Roman"/>
-        </w:rPr>
-        <w:t>app/ (sources, assets/territories_seed.json, goo</w:t>
-      </w:r>
-      <w:r>
-        <w:rPr>
-          <w:rFonts w:cs="Times New Roman"/>
-        </w:rPr>
-        <w:t>gle-services.json)</w:t>
+          <w:rFonts w:ascii="Times New Roman" w:hAnsi="Times New Roman" w:eastAsia="Times New Roman" w:cs="Times New Roman"/>
+          <w:b w:val="0"/>
+          <w:sz w:val="22"/>
+        </w:rPr>
+        <w:t>app/ (sources, assets/territories_seed.json, assets/map/osm_raster_style.json, google-services.json)</w:t>
       </w:r>
     </w:p>
     <w:p>
@@ -3312,13 +3290,12 @@
           <w:p>
             <w:pPr>
               <w:spacing w:before="40" w:after="40" w:line="360" w:lineRule="auto"/>
-              <w:rPr>
-                <w:rFonts w:cs="Times New Roman"/>
-              </w:rPr>
             </w:pPr>
+            <w:r/>
             <w:r>
               <w:rPr>
-                <w:rFonts w:eastAsia="Times New Roman" w:cs="Times New Roman"/>
+                <w:rFonts w:ascii="Times New Roman" w:hAnsi="Times New Roman" w:eastAsia="Times New Roman" w:cs="Times New Roman"/>
+                <w:b w:val="0"/>
                 <w:sz w:val="22"/>
               </w:rPr>
               <w:t>Signalements</w:t>
@@ -3332,16 +3309,15 @@
           <w:p>
             <w:pPr>
               <w:spacing w:before="40" w:after="40" w:line="360" w:lineRule="auto"/>
-              <w:rPr>
-                <w:rFonts w:cs="Times New Roman"/>
-              </w:rPr>
             </w:pPr>
+            <w:r/>
             <w:r>
               <w:rPr>
-                <w:rFonts w:eastAsia="Times New Roman" w:cs="Times New Roman"/>
+                <w:rFonts w:ascii="Times New Roman" w:hAnsi="Times New Roman" w:eastAsia="Times New Roman" w:cs="Times New Roman"/>
+                <w:b w:val="0"/>
                 <w:sz w:val="22"/>
               </w:rPr>
-              <w:t>Catégories, carte GPS, photos, suivi</w:t>
+              <w:t>Catégories, MapLibre/OSM, GPS, photos, suivi</w:t>
             </w:r>
           </w:p>
         </w:tc>
@@ -3352,16 +3328,15 @@
           <w:p>
             <w:pPr>
               <w:spacing w:before="40" w:after="40" w:line="360" w:lineRule="auto"/>
-              <w:rPr>
-                <w:rFonts w:cs="Times New Roman"/>
-              </w:rPr>
             </w:pPr>
+            <w:r/>
             <w:r>
               <w:rPr>
-                <w:rFonts w:eastAsia="Times New Roman" w:cs="Times New Roman"/>
+                <w:rFonts w:ascii="Times New Roman" w:hAnsi="Times New Roman" w:eastAsia="Times New Roman" w:cs="Times New Roman"/>
+                <w:b w:val="0"/>
                 <w:sz w:val="22"/>
               </w:rPr>
-              <w:t>Fait (citoyen) ; tuiles Maps à finaliser</w:t>
+              <w:t>Fait (citoyen) ; pack hors-ligne Tana</w:t>
             </w:r>
           </w:p>
         </w:tc>
@@ -3845,10 +3820,11 @@
       </w:pPr>
       <w:r>
         <w:rPr>
-          <w:rFonts w:eastAsia="Times New Roman" w:cs="Times New Roman"/>
+          <w:rFonts w:ascii="Times New Roman" w:hAnsi="Times New Roman" w:eastAsia="Times New Roman" w:cs="Times New Roman"/>
+          <w:b w:val="0"/>
           <w:sz w:val="22"/>
         </w:rPr>
-        <w:t>La base technique actuelle (Compose, Room, Firebase, offline-first, carte GPS) permet de livrer le parcours citoyen MVP et d’étendre ensuite les rôles agent / responsable sur la même application.</w:t>
+        <w:t>La base technique actuelle (Compose, Room, Firebase, offline-first, MapLibre / OpenStreetMap + packs hors-ligne, GPS) permet de livrer le parcours citoyen MVP et d’étendre ensuite les rôles agent / responsable sur la même application.</w:t>
       </w:r>
     </w:p>
     <w:p>
@@ -3859,17 +3835,11 @@
       </w:pPr>
       <w:r>
         <w:rPr>
-          <w:rFonts w:eastAsia="Times New Roman" w:cs="Times New Roman"/>
+          <w:rFonts w:ascii="Times New Roman" w:hAnsi="Times New Roman" w:eastAsia="Times New Roman" w:cs="Times New Roman"/>
+          <w:b w:val="0"/>
           <w:sz w:val="22"/>
         </w:rPr>
-        <w:t>Document mis à jour le 16/09/2026 selon l’état du dépôt ir</w:t>
-      </w:r>
-      <w:r>
-        <w:rPr>
-          <w:rFonts w:eastAsia="Times New Roman" w:cs="Times New Roman"/>
-          <w:sz w:val="22"/>
-        </w:rPr>
-        <w:t>ay (branche integrate/design-backend).</w:t>
+        <w:t>Document mis à jour le 17/09/2026 selon l’état du dépôt iray (MapLibre / OSM / packs carte hors-ligne).</w:t>
       </w:r>
     </w:p>
     <w:sectPr>

</xml_diff>

<commit_message>
docs: enhance project doc w screens v1
</commit_message>
<xml_diff>
--- a/doc/documentation-projet-iray.docx
+++ b/doc/documentation-projet-iray.docx
@@ -3604,12 +3604,3603 @@
         </w:tc>
       </w:tr>
     </w:tbl>
+    <w:tbl>
+      <w:tblPr>
+        <w:tblW w:type="auto" w:w="0"/>
+        <w:tblLook w:firstColumn="1" w:firstRow="1" w:lastColumn="0" w:lastRow="0" w:noHBand="0" w:noVBand="1" w:val="04A0"/>
+      </w:tblPr>
+      <w:tblGrid>
+        <w:gridCol w:w="2436"/>
+        <w:gridCol w:w="2436"/>
+        <w:gridCol w:w="2436"/>
+        <w:gridCol w:w="2436"/>
+      </w:tblGrid>
+      <w:tr>
+        <w:tc>
+          <w:tcPr>
+            <w:tcW w:type="dxa" w:w="2436"/>
+            <w:tcBorders>
+              <w:top w:val="nil"/>
+              <w:left w:val="nil"/>
+              <w:bottom w:val="nil"/>
+              <w:right w:val="nil"/>
+            </w:tcBorders>
+          </w:tcPr>
+          <w:p>
+            <w:pPr>
+              <w:jc w:val="center"/>
+            </w:pPr>
+            <w:r>
+              <w:drawing>
+                <wp:inline xmlns:a="http://schemas.openxmlformats.org/drawingml/2006/main" xmlns:pic="http://schemas.openxmlformats.org/drawingml/2006/picture">
+                  <wp:extent cx="1395000" cy="3100000"/>
+                  <wp:docPr id="1" name="Picture 1"/>
+                  <wp:cNvGraphicFramePr>
+                    <a:graphicFrameLocks noChangeAspect="1"/>
+                  </wp:cNvGraphicFramePr>
+                  <a:graphic>
+                    <a:graphicData uri="http://schemas.openxmlformats.org/drawingml/2006/picture">
+                      <pic:pic>
+                        <pic:nvPicPr>
+                          <pic:cNvPr id="0" name="notifications-liste.jpg"/>
+                          <pic:cNvPicPr/>
+                        </pic:nvPicPr>
+                        <pic:blipFill>
+                          <a:blip r:embed="rId12"/>
+                          <a:stretch>
+                            <a:fillRect/>
+                          </a:stretch>
+                        </pic:blipFill>
+                        <pic:spPr>
+                          <a:xfrm>
+                            <a:off x="0" y="0"/>
+                            <a:ext cx="1395000" cy="3100000"/>
+                          </a:xfrm>
+                          <a:prstGeom prst="rect"/>
+                        </pic:spPr>
+                      </pic:pic>
+                    </a:graphicData>
+                  </a:graphic>
+                </wp:inline>
+              </w:drawing>
+            </w:r>
+          </w:p>
+          <w:p>
+            <w:pPr>
+              <w:jc w:val="center"/>
+            </w:pPr>
+            <w:r>
+              <w:rPr>
+                <w:rFonts w:ascii="Times New Roman" w:hAnsi="Times New Roman" w:eastAsia="Times New Roman" w:cs="Times New Roman"/>
+                <w:b w:val="0"/>
+                <w:color w:val="161616"/>
+                <w:sz w:val="16"/>
+              </w:rPr>
+              <w:t>Notifications</w:t>
+            </w:r>
+          </w:p>
+        </w:tc>
+        <w:tc>
+          <w:tcPr>
+            <w:tcW w:type="dxa" w:w="2436"/>
+            <w:tcBorders>
+              <w:top w:val="nil"/>
+              <w:left w:val="nil"/>
+              <w:bottom w:val="nil"/>
+              <w:right w:val="nil"/>
+            </w:tcBorders>
+          </w:tcPr>
+          <w:p>
+            <w:pPr>
+              <w:jc w:val="center"/>
+            </w:pPr>
+            <w:r>
+              <w:drawing>
+                <wp:inline xmlns:a="http://schemas.openxmlformats.org/drawingml/2006/main" xmlns:pic="http://schemas.openxmlformats.org/drawingml/2006/picture">
+                  <wp:extent cx="1395000" cy="3100000"/>
+                  <wp:docPr id="2" name="Picture 2"/>
+                  <wp:cNvGraphicFramePr>
+                    <a:graphicFrameLocks noChangeAspect="1"/>
+                  </wp:cNvGraphicFramePr>
+                  <a:graphic>
+                    <a:graphicData uri="http://schemas.openxmlformats.org/drawingml/2006/picture">
+                      <pic:pic>
+                        <pic:nvPicPr>
+                          <pic:cNvPr id="0" name="notifications-filtre-non-lues.jpg"/>
+                          <pic:cNvPicPr/>
+                        </pic:nvPicPr>
+                        <pic:blipFill>
+                          <a:blip r:embed="rId13"/>
+                          <a:stretch>
+                            <a:fillRect/>
+                          </a:stretch>
+                        </pic:blipFill>
+                        <pic:spPr>
+                          <a:xfrm>
+                            <a:off x="0" y="0"/>
+                            <a:ext cx="1395000" cy="3100000"/>
+                          </a:xfrm>
+                          <a:prstGeom prst="rect"/>
+                        </pic:spPr>
+                      </pic:pic>
+                    </a:graphicData>
+                  </a:graphic>
+                </wp:inline>
+              </w:drawing>
+            </w:r>
+          </w:p>
+          <w:p>
+            <w:pPr>
+              <w:jc w:val="center"/>
+            </w:pPr>
+            <w:r>
+              <w:rPr>
+                <w:rFonts w:ascii="Times New Roman" w:hAnsi="Times New Roman" w:eastAsia="Times New Roman" w:cs="Times New Roman"/>
+                <w:b w:val="0"/>
+                <w:color w:val="161616"/>
+                <w:sz w:val="16"/>
+              </w:rPr>
+              <w:t>Non lues</w:t>
+            </w:r>
+          </w:p>
+        </w:tc>
+        <w:tc>
+          <w:tcPr>
+            <w:tcW w:type="dxa" w:w="2436"/>
+            <w:tcBorders>
+              <w:top w:val="nil"/>
+              <w:left w:val="nil"/>
+              <w:bottom w:val="nil"/>
+              <w:right w:val="nil"/>
+            </w:tcBorders>
+          </w:tcPr>
+          <w:p>
+            <w:pPr>
+              <w:jc w:val="center"/>
+            </w:pPr>
+            <w:r>
+              <w:drawing>
+                <wp:inline xmlns:a="http://schemas.openxmlformats.org/drawingml/2006/main" xmlns:pic="http://schemas.openxmlformats.org/drawingml/2006/picture">
+                  <wp:extent cx="1395000" cy="3100000"/>
+                  <wp:docPr id="3" name="Picture 3"/>
+                  <wp:cNvGraphicFramePr>
+                    <a:graphicFrameLocks noChangeAspect="1"/>
+                  </wp:cNvGraphicFramePr>
+                  <a:graphic>
+                    <a:graphicData uri="http://schemas.openxmlformats.org/drawingml/2006/picture">
+                      <pic:pic>
+                        <pic:nvPicPr>
+                          <pic:cNvPr id="0" name="notifications-filtre-fangatahana.jpg"/>
+                          <pic:cNvPicPr/>
+                        </pic:nvPicPr>
+                        <pic:blipFill>
+                          <a:blip r:embed="rId14"/>
+                          <a:stretch>
+                            <a:fillRect/>
+                          </a:stretch>
+                        </pic:blipFill>
+                        <pic:spPr>
+                          <a:xfrm>
+                            <a:off x="0" y="0"/>
+                            <a:ext cx="1395000" cy="3100000"/>
+                          </a:xfrm>
+                          <a:prstGeom prst="rect"/>
+                        </pic:spPr>
+                      </pic:pic>
+                    </a:graphicData>
+                  </a:graphic>
+                </wp:inline>
+              </w:drawing>
+            </w:r>
+          </w:p>
+          <w:p>
+            <w:pPr>
+              <w:jc w:val="center"/>
+            </w:pPr>
+            <w:r>
+              <w:rPr>
+                <w:rFonts w:ascii="Times New Roman" w:hAnsi="Times New Roman" w:eastAsia="Times New Roman" w:cs="Times New Roman"/>
+                <w:b w:val="0"/>
+                <w:color w:val="161616"/>
+                <w:sz w:val="16"/>
+              </w:rPr>
+              <w:t>Filtre fangatahana</w:t>
+            </w:r>
+          </w:p>
+        </w:tc>
+        <w:tc>
+          <w:tcPr>
+            <w:tcW w:type="dxa" w:w="2436"/>
+            <w:tcBorders>
+              <w:top w:val="nil"/>
+              <w:left w:val="nil"/>
+              <w:bottom w:val="nil"/>
+              <w:right w:val="nil"/>
+            </w:tcBorders>
+          </w:tcPr>
+          <w:p>
+            <w:pPr>
+              <w:jc w:val="center"/>
+            </w:pPr>
+            <w:r>
+              <w:drawing>
+                <wp:inline xmlns:a="http://schemas.openxmlformats.org/drawingml/2006/main" xmlns:pic="http://schemas.openxmlformats.org/drawingml/2006/picture">
+                  <wp:extent cx="1395000" cy="3100000"/>
+                  <wp:docPr id="4" name="Picture 4"/>
+                  <wp:cNvGraphicFramePr>
+                    <a:graphicFrameLocks noChangeAspect="1"/>
+                  </wp:cNvGraphicFramePr>
+                  <a:graphic>
+                    <a:graphicData uri="http://schemas.openxmlformats.org/drawingml/2006/picture">
+                      <pic:pic>
+                        <pic:nvPicPr>
+                          <pic:cNvPr id="0" name="mon-profil.jpg"/>
+                          <pic:cNvPicPr/>
+                        </pic:nvPicPr>
+                        <pic:blipFill>
+                          <a:blip r:embed="rId15"/>
+                          <a:stretch>
+                            <a:fillRect/>
+                          </a:stretch>
+                        </pic:blipFill>
+                        <pic:spPr>
+                          <a:xfrm>
+                            <a:off x="0" y="0"/>
+                            <a:ext cx="1395000" cy="3100000"/>
+                          </a:xfrm>
+                          <a:prstGeom prst="rect"/>
+                        </pic:spPr>
+                      </pic:pic>
+                    </a:graphicData>
+                  </a:graphic>
+                </wp:inline>
+              </w:drawing>
+            </w:r>
+          </w:p>
+          <w:p>
+            <w:pPr>
+              <w:jc w:val="center"/>
+            </w:pPr>
+            <w:r>
+              <w:rPr>
+                <w:rFonts w:ascii="Times New Roman" w:hAnsi="Times New Roman" w:eastAsia="Times New Roman" w:cs="Times New Roman"/>
+                <w:b w:val="0"/>
+                <w:color w:val="161616"/>
+                <w:sz w:val="16"/>
+              </w:rPr>
+              <w:t>Mon profil</w:t>
+            </w:r>
+          </w:p>
+        </w:tc>
+      </w:tr>
+    </w:tbl>
     <w:p>
+      <w:pPr/>
+    </w:p>
+    <w:p>
+      <w:pPr/>
+      <w:r>
+        <w:rPr>
+          <w:rFonts w:ascii="Times New Roman" w:hAnsi="Times New Roman" w:eastAsia="Times New Roman" w:cs="Times New Roman"/>
+          <w:b w:val="0"/>
+          <w:sz w:val="22"/>
+        </w:rPr>
+        <w:t>Écrans transverses hors parcours de dépôt.</w:t>
+      </w:r>
+    </w:p>
+    <w:p>
       <w:pPr>
         <w:pStyle w:val="Titre1"/>
       </w:pPr>
       <w:r>
-        <w:t>17. Liens code source et APK</w:t>
+        <w:rPr>
+          <w:rFonts w:ascii="Times New Roman" w:hAnsi="Times New Roman" w:eastAsia="Times New Roman" w:cs="Times New Roman"/>
+          <w:b/>
+          <w:sz w:val="22"/>
+        </w:rPr>
+        <w:t>17. Captures d’écran</w:t>
+      </w:r>
+    </w:p>
+    <w:p>
+      <w:pPr/>
+      <w:r>
+        <w:rPr>
+          <w:rFonts w:ascii="Times New Roman" w:hAnsi="Times New Roman" w:eastAsia="Times New Roman" w:cs="Times New Roman"/>
+          <w:b w:val="0"/>
+          <w:sz w:val="22"/>
+        </w:rPr>
+        <w:t>Cette section regroupe les captures d’écran de l’application citoyenne Iray (dossier img/). Elles illustrent les parcours décrits en section 4.</w:t>
+      </w:r>
+    </w:p>
+    <w:p>
+      <w:pPr/>
+      <w:r>
+        <w:rPr>
+          <w:rFonts w:ascii="Times New Roman" w:hAnsi="Times New Roman" w:eastAsia="Times New Roman" w:cs="Times New Roman"/>
+          <w:b w:val="0"/>
+          <w:sz w:val="22"/>
+        </w:rPr>
+        <w:t>Lecture : dans chaque rubrique, les captures d’une même phase sont assemblées sur une seule ligne (de gauche à droite = ordre des étapes). Une nouvelle ligne = autre phase du même parcours, ou autre état.</w:t>
+      </w:r>
+    </w:p>
+    <w:p>
+      <w:pPr>
+        <w:pStyle w:val="Titre2"/>
+      </w:pPr>
+      <w:r>
+        <w:rPr>
+          <w:rFonts w:ascii="Times New Roman" w:hAnsi="Times New Roman" w:eastAsia="Times New Roman" w:cs="Times New Roman"/>
+          <w:b/>
+          <w:sz w:val="22"/>
+        </w:rPr>
+        <w:t>17.1. Lancement et accueil</w:t>
+      </w:r>
+    </w:p>
+    <w:p>
+      <w:pPr/>
+      <w:r>
+        <w:rPr>
+          <w:rFonts w:ascii="Times New Roman" w:hAnsi="Times New Roman" w:eastAsia="Times New Roman" w:cs="Times New Roman"/>
+          <w:b w:val="0"/>
+          <w:sz w:val="22"/>
+        </w:rPr>
+        <w:t>Ouverture de l’application jusqu’à l’écran d’accueil.</w:t>
+      </w:r>
+    </w:p>
+    <w:tbl>
+      <w:tblPr>
+        <w:tblW w:type="auto" w:w="0"/>
+        <w:tblLook w:firstColumn="1" w:firstRow="1" w:lastColumn="0" w:lastRow="0" w:noHBand="0" w:noVBand="1" w:val="04A0"/>
+      </w:tblPr>
+      <w:tblGrid>
+        <w:gridCol w:w="2436"/>
+        <w:gridCol w:w="2436"/>
+        <w:gridCol w:w="2436"/>
+        <w:gridCol w:w="2436"/>
+      </w:tblGrid>
+      <w:tr>
+        <w:tc>
+          <w:tcPr>
+            <w:tcW w:type="dxa" w:w="2436"/>
+            <w:tcBorders>
+              <w:top w:val="nil"/>
+              <w:left w:val="nil"/>
+              <w:bottom w:val="nil"/>
+              <w:right w:val="nil"/>
+            </w:tcBorders>
+          </w:tcPr>
+          <w:p>
+            <w:pPr>
+              <w:jc w:val="center"/>
+            </w:pPr>
+            <w:r>
+              <w:drawing>
+                <wp:inline xmlns:a="http://schemas.openxmlformats.org/drawingml/2006/main" xmlns:pic="http://schemas.openxmlformats.org/drawingml/2006/picture">
+                  <wp:extent cx="1395000" cy="3100000"/>
+                  <wp:docPr id="5" name="Picture 5"/>
+                  <wp:cNvGraphicFramePr>
+                    <a:graphicFrameLocks noChangeAspect="1"/>
+                  </wp:cNvGraphicFramePr>
+                  <a:graphic>
+                    <a:graphicData uri="http://schemas.openxmlformats.org/drawingml/2006/picture">
+                      <pic:pic>
+                        <pic:nvPicPr>
+                          <pic:cNvPr id="0" name="image.jpg"/>
+                          <pic:cNvPicPr/>
+                        </pic:nvPicPr>
+                        <pic:blipFill>
+                          <a:blip r:embed="rId52"/>
+                          <a:stretch>
+                            <a:fillRect/>
+                          </a:stretch>
+                        </pic:blipFill>
+                        <pic:spPr>
+                          <a:xfrm>
+                            <a:off x="0" y="0"/>
+                            <a:ext cx="1395000" cy="3100000"/>
+                          </a:xfrm>
+                          <a:prstGeom prst="rect"/>
+                        </pic:spPr>
+                      </pic:pic>
+                    </a:graphicData>
+                  </a:graphic>
+                </wp:inline>
+              </w:drawing>
+            </w:r>
+          </w:p>
+          <w:p>
+            <w:pPr>
+              <w:jc w:val="center"/>
+            </w:pPr>
+            <w:r>
+              <w:rPr>
+                <w:rFonts w:ascii="Times New Roman" w:hAnsi="Times New Roman" w:eastAsia="Times New Roman" w:cs="Times New Roman"/>
+                <w:b w:val="0"/>
+                <w:color w:val="161616"/>
+                <w:sz w:val="16"/>
+              </w:rPr>
+              <w:t>Splash</w:t>
+            </w:r>
+          </w:p>
+        </w:tc>
+        <w:tc>
+          <w:tcPr>
+            <w:tcW w:type="dxa" w:w="2436"/>
+            <w:tcBorders>
+              <w:top w:val="nil"/>
+              <w:left w:val="nil"/>
+              <w:bottom w:val="nil"/>
+              <w:right w:val="nil"/>
+            </w:tcBorders>
+          </w:tcPr>
+          <w:p>
+            <w:pPr>
+              <w:jc w:val="center"/>
+            </w:pPr>
+            <w:r>
+              <w:drawing>
+                <wp:inline xmlns:a="http://schemas.openxmlformats.org/drawingml/2006/main" xmlns:pic="http://schemas.openxmlformats.org/drawingml/2006/picture">
+                  <wp:extent cx="1395000" cy="3100000"/>
+                  <wp:docPr id="6" name="Picture 6"/>
+                  <wp:cNvGraphicFramePr>
+                    <a:graphicFrameLocks noChangeAspect="1"/>
+                  </wp:cNvGraphicFramePr>
+                  <a:graphic>
+                    <a:graphicData uri="http://schemas.openxmlformats.org/drawingml/2006/picture">
+                      <pic:pic>
+                        <pic:nvPicPr>
+                          <pic:cNvPr id="0" name="image.jpg"/>
+                          <pic:cNvPicPr/>
+                        </pic:nvPicPr>
+                        <pic:blipFill>
+                          <a:blip r:embed="rId53"/>
+                          <a:stretch>
+                            <a:fillRect/>
+                          </a:stretch>
+                        </pic:blipFill>
+                        <pic:spPr>
+                          <a:xfrm>
+                            <a:off x="0" y="0"/>
+                            <a:ext cx="1395000" cy="3100000"/>
+                          </a:xfrm>
+                          <a:prstGeom prst="rect"/>
+                        </pic:spPr>
+                      </pic:pic>
+                    </a:graphicData>
+                  </a:graphic>
+                </wp:inline>
+              </w:drawing>
+            </w:r>
+          </w:p>
+          <w:p>
+            <w:pPr>
+              <w:jc w:val="center"/>
+            </w:pPr>
+            <w:r>
+              <w:rPr>
+                <w:rFonts w:ascii="Times New Roman" w:hAnsi="Times New Roman" w:eastAsia="Times New Roman" w:cs="Times New Roman"/>
+                <w:b w:val="0"/>
+                <w:color w:val="161616"/>
+                <w:sz w:val="16"/>
+              </w:rPr>
+              <w:t>Icône Iray</w:t>
+            </w:r>
+          </w:p>
+        </w:tc>
+        <w:tc>
+          <w:tcPr>
+            <w:tcW w:type="dxa" w:w="2436"/>
+            <w:tcBorders>
+              <w:top w:val="nil"/>
+              <w:left w:val="nil"/>
+              <w:bottom w:val="nil"/>
+              <w:right w:val="nil"/>
+            </w:tcBorders>
+          </w:tcPr>
+          <w:p>
+            <w:pPr>
+              <w:jc w:val="center"/>
+            </w:pPr>
+            <w:r>
+              <w:drawing>
+                <wp:inline xmlns:a="http://schemas.openxmlformats.org/drawingml/2006/main" xmlns:pic="http://schemas.openxmlformats.org/drawingml/2006/picture">
+                  <wp:extent cx="1395000" cy="3100000"/>
+                  <wp:docPr id="7" name="Picture 7"/>
+                  <wp:cNvGraphicFramePr>
+                    <a:graphicFrameLocks noChangeAspect="1"/>
+                  </wp:cNvGraphicFramePr>
+                  <a:graphic>
+                    <a:graphicData uri="http://schemas.openxmlformats.org/drawingml/2006/picture">
+                      <pic:pic>
+                        <pic:nvPicPr>
+                          <pic:cNvPr id="0" name="image.jpg"/>
+                          <pic:cNvPicPr/>
+                        </pic:nvPicPr>
+                        <pic:blipFill>
+                          <a:blip r:embed="rId54"/>
+                          <a:stretch>
+                            <a:fillRect/>
+                          </a:stretch>
+                        </pic:blipFill>
+                        <pic:spPr>
+                          <a:xfrm>
+                            <a:off x="0" y="0"/>
+                            <a:ext cx="1395000" cy="3100000"/>
+                          </a:xfrm>
+                          <a:prstGeom prst="rect"/>
+                        </pic:spPr>
+                      </pic:pic>
+                    </a:graphicData>
+                  </a:graphic>
+                </wp:inline>
+              </w:drawing>
+            </w:r>
+          </w:p>
+          <w:p>
+            <w:pPr>
+              <w:jc w:val="center"/>
+            </w:pPr>
+            <w:r>
+              <w:rPr>
+                <w:rFonts w:ascii="Times New Roman" w:hAnsi="Times New Roman" w:eastAsia="Times New Roman" w:cs="Times New Roman"/>
+                <w:b w:val="0"/>
+                <w:color w:val="161616"/>
+                <w:sz w:val="16"/>
+              </w:rPr>
+              <w:t>Onboarding</w:t>
+            </w:r>
+          </w:p>
+        </w:tc>
+        <w:tc>
+          <w:tcPr>
+            <w:tcW w:type="dxa" w:w="2436"/>
+            <w:tcBorders>
+              <w:top w:val="nil"/>
+              <w:left w:val="nil"/>
+              <w:bottom w:val="nil"/>
+              <w:right w:val="nil"/>
+            </w:tcBorders>
+          </w:tcPr>
+          <w:p>
+            <w:pPr>
+              <w:jc w:val="center"/>
+            </w:pPr>
+            <w:r>
+              <w:drawing>
+                <wp:inline xmlns:a="http://schemas.openxmlformats.org/drawingml/2006/main" xmlns:pic="http://schemas.openxmlformats.org/drawingml/2006/picture">
+                  <wp:extent cx="1395000" cy="3100000"/>
+                  <wp:docPr id="8" name="Picture 8"/>
+                  <wp:cNvGraphicFramePr>
+                    <a:graphicFrameLocks noChangeAspect="1"/>
+                  </wp:cNvGraphicFramePr>
+                  <a:graphic>
+                    <a:graphicData uri="http://schemas.openxmlformats.org/drawingml/2006/picture">
+                      <pic:pic>
+                        <pic:nvPicPr>
+                          <pic:cNvPr id="0" name="image.jpg"/>
+                          <pic:cNvPicPr/>
+                        </pic:nvPicPr>
+                        <pic:blipFill>
+                          <a:blip r:embed="rId55"/>
+                          <a:stretch>
+                            <a:fillRect/>
+                          </a:stretch>
+                        </pic:blipFill>
+                        <pic:spPr>
+                          <a:xfrm>
+                            <a:off x="0" y="0"/>
+                            <a:ext cx="1395000" cy="3100000"/>
+                          </a:xfrm>
+                          <a:prstGeom prst="rect"/>
+                        </pic:spPr>
+                      </pic:pic>
+                    </a:graphicData>
+                  </a:graphic>
+                </wp:inline>
+              </w:drawing>
+            </w:r>
+          </w:p>
+          <w:p>
+            <w:pPr>
+              <w:jc w:val="center"/>
+            </w:pPr>
+            <w:r>
+              <w:rPr>
+                <w:rFonts w:ascii="Times New Roman" w:hAnsi="Times New Roman" w:eastAsia="Times New Roman" w:cs="Times New Roman"/>
+                <w:b w:val="0"/>
+                <w:color w:val="161616"/>
+                <w:sz w:val="16"/>
+              </w:rPr>
+              <w:t>Welcome</w:t>
+            </w:r>
+          </w:p>
+        </w:tc>
+      </w:tr>
+    </w:tbl>
+    <w:p/>
+    <w:p>
+      <w:pPr>
+        <w:pStyle w:val="Titre2"/>
+      </w:pPr>
+      <w:r>
+        <w:rPr>
+          <w:rFonts w:ascii="Times New Roman" w:hAnsi="Times New Roman" w:eastAsia="Times New Roman" w:cs="Times New Roman"/>
+          <w:b/>
+          <w:sz w:val="22"/>
+        </w:rPr>
+        <w:t>17.2. Création du profil (identité)</w:t>
+      </w:r>
+    </w:p>
+    <w:p>
+      <w:pPr/>
+      <w:r>
+        <w:rPr>
+          <w:rFonts w:ascii="Times New Roman" w:hAnsi="Times New Roman" w:eastAsia="Times New Roman" w:cs="Times New Roman"/>
+          <w:b w:val="0"/>
+          <w:sz w:val="22"/>
+        </w:rPr>
+        <w:t>Saisie des informations personnelles. Les trois étapes sont sur la même ligne.</w:t>
+      </w:r>
+    </w:p>
+    <w:tbl>
+      <w:tblPr>
+        <w:tblW w:type="auto" w:w="0"/>
+        <w:tblLook w:firstColumn="1" w:firstRow="1" w:lastColumn="0" w:lastRow="0" w:noHBand="0" w:noVBand="1" w:val="04A0"/>
+      </w:tblPr>
+      <w:tblGrid>
+        <w:gridCol w:w="3249"/>
+        <w:gridCol w:w="3249"/>
+        <w:gridCol w:w="3249"/>
+      </w:tblGrid>
+      <w:tr>
+        <w:tc>
+          <w:tcPr>
+            <w:tcW w:type="dxa" w:w="3249"/>
+            <w:tcBorders>
+              <w:top w:val="nil"/>
+              <w:left w:val="nil"/>
+              <w:bottom w:val="nil"/>
+              <w:right w:val="nil"/>
+            </w:tcBorders>
+          </w:tcPr>
+          <w:p>
+            <w:pPr>
+              <w:jc w:val="center"/>
+            </w:pPr>
+            <w:r>
+              <w:drawing>
+                <wp:inline xmlns:a="http://schemas.openxmlformats.org/drawingml/2006/main" xmlns:pic="http://schemas.openxmlformats.org/drawingml/2006/picture">
+                  <wp:extent cx="1440000" cy="3200000"/>
+                  <wp:docPr id="9" name="Picture 9"/>
+                  <wp:cNvGraphicFramePr>
+                    <a:graphicFrameLocks noChangeAspect="1"/>
+                  </wp:cNvGraphicFramePr>
+                  <a:graphic>
+                    <a:graphicData uri="http://schemas.openxmlformats.org/drawingml/2006/picture">
+                      <pic:pic>
+                        <pic:nvPicPr>
+                          <pic:cNvPr id="0" name="image.jpg"/>
+                          <pic:cNvPicPr/>
+                        </pic:nvPicPr>
+                        <pic:blipFill>
+                          <a:blip r:embed="rId49"/>
+                          <a:stretch>
+                            <a:fillRect/>
+                          </a:stretch>
+                        </pic:blipFill>
+                        <pic:spPr>
+                          <a:xfrm>
+                            <a:off x="0" y="0"/>
+                            <a:ext cx="1440000" cy="3200000"/>
+                          </a:xfrm>
+                          <a:prstGeom prst="rect"/>
+                        </pic:spPr>
+                      </pic:pic>
+                    </a:graphicData>
+                  </a:graphic>
+                </wp:inline>
+              </w:drawing>
+            </w:r>
+          </w:p>
+          <w:p>
+            <w:pPr>
+              <w:jc w:val="center"/>
+            </w:pPr>
+            <w:r>
+              <w:rPr>
+                <w:rFonts w:ascii="Times New Roman" w:hAnsi="Times New Roman" w:eastAsia="Times New Roman" w:cs="Times New Roman"/>
+                <w:b w:val="0"/>
+                <w:color w:val="161616"/>
+                <w:sz w:val="16"/>
+              </w:rPr>
+              <w:t>1. Formulaire vide</w:t>
+            </w:r>
+          </w:p>
+        </w:tc>
+        <w:tc>
+          <w:tcPr>
+            <w:tcW w:type="dxa" w:w="3249"/>
+            <w:tcBorders>
+              <w:top w:val="nil"/>
+              <w:left w:val="nil"/>
+              <w:bottom w:val="nil"/>
+              <w:right w:val="nil"/>
+            </w:tcBorders>
+          </w:tcPr>
+          <w:p>
+            <w:pPr>
+              <w:jc w:val="center"/>
+            </w:pPr>
+            <w:r>
+              <w:drawing>
+                <wp:inline xmlns:a="http://schemas.openxmlformats.org/drawingml/2006/main" xmlns:pic="http://schemas.openxmlformats.org/drawingml/2006/picture">
+                  <wp:extent cx="1440000" cy="3200000"/>
+                  <wp:docPr id="10" name="Picture 10"/>
+                  <wp:cNvGraphicFramePr>
+                    <a:graphicFrameLocks noChangeAspect="1"/>
+                  </wp:cNvGraphicFramePr>
+                  <a:graphic>
+                    <a:graphicData uri="http://schemas.openxmlformats.org/drawingml/2006/picture">
+                      <pic:pic>
+                        <pic:nvPicPr>
+                          <pic:cNvPr id="0" name="image.jpg"/>
+                          <pic:cNvPicPr/>
+                        </pic:nvPicPr>
+                        <pic:blipFill>
+                          <a:blip r:embed="rId50"/>
+                          <a:stretch>
+                            <a:fillRect/>
+                          </a:stretch>
+                        </pic:blipFill>
+                        <pic:spPr>
+                          <a:xfrm>
+                            <a:off x="0" y="0"/>
+                            <a:ext cx="1440000" cy="3200000"/>
+                          </a:xfrm>
+                          <a:prstGeom prst="rect"/>
+                        </pic:spPr>
+                      </pic:pic>
+                    </a:graphicData>
+                  </a:graphic>
+                </wp:inline>
+              </w:drawing>
+            </w:r>
+          </w:p>
+          <w:p>
+            <w:pPr>
+              <w:jc w:val="center"/>
+            </w:pPr>
+            <w:r>
+              <w:rPr>
+                <w:rFonts w:ascii="Times New Roman" w:hAnsi="Times New Roman" w:eastAsia="Times New Roman" w:cs="Times New Roman"/>
+                <w:b w:val="0"/>
+                <w:color w:val="161616"/>
+                <w:sz w:val="16"/>
+              </w:rPr>
+              <w:t>2. Date de naissance</w:t>
+            </w:r>
+          </w:p>
+        </w:tc>
+        <w:tc>
+          <w:tcPr>
+            <w:tcW w:type="dxa" w:w="3249"/>
+            <w:tcBorders>
+              <w:top w:val="nil"/>
+              <w:left w:val="nil"/>
+              <w:bottom w:val="nil"/>
+              <w:right w:val="nil"/>
+            </w:tcBorders>
+          </w:tcPr>
+          <w:p>
+            <w:pPr>
+              <w:jc w:val="center"/>
+            </w:pPr>
+            <w:r>
+              <w:drawing>
+                <wp:inline xmlns:a="http://schemas.openxmlformats.org/drawingml/2006/main" xmlns:pic="http://schemas.openxmlformats.org/drawingml/2006/picture">
+                  <wp:extent cx="1440000" cy="3200000"/>
+                  <wp:docPr id="11" name="Picture 11"/>
+                  <wp:cNvGraphicFramePr>
+                    <a:graphicFrameLocks noChangeAspect="1"/>
+                  </wp:cNvGraphicFramePr>
+                  <a:graphic>
+                    <a:graphicData uri="http://schemas.openxmlformats.org/drawingml/2006/picture">
+                      <pic:pic>
+                        <pic:nvPicPr>
+                          <pic:cNvPr id="0" name="image.jpg"/>
+                          <pic:cNvPicPr/>
+                        </pic:nvPicPr>
+                        <pic:blipFill>
+                          <a:blip r:embed="rId51"/>
+                          <a:stretch>
+                            <a:fillRect/>
+                          </a:stretch>
+                        </pic:blipFill>
+                        <pic:spPr>
+                          <a:xfrm>
+                            <a:off x="0" y="0"/>
+                            <a:ext cx="1440000" cy="3200000"/>
+                          </a:xfrm>
+                          <a:prstGeom prst="rect"/>
+                        </pic:spPr>
+                      </pic:pic>
+                    </a:graphicData>
+                  </a:graphic>
+                </wp:inline>
+              </w:drawing>
+            </w:r>
+          </w:p>
+          <w:p>
+            <w:pPr>
+              <w:jc w:val="center"/>
+            </w:pPr>
+            <w:r>
+              <w:rPr>
+                <w:rFonts w:ascii="Times New Roman" w:hAnsi="Times New Roman" w:eastAsia="Times New Roman" w:cs="Times New Roman"/>
+                <w:b w:val="0"/>
+                <w:color w:val="161616"/>
+                <w:sz w:val="16"/>
+              </w:rPr>
+              <w:t>3. Formulaire rempli</w:t>
+            </w:r>
+          </w:p>
+        </w:tc>
+      </w:tr>
+    </w:tbl>
+    <w:p/>
+    <w:p>
+      <w:pPr>
+        <w:pStyle w:val="Titre2"/>
+      </w:pPr>
+      <w:r>
+        <w:rPr>
+          <w:rFonts w:ascii="Times New Roman" w:hAnsi="Times New Roman" w:eastAsia="Times New Roman" w:cs="Times New Roman"/>
+          <w:b/>
+          <w:sz w:val="22"/>
+        </w:rPr>
+        <w:t>17.3. Faritrao (choix de la zone)</w:t>
+      </w:r>
+    </w:p>
+    <w:p>
+      <w:pPr/>
+      <w:r>
+        <w:rPr>
+          <w:rFonts w:ascii="Times New Roman" w:hAnsi="Times New Roman" w:eastAsia="Times New Roman" w:cs="Times New Roman"/>
+          <w:b w:val="0"/>
+          <w:sz w:val="22"/>
+        </w:rPr>
+        <w:t>Cascade territoriale : chaque capture = une étape. Lire de gauche à droite.</w:t>
+      </w:r>
+    </w:p>
+    <w:tbl>
+      <w:tblPr>
+        <w:tblW w:type="auto" w:w="0"/>
+        <w:tblLook w:firstColumn="1" w:firstRow="1" w:lastColumn="0" w:lastRow="0" w:noHBand="0" w:noVBand="1" w:val="04A0"/>
+      </w:tblPr>
+      <w:tblGrid>
+        <w:gridCol w:w="2436"/>
+        <w:gridCol w:w="2436"/>
+        <w:gridCol w:w="2436"/>
+        <w:gridCol w:w="2436"/>
+      </w:tblGrid>
+      <w:tr>
+        <w:tc>
+          <w:tcPr>
+            <w:tcW w:type="dxa" w:w="2436"/>
+            <w:tcBorders>
+              <w:top w:val="nil"/>
+              <w:left w:val="nil"/>
+              <w:bottom w:val="nil"/>
+              <w:right w:val="nil"/>
+            </w:tcBorders>
+          </w:tcPr>
+          <w:p>
+            <w:pPr>
+              <w:jc w:val="center"/>
+            </w:pPr>
+            <w:r>
+              <w:drawing>
+                <wp:inline xmlns:a="http://schemas.openxmlformats.org/drawingml/2006/main" xmlns:pic="http://schemas.openxmlformats.org/drawingml/2006/picture">
+                  <wp:extent cx="1395000" cy="3100000"/>
+                  <wp:docPr id="12" name="Picture 12"/>
+                  <wp:cNvGraphicFramePr>
+                    <a:graphicFrameLocks noChangeAspect="1"/>
+                  </wp:cNvGraphicFramePr>
+                  <a:graphic>
+                    <a:graphicData uri="http://schemas.openxmlformats.org/drawingml/2006/picture">
+                      <pic:pic>
+                        <pic:nvPicPr>
+                          <pic:cNvPr id="0" name="image.jpg"/>
+                          <pic:cNvPicPr/>
+                        </pic:nvPicPr>
+                        <pic:blipFill>
+                          <a:blip r:embed="rId45"/>
+                          <a:stretch>
+                            <a:fillRect/>
+                          </a:stretch>
+                        </pic:blipFill>
+                        <pic:spPr>
+                          <a:xfrm>
+                            <a:off x="0" y="0"/>
+                            <a:ext cx="1395000" cy="3100000"/>
+                          </a:xfrm>
+                          <a:prstGeom prst="rect"/>
+                        </pic:spPr>
+                      </pic:pic>
+                    </a:graphicData>
+                  </a:graphic>
+                </wp:inline>
+              </w:drawing>
+            </w:r>
+          </w:p>
+          <w:p>
+            <w:pPr>
+              <w:jc w:val="center"/>
+            </w:pPr>
+            <w:r>
+              <w:rPr>
+                <w:rFonts w:ascii="Times New Roman" w:hAnsi="Times New Roman" w:eastAsia="Times New Roman" w:cs="Times New Roman"/>
+                <w:b w:val="0"/>
+                <w:color w:val="161616"/>
+                <w:sz w:val="16"/>
+              </w:rPr>
+              <w:t>1. Départ</w:t>
+            </w:r>
+          </w:p>
+        </w:tc>
+        <w:tc>
+          <w:tcPr>
+            <w:tcW w:type="dxa" w:w="2436"/>
+            <w:tcBorders>
+              <w:top w:val="nil"/>
+              <w:left w:val="nil"/>
+              <w:bottom w:val="nil"/>
+              <w:right w:val="nil"/>
+            </w:tcBorders>
+          </w:tcPr>
+          <w:p>
+            <w:pPr>
+              <w:jc w:val="center"/>
+            </w:pPr>
+            <w:r>
+              <w:drawing>
+                <wp:inline xmlns:a="http://schemas.openxmlformats.org/drawingml/2006/main" xmlns:pic="http://schemas.openxmlformats.org/drawingml/2006/picture">
+                  <wp:extent cx="1395000" cy="3100000"/>
+                  <wp:docPr id="13" name="Picture 13"/>
+                  <wp:cNvGraphicFramePr>
+                    <a:graphicFrameLocks noChangeAspect="1"/>
+                  </wp:cNvGraphicFramePr>
+                  <a:graphic>
+                    <a:graphicData uri="http://schemas.openxmlformats.org/drawingml/2006/picture">
+                      <pic:pic>
+                        <pic:nvPicPr>
+                          <pic:cNvPr id="0" name="image.jpg"/>
+                          <pic:cNvPicPr/>
+                        </pic:nvPicPr>
+                        <pic:blipFill>
+                          <a:blip r:embed="rId46"/>
+                          <a:stretch>
+                            <a:fillRect/>
+                          </a:stretch>
+                        </pic:blipFill>
+                        <pic:spPr>
+                          <a:xfrm>
+                            <a:off x="0" y="0"/>
+                            <a:ext cx="1395000" cy="3100000"/>
+                          </a:xfrm>
+                          <a:prstGeom prst="rect"/>
+                        </pic:spPr>
+                      </pic:pic>
+                    </a:graphicData>
+                  </a:graphic>
+                </wp:inline>
+              </w:drawing>
+            </w:r>
+          </w:p>
+          <w:p>
+            <w:pPr>
+              <w:jc w:val="center"/>
+            </w:pPr>
+            <w:r>
+              <w:rPr>
+                <w:rFonts w:ascii="Times New Roman" w:hAnsi="Times New Roman" w:eastAsia="Times New Roman" w:cs="Times New Roman"/>
+                <w:b w:val="0"/>
+                <w:color w:val="161616"/>
+                <w:sz w:val="16"/>
+              </w:rPr>
+              <w:t>2. Région</w:t>
+            </w:r>
+          </w:p>
+        </w:tc>
+        <w:tc>
+          <w:tcPr>
+            <w:tcW w:type="dxa" w:w="2436"/>
+            <w:tcBorders>
+              <w:top w:val="nil"/>
+              <w:left w:val="nil"/>
+              <w:bottom w:val="nil"/>
+              <w:right w:val="nil"/>
+            </w:tcBorders>
+          </w:tcPr>
+          <w:p>
+            <w:pPr>
+              <w:jc w:val="center"/>
+            </w:pPr>
+            <w:r>
+              <w:drawing>
+                <wp:inline xmlns:a="http://schemas.openxmlformats.org/drawingml/2006/main" xmlns:pic="http://schemas.openxmlformats.org/drawingml/2006/picture">
+                  <wp:extent cx="1395000" cy="3100000"/>
+                  <wp:docPr id="14" name="Picture 14"/>
+                  <wp:cNvGraphicFramePr>
+                    <a:graphicFrameLocks noChangeAspect="1"/>
+                  </wp:cNvGraphicFramePr>
+                  <a:graphic>
+                    <a:graphicData uri="http://schemas.openxmlformats.org/drawingml/2006/picture">
+                      <pic:pic>
+                        <pic:nvPicPr>
+                          <pic:cNvPr id="0" name="image.jpg"/>
+                          <pic:cNvPicPr/>
+                        </pic:nvPicPr>
+                        <pic:blipFill>
+                          <a:blip r:embed="rId47"/>
+                          <a:stretch>
+                            <a:fillRect/>
+                          </a:stretch>
+                        </pic:blipFill>
+                        <pic:spPr>
+                          <a:xfrm>
+                            <a:off x="0" y="0"/>
+                            <a:ext cx="1395000" cy="3100000"/>
+                          </a:xfrm>
+                          <a:prstGeom prst="rect"/>
+                        </pic:spPr>
+                      </pic:pic>
+                    </a:graphicData>
+                  </a:graphic>
+                </wp:inline>
+              </w:drawing>
+            </w:r>
+          </w:p>
+          <w:p>
+            <w:pPr>
+              <w:jc w:val="center"/>
+            </w:pPr>
+            <w:r>
+              <w:rPr>
+                <w:rFonts w:ascii="Times New Roman" w:hAnsi="Times New Roman" w:eastAsia="Times New Roman" w:cs="Times New Roman"/>
+                <w:b w:val="0"/>
+                <w:color w:val="161616"/>
+                <w:sz w:val="16"/>
+              </w:rPr>
+              <w:t>3. District</w:t>
+            </w:r>
+          </w:p>
+        </w:tc>
+        <w:tc>
+          <w:tcPr>
+            <w:tcW w:type="dxa" w:w="2436"/>
+            <w:tcBorders>
+              <w:top w:val="nil"/>
+              <w:left w:val="nil"/>
+              <w:bottom w:val="nil"/>
+              <w:right w:val="nil"/>
+            </w:tcBorders>
+          </w:tcPr>
+          <w:p>
+            <w:pPr>
+              <w:jc w:val="center"/>
+            </w:pPr>
+            <w:r>
+              <w:drawing>
+                <wp:inline xmlns:a="http://schemas.openxmlformats.org/drawingml/2006/main" xmlns:pic="http://schemas.openxmlformats.org/drawingml/2006/picture">
+                  <wp:extent cx="1395000" cy="3100000"/>
+                  <wp:docPr id="15" name="Picture 15"/>
+                  <wp:cNvGraphicFramePr>
+                    <a:graphicFrameLocks noChangeAspect="1"/>
+                  </wp:cNvGraphicFramePr>
+                  <a:graphic>
+                    <a:graphicData uri="http://schemas.openxmlformats.org/drawingml/2006/picture">
+                      <pic:pic>
+                        <pic:nvPicPr>
+                          <pic:cNvPr id="0" name="image.jpg"/>
+                          <pic:cNvPicPr/>
+                        </pic:nvPicPr>
+                        <pic:blipFill>
+                          <a:blip r:embed="rId48"/>
+                          <a:stretch>
+                            <a:fillRect/>
+                          </a:stretch>
+                        </pic:blipFill>
+                        <pic:spPr>
+                          <a:xfrm>
+                            <a:off x="0" y="0"/>
+                            <a:ext cx="1395000" cy="3100000"/>
+                          </a:xfrm>
+                          <a:prstGeom prst="rect"/>
+                        </pic:spPr>
+                      </pic:pic>
+                    </a:graphicData>
+                  </a:graphic>
+                </wp:inline>
+              </w:drawing>
+            </w:r>
+          </w:p>
+          <w:p>
+            <w:pPr>
+              <w:jc w:val="center"/>
+            </w:pPr>
+            <w:r>
+              <w:rPr>
+                <w:rFonts w:ascii="Times New Roman" w:hAnsi="Times New Roman" w:eastAsia="Times New Roman" w:cs="Times New Roman"/>
+                <w:b w:val="0"/>
+                <w:color w:val="161616"/>
+                <w:sz w:val="16"/>
+              </w:rPr>
+              <w:t>4. Commune</w:t>
+            </w:r>
+          </w:p>
+        </w:tc>
+      </w:tr>
+    </w:tbl>
+    <w:p/>
+    <w:tbl>
+      <w:tblPr>
+        <w:tblW w:type="auto" w:w="0"/>
+        <w:tblLook w:firstColumn="1" w:firstRow="1" w:lastColumn="0" w:lastRow="0" w:noHBand="0" w:noVBand="1" w:val="04A0"/>
+      </w:tblPr>
+      <w:tblGrid>
+        <w:gridCol w:w="3249"/>
+        <w:gridCol w:w="3249"/>
+        <w:gridCol w:w="3249"/>
+      </w:tblGrid>
+      <w:tr>
+        <w:tc>
+          <w:tcPr>
+            <w:tcW w:type="dxa" w:w="3249"/>
+            <w:tcBorders>
+              <w:top w:val="nil"/>
+              <w:left w:val="nil"/>
+              <w:bottom w:val="nil"/>
+              <w:right w:val="nil"/>
+            </w:tcBorders>
+          </w:tcPr>
+          <w:p>
+            <w:pPr>
+              <w:jc w:val="center"/>
+            </w:pPr>
+            <w:r>
+              <w:drawing>
+                <wp:inline xmlns:a="http://schemas.openxmlformats.org/drawingml/2006/main" xmlns:pic="http://schemas.openxmlformats.org/drawingml/2006/picture">
+                  <wp:extent cx="1440000" cy="3200000"/>
+                  <wp:docPr id="16" name="Picture 16"/>
+                  <wp:cNvGraphicFramePr>
+                    <a:graphicFrameLocks noChangeAspect="1"/>
+                  </wp:cNvGraphicFramePr>
+                  <a:graphic>
+                    <a:graphicData uri="http://schemas.openxmlformats.org/drawingml/2006/picture">
+                      <pic:pic>
+                        <pic:nvPicPr>
+                          <pic:cNvPr id="0" name="image.jpg"/>
+                          <pic:cNvPicPr/>
+                        </pic:nvPicPr>
+                        <pic:blipFill>
+                          <a:blip r:embed="rId42"/>
+                          <a:stretch>
+                            <a:fillRect/>
+                          </a:stretch>
+                        </pic:blipFill>
+                        <pic:spPr>
+                          <a:xfrm>
+                            <a:off x="0" y="0"/>
+                            <a:ext cx="1440000" cy="3200000"/>
+                          </a:xfrm>
+                          <a:prstGeom prst="rect"/>
+                        </pic:spPr>
+                      </pic:pic>
+                    </a:graphicData>
+                  </a:graphic>
+                </wp:inline>
+              </w:drawing>
+            </w:r>
+          </w:p>
+          <w:p>
+            <w:pPr>
+              <w:jc w:val="center"/>
+            </w:pPr>
+            <w:r>
+              <w:rPr>
+                <w:rFonts w:ascii="Times New Roman" w:hAnsi="Times New Roman" w:eastAsia="Times New Roman" w:cs="Times New Roman"/>
+                <w:b w:val="0"/>
+                <w:color w:val="161616"/>
+                <w:sz w:val="16"/>
+              </w:rPr>
+              <w:t>5. Arrondissement</w:t>
+            </w:r>
+          </w:p>
+        </w:tc>
+        <w:tc>
+          <w:tcPr>
+            <w:tcW w:type="dxa" w:w="3249"/>
+            <w:tcBorders>
+              <w:top w:val="nil"/>
+              <w:left w:val="nil"/>
+              <w:bottom w:val="nil"/>
+              <w:right w:val="nil"/>
+            </w:tcBorders>
+          </w:tcPr>
+          <w:p>
+            <w:pPr>
+              <w:jc w:val="center"/>
+            </w:pPr>
+            <w:r>
+              <w:drawing>
+                <wp:inline xmlns:a="http://schemas.openxmlformats.org/drawingml/2006/main" xmlns:pic="http://schemas.openxmlformats.org/drawingml/2006/picture">
+                  <wp:extent cx="1440000" cy="3200000"/>
+                  <wp:docPr id="17" name="Picture 17"/>
+                  <wp:cNvGraphicFramePr>
+                    <a:graphicFrameLocks noChangeAspect="1"/>
+                  </wp:cNvGraphicFramePr>
+                  <a:graphic>
+                    <a:graphicData uri="http://schemas.openxmlformats.org/drawingml/2006/picture">
+                      <pic:pic>
+                        <pic:nvPicPr>
+                          <pic:cNvPr id="0" name="image.jpg"/>
+                          <pic:cNvPicPr/>
+                        </pic:nvPicPr>
+                        <pic:blipFill>
+                          <a:blip r:embed="rId43"/>
+                          <a:stretch>
+                            <a:fillRect/>
+                          </a:stretch>
+                        </pic:blipFill>
+                        <pic:spPr>
+                          <a:xfrm>
+                            <a:off x="0" y="0"/>
+                            <a:ext cx="1440000" cy="3200000"/>
+                          </a:xfrm>
+                          <a:prstGeom prst="rect"/>
+                        </pic:spPr>
+                      </pic:pic>
+                    </a:graphicData>
+                  </a:graphic>
+                </wp:inline>
+              </w:drawing>
+            </w:r>
+          </w:p>
+          <w:p>
+            <w:pPr>
+              <w:jc w:val="center"/>
+            </w:pPr>
+            <w:r>
+              <w:rPr>
+                <w:rFonts w:ascii="Times New Roman" w:hAnsi="Times New Roman" w:eastAsia="Times New Roman" w:cs="Times New Roman"/>
+                <w:b w:val="0"/>
+                <w:color w:val="161616"/>
+                <w:sz w:val="16"/>
+              </w:rPr>
+              <w:t>6. Fokontany</w:t>
+            </w:r>
+          </w:p>
+        </w:tc>
+        <w:tc>
+          <w:tcPr>
+            <w:tcW w:type="dxa" w:w="3249"/>
+            <w:tcBorders>
+              <w:top w:val="nil"/>
+              <w:left w:val="nil"/>
+              <w:bottom w:val="nil"/>
+              <w:right w:val="nil"/>
+            </w:tcBorders>
+          </w:tcPr>
+          <w:p>
+            <w:pPr>
+              <w:jc w:val="center"/>
+            </w:pPr>
+            <w:r>
+              <w:drawing>
+                <wp:inline xmlns:a="http://schemas.openxmlformats.org/drawingml/2006/main" xmlns:pic="http://schemas.openxmlformats.org/drawingml/2006/picture">
+                  <wp:extent cx="1440000" cy="3200000"/>
+                  <wp:docPr id="18" name="Picture 18"/>
+                  <wp:cNvGraphicFramePr>
+                    <a:graphicFrameLocks noChangeAspect="1"/>
+                  </wp:cNvGraphicFramePr>
+                  <a:graphic>
+                    <a:graphicData uri="http://schemas.openxmlformats.org/drawingml/2006/picture">
+                      <pic:pic>
+                        <pic:nvPicPr>
+                          <pic:cNvPr id="0" name="image.jpg"/>
+                          <pic:cNvPicPr/>
+                        </pic:nvPicPr>
+                        <pic:blipFill>
+                          <a:blip r:embed="rId44"/>
+                          <a:stretch>
+                            <a:fillRect/>
+                          </a:stretch>
+                        </pic:blipFill>
+                        <pic:spPr>
+                          <a:xfrm>
+                            <a:off x="0" y="0"/>
+                            <a:ext cx="1440000" cy="3200000"/>
+                          </a:xfrm>
+                          <a:prstGeom prst="rect"/>
+                        </pic:spPr>
+                      </pic:pic>
+                    </a:graphicData>
+                  </a:graphic>
+                </wp:inline>
+              </w:drawing>
+            </w:r>
+          </w:p>
+          <w:p>
+            <w:pPr>
+              <w:jc w:val="center"/>
+            </w:pPr>
+            <w:r>
+              <w:rPr>
+                <w:rFonts w:ascii="Times New Roman" w:hAnsi="Times New Roman" w:eastAsia="Times New Roman" w:cs="Times New Roman"/>
+                <w:b w:val="0"/>
+                <w:color w:val="161616"/>
+                <w:sz w:val="16"/>
+              </w:rPr>
+              <w:t>7. Succès profil</w:t>
+            </w:r>
+          </w:p>
+        </w:tc>
+      </w:tr>
+    </w:tbl>
+    <w:p/>
+    <w:p>
+      <w:pPr>
+        <w:pStyle w:val="Titre2"/>
+      </w:pPr>
+      <w:r>
+        <w:rPr>
+          <w:rFonts w:ascii="Times New Roman" w:hAnsi="Times New Roman" w:eastAsia="Times New Roman" w:cs="Times New Roman"/>
+          <w:b/>
+          <w:sz w:val="22"/>
+        </w:rPr>
+        <w:t>17.4. Fangatahana — catalogue et filtres</w:t>
+      </w:r>
+    </w:p>
+    <w:p>
+      <w:pPr/>
+      <w:r>
+        <w:rPr>
+          <w:rFonts w:ascii="Times New Roman" w:hAnsi="Times New Roman" w:eastAsia="Times New Roman" w:cs="Times New Roman"/>
+          <w:b w:val="0"/>
+          <w:sz w:val="22"/>
+        </w:rPr>
+        <w:t>Liste des démarches et filtres disponibles.</w:t>
+      </w:r>
+    </w:p>
+    <w:tbl>
+      <w:tblPr>
+        <w:tblW w:type="auto" w:w="0"/>
+        <w:tblLook w:firstColumn="1" w:firstRow="1" w:lastColumn="0" w:lastRow="0" w:noHBand="0" w:noVBand="1" w:val="04A0"/>
+      </w:tblPr>
+      <w:tblGrid>
+        <w:gridCol w:w="2436"/>
+        <w:gridCol w:w="2436"/>
+        <w:gridCol w:w="2436"/>
+        <w:gridCol w:w="2436"/>
+      </w:tblGrid>
+      <w:tr>
+        <w:tc>
+          <w:tcPr>
+            <w:tcW w:type="dxa" w:w="2436"/>
+            <w:tcBorders>
+              <w:top w:val="nil"/>
+              <w:left w:val="nil"/>
+              <w:bottom w:val="nil"/>
+              <w:right w:val="nil"/>
+            </w:tcBorders>
+          </w:tcPr>
+          <w:p>
+            <w:pPr>
+              <w:jc w:val="center"/>
+            </w:pPr>
+            <w:r>
+              <w:drawing>
+                <wp:inline xmlns:a="http://schemas.openxmlformats.org/drawingml/2006/main" xmlns:pic="http://schemas.openxmlformats.org/drawingml/2006/picture">
+                  <wp:extent cx="1395000" cy="3100000"/>
+                  <wp:docPr id="19" name="Picture 19"/>
+                  <wp:cNvGraphicFramePr>
+                    <a:graphicFrameLocks noChangeAspect="1"/>
+                  </wp:cNvGraphicFramePr>
+                  <a:graphic>
+                    <a:graphicData uri="http://schemas.openxmlformats.org/drawingml/2006/picture">
+                      <pic:pic>
+                        <pic:nvPicPr>
+                          <pic:cNvPr id="0" name="image.jpg"/>
+                          <pic:cNvPicPr/>
+                        </pic:nvPicPr>
+                        <pic:blipFill>
+                          <a:blip r:embed="rId38"/>
+                          <a:stretch>
+                            <a:fillRect/>
+                          </a:stretch>
+                        </pic:blipFill>
+                        <pic:spPr>
+                          <a:xfrm>
+                            <a:off x="0" y="0"/>
+                            <a:ext cx="1395000" cy="3100000"/>
+                          </a:xfrm>
+                          <a:prstGeom prst="rect"/>
+                        </pic:spPr>
+                      </pic:pic>
+                    </a:graphicData>
+                  </a:graphic>
+                </wp:inline>
+              </w:drawing>
+            </w:r>
+          </w:p>
+          <w:p>
+            <w:pPr>
+              <w:jc w:val="center"/>
+            </w:pPr>
+            <w:r>
+              <w:rPr>
+                <w:rFonts w:ascii="Times New Roman" w:hAnsi="Times New Roman" w:eastAsia="Times New Roman" w:cs="Times New Roman"/>
+                <w:b w:val="0"/>
+                <w:color w:val="161616"/>
+                <w:sz w:val="16"/>
+              </w:rPr>
+              <w:t>Liste (Rehetra)</w:t>
+            </w:r>
+          </w:p>
+        </w:tc>
+        <w:tc>
+          <w:tcPr>
+            <w:tcW w:type="dxa" w:w="2436"/>
+            <w:tcBorders>
+              <w:top w:val="nil"/>
+              <w:left w:val="nil"/>
+              <w:bottom w:val="nil"/>
+              <w:right w:val="nil"/>
+            </w:tcBorders>
+          </w:tcPr>
+          <w:p>
+            <w:pPr>
+              <w:jc w:val="center"/>
+            </w:pPr>
+            <w:r>
+              <w:drawing>
+                <wp:inline xmlns:a="http://schemas.openxmlformats.org/drawingml/2006/main" xmlns:pic="http://schemas.openxmlformats.org/drawingml/2006/picture">
+                  <wp:extent cx="1395000" cy="3100000"/>
+                  <wp:docPr id="20" name="Picture 20"/>
+                  <wp:cNvGraphicFramePr>
+                    <a:graphicFrameLocks noChangeAspect="1"/>
+                  </wp:cNvGraphicFramePr>
+                  <a:graphic>
+                    <a:graphicData uri="http://schemas.openxmlformats.org/drawingml/2006/picture">
+                      <pic:pic>
+                        <pic:nvPicPr>
+                          <pic:cNvPr id="0" name="image.jpg"/>
+                          <pic:cNvPicPr/>
+                        </pic:nvPicPr>
+                        <pic:blipFill>
+                          <a:blip r:embed="rId39"/>
+                          <a:stretch>
+                            <a:fillRect/>
+                          </a:stretch>
+                        </pic:blipFill>
+                        <pic:spPr>
+                          <a:xfrm>
+                            <a:off x="0" y="0"/>
+                            <a:ext cx="1395000" cy="3100000"/>
+                          </a:xfrm>
+                          <a:prstGeom prst="rect"/>
+                        </pic:spPr>
+                      </pic:pic>
+                    </a:graphicData>
+                  </a:graphic>
+                </wp:inline>
+              </w:drawing>
+            </w:r>
+          </w:p>
+          <w:p>
+            <w:pPr>
+              <w:jc w:val="center"/>
+            </w:pPr>
+            <w:r>
+              <w:rPr>
+                <w:rFonts w:ascii="Times New Roman" w:hAnsi="Times New Roman" w:eastAsia="Times New Roman" w:cs="Times New Roman"/>
+                <w:b w:val="0"/>
+                <w:color w:val="161616"/>
+                <w:sz w:val="16"/>
+              </w:rPr>
+              <w:t>Filtre Taratasy</w:t>
+            </w:r>
+          </w:p>
+        </w:tc>
+        <w:tc>
+          <w:tcPr>
+            <w:tcW w:type="dxa" w:w="2436"/>
+            <w:tcBorders>
+              <w:top w:val="nil"/>
+              <w:left w:val="nil"/>
+              <w:bottom w:val="nil"/>
+              <w:right w:val="nil"/>
+            </w:tcBorders>
+          </w:tcPr>
+          <w:p>
+            <w:pPr>
+              <w:jc w:val="center"/>
+            </w:pPr>
+            <w:r>
+              <w:drawing>
+                <wp:inline xmlns:a="http://schemas.openxmlformats.org/drawingml/2006/main" xmlns:pic="http://schemas.openxmlformats.org/drawingml/2006/picture">
+                  <wp:extent cx="1395000" cy="3100000"/>
+                  <wp:docPr id="21" name="Picture 21"/>
+                  <wp:cNvGraphicFramePr>
+                    <a:graphicFrameLocks noChangeAspect="1"/>
+                  </wp:cNvGraphicFramePr>
+                  <a:graphic>
+                    <a:graphicData uri="http://schemas.openxmlformats.org/drawingml/2006/picture">
+                      <pic:pic>
+                        <pic:nvPicPr>
+                          <pic:cNvPr id="0" name="image.jpg"/>
+                          <pic:cNvPicPr/>
+                        </pic:nvPicPr>
+                        <pic:blipFill>
+                          <a:blip r:embed="rId40"/>
+                          <a:stretch>
+                            <a:fillRect/>
+                          </a:stretch>
+                        </pic:blipFill>
+                        <pic:spPr>
+                          <a:xfrm>
+                            <a:off x="0" y="0"/>
+                            <a:ext cx="1395000" cy="3100000"/>
+                          </a:xfrm>
+                          <a:prstGeom prst="rect"/>
+                        </pic:spPr>
+                      </pic:pic>
+                    </a:graphicData>
+                  </a:graphic>
+                </wp:inline>
+              </w:drawing>
+            </w:r>
+          </w:p>
+          <w:p>
+            <w:pPr>
+              <w:jc w:val="center"/>
+            </w:pPr>
+            <w:r>
+              <w:rPr>
+                <w:rFonts w:ascii="Times New Roman" w:hAnsi="Times New Roman" w:eastAsia="Times New Roman" w:cs="Times New Roman"/>
+                <w:b w:val="0"/>
+                <w:color w:val="161616"/>
+                <w:sz w:val="16"/>
+              </w:rPr>
+              <w:t>Filtre Fanamarinan</w:t>
+            </w:r>
+          </w:p>
+        </w:tc>
+        <w:tc>
+          <w:tcPr>
+            <w:tcW w:type="dxa" w:w="2436"/>
+            <w:tcBorders>
+              <w:top w:val="nil"/>
+              <w:left w:val="nil"/>
+              <w:bottom w:val="nil"/>
+              <w:right w:val="nil"/>
+            </w:tcBorders>
+          </w:tcPr>
+          <w:p>
+            <w:pPr>
+              <w:jc w:val="center"/>
+            </w:pPr>
+            <w:r>
+              <w:drawing>
+                <wp:inline xmlns:a="http://schemas.openxmlformats.org/drawingml/2006/main" xmlns:pic="http://schemas.openxmlformats.org/drawingml/2006/picture">
+                  <wp:extent cx="1395000" cy="3100000"/>
+                  <wp:docPr id="22" name="Picture 22"/>
+                  <wp:cNvGraphicFramePr>
+                    <a:graphicFrameLocks noChangeAspect="1"/>
+                  </wp:cNvGraphicFramePr>
+                  <a:graphic>
+                    <a:graphicData uri="http://schemas.openxmlformats.org/drawingml/2006/picture">
+                      <pic:pic>
+                        <pic:nvPicPr>
+                          <pic:cNvPr id="0" name="image.jpg"/>
+                          <pic:cNvPicPr/>
+                        </pic:nvPicPr>
+                        <pic:blipFill>
+                          <a:blip r:embed="rId41"/>
+                          <a:stretch>
+                            <a:fillRect/>
+                          </a:stretch>
+                        </pic:blipFill>
+                        <pic:spPr>
+                          <a:xfrm>
+                            <a:off x="0" y="0"/>
+                            <a:ext cx="1395000" cy="3100000"/>
+                          </a:xfrm>
+                          <a:prstGeom prst="rect"/>
+                        </pic:spPr>
+                      </pic:pic>
+                    </a:graphicData>
+                  </a:graphic>
+                </wp:inline>
+              </w:drawing>
+            </w:r>
+          </w:p>
+          <w:p>
+            <w:pPr>
+              <w:jc w:val="center"/>
+            </w:pPr>
+            <w:r>
+              <w:rPr>
+                <w:rFonts w:ascii="Times New Roman" w:hAnsi="Times New Roman" w:eastAsia="Times New Roman" w:cs="Times New Roman"/>
+                <w:b w:val="0"/>
+                <w:color w:val="161616"/>
+                <w:sz w:val="16"/>
+              </w:rPr>
+              <w:t>Détail démarche</w:t>
+            </w:r>
+          </w:p>
+        </w:tc>
+      </w:tr>
+    </w:tbl>
+    <w:p/>
+    <w:p>
+      <w:pPr>
+        <w:pStyle w:val="Titre2"/>
+      </w:pPr>
+      <w:r>
+        <w:rPr>
+          <w:rFonts w:ascii="Times New Roman" w:hAnsi="Times New Roman" w:eastAsia="Times New Roman" w:cs="Times New Roman"/>
+          <w:b/>
+          <w:sz w:val="22"/>
+        </w:rPr>
+        <w:t>17.5. Fangatahana — dépôt d’une demande</w:t>
+      </w:r>
+    </w:p>
+    <w:p>
+      <w:pPr/>
+      <w:r>
+        <w:rPr>
+          <w:rFonts w:ascii="Times New Roman" w:hAnsi="Times New Roman" w:eastAsia="Times New Roman" w:cs="Times New Roman"/>
+          <w:b w:val="0"/>
+          <w:sz w:val="22"/>
+        </w:rPr>
+        <w:t>Parcours complet d’une fangatahana : les étapes d’une même phase sont groupées sur une ligne.</w:t>
+      </w:r>
+    </w:p>
+    <w:tbl>
+      <w:tblPr>
+        <w:tblW w:type="auto" w:w="0"/>
+        <w:tblLook w:firstColumn="1" w:firstRow="1" w:lastColumn="0" w:lastRow="0" w:noHBand="0" w:noVBand="1" w:val="04A0"/>
+      </w:tblPr>
+      <w:tblGrid>
+        <w:gridCol w:w="2436"/>
+        <w:gridCol w:w="2436"/>
+        <w:gridCol w:w="2436"/>
+        <w:gridCol w:w="2436"/>
+      </w:tblGrid>
+      <w:tr>
+        <w:tc>
+          <w:tcPr>
+            <w:tcW w:type="dxa" w:w="2436"/>
+            <w:tcBorders>
+              <w:top w:val="nil"/>
+              <w:left w:val="nil"/>
+              <w:bottom w:val="nil"/>
+              <w:right w:val="nil"/>
+            </w:tcBorders>
+          </w:tcPr>
+          <w:p>
+            <w:pPr>
+              <w:jc w:val="center"/>
+            </w:pPr>
+            <w:r>
+              <w:drawing>
+                <wp:inline xmlns:a="http://schemas.openxmlformats.org/drawingml/2006/main" xmlns:pic="http://schemas.openxmlformats.org/drawingml/2006/picture">
+                  <wp:extent cx="1395000" cy="3100000"/>
+                  <wp:docPr id="23" name="Picture 23"/>
+                  <wp:cNvGraphicFramePr>
+                    <a:graphicFrameLocks noChangeAspect="1"/>
+                  </wp:cNvGraphicFramePr>
+                  <a:graphic>
+                    <a:graphicData uri="http://schemas.openxmlformats.org/drawingml/2006/picture">
+                      <pic:pic>
+                        <pic:nvPicPr>
+                          <pic:cNvPr id="0" name="image.jpg"/>
+                          <pic:cNvPicPr/>
+                        </pic:nvPicPr>
+                        <pic:blipFill>
+                          <a:blip r:embed="rId34"/>
+                          <a:stretch>
+                            <a:fillRect/>
+                          </a:stretch>
+                        </pic:blipFill>
+                        <pic:spPr>
+                          <a:xfrm>
+                            <a:off x="0" y="0"/>
+                            <a:ext cx="1395000" cy="3100000"/>
+                          </a:xfrm>
+                          <a:prstGeom prst="rect"/>
+                        </pic:spPr>
+                      </pic:pic>
+                    </a:graphicData>
+                  </a:graphic>
+                </wp:inline>
+              </w:drawing>
+            </w:r>
+          </w:p>
+          <w:p>
+            <w:pPr>
+              <w:jc w:val="center"/>
+            </w:pPr>
+            <w:r>
+              <w:rPr>
+                <w:rFonts w:ascii="Times New Roman" w:hAnsi="Times New Roman" w:eastAsia="Times New Roman" w:cs="Times New Roman"/>
+                <w:b w:val="0"/>
+                <w:color w:val="161616"/>
+                <w:sz w:val="16"/>
+              </w:rPr>
+              <w:t>1. Formulaire</w:t>
+            </w:r>
+          </w:p>
+        </w:tc>
+        <w:tc>
+          <w:tcPr>
+            <w:tcW w:type="dxa" w:w="2436"/>
+            <w:tcBorders>
+              <w:top w:val="nil"/>
+              <w:left w:val="nil"/>
+              <w:bottom w:val="nil"/>
+              <w:right w:val="nil"/>
+            </w:tcBorders>
+          </w:tcPr>
+          <w:p>
+            <w:pPr>
+              <w:jc w:val="center"/>
+            </w:pPr>
+            <w:r>
+              <w:drawing>
+                <wp:inline xmlns:a="http://schemas.openxmlformats.org/drawingml/2006/main" xmlns:pic="http://schemas.openxmlformats.org/drawingml/2006/picture">
+                  <wp:extent cx="1395000" cy="3100000"/>
+                  <wp:docPr id="24" name="Picture 24"/>
+                  <wp:cNvGraphicFramePr>
+                    <a:graphicFrameLocks noChangeAspect="1"/>
+                  </wp:cNvGraphicFramePr>
+                  <a:graphic>
+                    <a:graphicData uri="http://schemas.openxmlformats.org/drawingml/2006/picture">
+                      <pic:pic>
+                        <pic:nvPicPr>
+                          <pic:cNvPr id="0" name="image.jpg"/>
+                          <pic:cNvPicPr/>
+                        </pic:nvPicPr>
+                        <pic:blipFill>
+                          <a:blip r:embed="rId35"/>
+                          <a:stretch>
+                            <a:fillRect/>
+                          </a:stretch>
+                        </pic:blipFill>
+                        <pic:spPr>
+                          <a:xfrm>
+                            <a:off x="0" y="0"/>
+                            <a:ext cx="1395000" cy="3100000"/>
+                          </a:xfrm>
+                          <a:prstGeom prst="rect"/>
+                        </pic:spPr>
+                      </pic:pic>
+                    </a:graphicData>
+                  </a:graphic>
+                </wp:inline>
+              </w:drawing>
+            </w:r>
+          </w:p>
+          <w:p>
+            <w:pPr>
+              <w:jc w:val="center"/>
+            </w:pPr>
+            <w:r>
+              <w:rPr>
+                <w:rFonts w:ascii="Times New Roman" w:hAnsi="Times New Roman" w:eastAsia="Times New Roman" w:cs="Times New Roman"/>
+                <w:b w:val="0"/>
+                <w:color w:val="161616"/>
+                <w:sz w:val="16"/>
+              </w:rPr>
+              <w:t>2. Pièces (vide)</w:t>
+            </w:r>
+          </w:p>
+        </w:tc>
+        <w:tc>
+          <w:tcPr>
+            <w:tcW w:type="dxa" w:w="2436"/>
+            <w:tcBorders>
+              <w:top w:val="nil"/>
+              <w:left w:val="nil"/>
+              <w:bottom w:val="nil"/>
+              <w:right w:val="nil"/>
+            </w:tcBorders>
+          </w:tcPr>
+          <w:p>
+            <w:pPr>
+              <w:jc w:val="center"/>
+            </w:pPr>
+            <w:r>
+              <w:drawing>
+                <wp:inline xmlns:a="http://schemas.openxmlformats.org/drawingml/2006/main" xmlns:pic="http://schemas.openxmlformats.org/drawingml/2006/picture">
+                  <wp:extent cx="1395000" cy="3100000"/>
+                  <wp:docPr id="25" name="Picture 25"/>
+                  <wp:cNvGraphicFramePr>
+                    <a:graphicFrameLocks noChangeAspect="1"/>
+                  </wp:cNvGraphicFramePr>
+                  <a:graphic>
+                    <a:graphicData uri="http://schemas.openxmlformats.org/drawingml/2006/picture">
+                      <pic:pic>
+                        <pic:nvPicPr>
+                          <pic:cNvPr id="0" name="image.jpg"/>
+                          <pic:cNvPicPr/>
+                        </pic:nvPicPr>
+                        <pic:blipFill>
+                          <a:blip r:embed="rId36"/>
+                          <a:stretch>
+                            <a:fillRect/>
+                          </a:stretch>
+                        </pic:blipFill>
+                        <pic:spPr>
+                          <a:xfrm>
+                            <a:off x="0" y="0"/>
+                            <a:ext cx="1395000" cy="3100000"/>
+                          </a:xfrm>
+                          <a:prstGeom prst="rect"/>
+                        </pic:spPr>
+                      </pic:pic>
+                    </a:graphicData>
+                  </a:graphic>
+                </wp:inline>
+              </w:drawing>
+            </w:r>
+          </w:p>
+          <w:p>
+            <w:pPr>
+              <w:jc w:val="center"/>
+            </w:pPr>
+            <w:r>
+              <w:rPr>
+                <w:rFonts w:ascii="Times New Roman" w:hAnsi="Times New Roman" w:eastAsia="Times New Roman" w:cs="Times New Roman"/>
+                <w:b w:val="0"/>
+                <w:color w:val="161616"/>
+                <w:sz w:val="16"/>
+              </w:rPr>
+              <w:t>3. Upload vide</w:t>
+            </w:r>
+          </w:p>
+        </w:tc>
+        <w:tc>
+          <w:tcPr>
+            <w:tcW w:type="dxa" w:w="2436"/>
+            <w:tcBorders>
+              <w:top w:val="nil"/>
+              <w:left w:val="nil"/>
+              <w:bottom w:val="nil"/>
+              <w:right w:val="nil"/>
+            </w:tcBorders>
+          </w:tcPr>
+          <w:p>
+            <w:pPr>
+              <w:jc w:val="center"/>
+            </w:pPr>
+            <w:r>
+              <w:drawing>
+                <wp:inline xmlns:a="http://schemas.openxmlformats.org/drawingml/2006/main" xmlns:pic="http://schemas.openxmlformats.org/drawingml/2006/picture">
+                  <wp:extent cx="1395000" cy="3100000"/>
+                  <wp:docPr id="26" name="Picture 26"/>
+                  <wp:cNvGraphicFramePr>
+                    <a:graphicFrameLocks noChangeAspect="1"/>
+                  </wp:cNvGraphicFramePr>
+                  <a:graphic>
+                    <a:graphicData uri="http://schemas.openxmlformats.org/drawingml/2006/picture">
+                      <pic:pic>
+                        <pic:nvPicPr>
+                          <pic:cNvPr id="0" name="image.jpg"/>
+                          <pic:cNvPicPr/>
+                        </pic:nvPicPr>
+                        <pic:blipFill>
+                          <a:blip r:embed="rId37"/>
+                          <a:stretch>
+                            <a:fillRect/>
+                          </a:stretch>
+                        </pic:blipFill>
+                        <pic:spPr>
+                          <a:xfrm>
+                            <a:off x="0" y="0"/>
+                            <a:ext cx="1395000" cy="3100000"/>
+                          </a:xfrm>
+                          <a:prstGeom prst="rect"/>
+                        </pic:spPr>
+                      </pic:pic>
+                    </a:graphicData>
+                  </a:graphic>
+                </wp:inline>
+              </w:drawing>
+            </w:r>
+          </w:p>
+          <w:p>
+            <w:pPr>
+              <w:jc w:val="center"/>
+            </w:pPr>
+            <w:r>
+              <w:rPr>
+                <w:rFonts w:ascii="Times New Roman" w:hAnsi="Times New Roman" w:eastAsia="Times New Roman" w:cs="Times New Roman"/>
+                <w:b w:val="0"/>
+                <w:color w:val="161616"/>
+                <w:sz w:val="16"/>
+              </w:rPr>
+              <w:t>4. Fichier choisi</w:t>
+            </w:r>
+          </w:p>
+        </w:tc>
+      </w:tr>
+    </w:tbl>
+    <w:p/>
+    <w:tbl>
+      <w:tblPr>
+        <w:tblW w:type="auto" w:w="0"/>
+        <w:tblLook w:firstColumn="1" w:firstRow="1" w:lastColumn="0" w:lastRow="0" w:noHBand="0" w:noVBand="1" w:val="04A0"/>
+      </w:tblPr>
+      <w:tblGrid>
+        <w:gridCol w:w="3249"/>
+        <w:gridCol w:w="3249"/>
+        <w:gridCol w:w="3249"/>
+      </w:tblGrid>
+      <w:tr>
+        <w:tc>
+          <w:tcPr>
+            <w:tcW w:type="dxa" w:w="3249"/>
+            <w:tcBorders>
+              <w:top w:val="nil"/>
+              <w:left w:val="nil"/>
+              <w:bottom w:val="nil"/>
+              <w:right w:val="nil"/>
+            </w:tcBorders>
+          </w:tcPr>
+          <w:p>
+            <w:pPr>
+              <w:jc w:val="center"/>
+            </w:pPr>
+            <w:r>
+              <w:drawing>
+                <wp:inline xmlns:a="http://schemas.openxmlformats.org/drawingml/2006/main" xmlns:pic="http://schemas.openxmlformats.org/drawingml/2006/picture">
+                  <wp:extent cx="1440000" cy="3200000"/>
+                  <wp:docPr id="27" name="Picture 27"/>
+                  <wp:cNvGraphicFramePr>
+                    <a:graphicFrameLocks noChangeAspect="1"/>
+                  </wp:cNvGraphicFramePr>
+                  <a:graphic>
+                    <a:graphicData uri="http://schemas.openxmlformats.org/drawingml/2006/picture">
+                      <pic:pic>
+                        <pic:nvPicPr>
+                          <pic:cNvPr id="0" name="image.jpg"/>
+                          <pic:cNvPicPr/>
+                        </pic:nvPicPr>
+                        <pic:blipFill>
+                          <a:blip r:embed="rId31"/>
+                          <a:stretch>
+                            <a:fillRect/>
+                          </a:stretch>
+                        </pic:blipFill>
+                        <pic:spPr>
+                          <a:xfrm>
+                            <a:off x="0" y="0"/>
+                            <a:ext cx="1440000" cy="3200000"/>
+                          </a:xfrm>
+                          <a:prstGeom prst="rect"/>
+                        </pic:spPr>
+                      </pic:pic>
+                    </a:graphicData>
+                  </a:graphic>
+                </wp:inline>
+              </w:drawing>
+            </w:r>
+          </w:p>
+          <w:p>
+            <w:pPr>
+              <w:jc w:val="center"/>
+            </w:pPr>
+            <w:r>
+              <w:rPr>
+                <w:rFonts w:ascii="Times New Roman" w:hAnsi="Times New Roman" w:eastAsia="Times New Roman" w:cs="Times New Roman"/>
+                <w:b w:val="0"/>
+                <w:color w:val="161616"/>
+                <w:sz w:val="16"/>
+              </w:rPr>
+              <w:t>5. Pièces OK</w:t>
+            </w:r>
+          </w:p>
+        </w:tc>
+        <w:tc>
+          <w:tcPr>
+            <w:tcW w:type="dxa" w:w="3249"/>
+            <w:tcBorders>
+              <w:top w:val="nil"/>
+              <w:left w:val="nil"/>
+              <w:bottom w:val="nil"/>
+              <w:right w:val="nil"/>
+            </w:tcBorders>
+          </w:tcPr>
+          <w:p>
+            <w:pPr>
+              <w:jc w:val="center"/>
+            </w:pPr>
+            <w:r>
+              <w:drawing>
+                <wp:inline xmlns:a="http://schemas.openxmlformats.org/drawingml/2006/main" xmlns:pic="http://schemas.openxmlformats.org/drawingml/2006/picture">
+                  <wp:extent cx="1440000" cy="3200000"/>
+                  <wp:docPr id="28" name="Picture 28"/>
+                  <wp:cNvGraphicFramePr>
+                    <a:graphicFrameLocks noChangeAspect="1"/>
+                  </wp:cNvGraphicFramePr>
+                  <a:graphic>
+                    <a:graphicData uri="http://schemas.openxmlformats.org/drawingml/2006/picture">
+                      <pic:pic>
+                        <pic:nvPicPr>
+                          <pic:cNvPr id="0" name="image.jpg"/>
+                          <pic:cNvPicPr/>
+                        </pic:nvPicPr>
+                        <pic:blipFill>
+                          <a:blip r:embed="rId32"/>
+                          <a:stretch>
+                            <a:fillRect/>
+                          </a:stretch>
+                        </pic:blipFill>
+                        <pic:spPr>
+                          <a:xfrm>
+                            <a:off x="0" y="0"/>
+                            <a:ext cx="1440000" cy="3200000"/>
+                          </a:xfrm>
+                          <a:prstGeom prst="rect"/>
+                        </pic:spPr>
+                      </pic:pic>
+                    </a:graphicData>
+                  </a:graphic>
+                </wp:inline>
+              </w:drawing>
+            </w:r>
+          </w:p>
+          <w:p>
+            <w:pPr>
+              <w:jc w:val="center"/>
+            </w:pPr>
+            <w:r>
+              <w:rPr>
+                <w:rFonts w:ascii="Times New Roman" w:hAnsi="Times New Roman" w:eastAsia="Times New Roman" w:cs="Times New Roman"/>
+                <w:b w:val="0"/>
+                <w:color w:val="161616"/>
+                <w:sz w:val="16"/>
+              </w:rPr>
+              <w:t>6. Récap</w:t>
+            </w:r>
+          </w:p>
+        </w:tc>
+        <w:tc>
+          <w:tcPr>
+            <w:tcW w:type="dxa" w:w="3249"/>
+            <w:tcBorders>
+              <w:top w:val="nil"/>
+              <w:left w:val="nil"/>
+              <w:bottom w:val="nil"/>
+              <w:right w:val="nil"/>
+            </w:tcBorders>
+          </w:tcPr>
+          <w:p>
+            <w:pPr>
+              <w:jc w:val="center"/>
+            </w:pPr>
+            <w:r>
+              <w:drawing>
+                <wp:inline xmlns:a="http://schemas.openxmlformats.org/drawingml/2006/main" xmlns:pic="http://schemas.openxmlformats.org/drawingml/2006/picture">
+                  <wp:extent cx="1440000" cy="3200000"/>
+                  <wp:docPr id="29" name="Picture 29"/>
+                  <wp:cNvGraphicFramePr>
+                    <a:graphicFrameLocks noChangeAspect="1"/>
+                  </wp:cNvGraphicFramePr>
+                  <a:graphic>
+                    <a:graphicData uri="http://schemas.openxmlformats.org/drawingml/2006/picture">
+                      <pic:pic>
+                        <pic:nvPicPr>
+                          <pic:cNvPr id="0" name="image.jpg"/>
+                          <pic:cNvPicPr/>
+                        </pic:nvPicPr>
+                        <pic:blipFill>
+                          <a:blip r:embed="rId33"/>
+                          <a:stretch>
+                            <a:fillRect/>
+                          </a:stretch>
+                        </pic:blipFill>
+                        <pic:spPr>
+                          <a:xfrm>
+                            <a:off x="0" y="0"/>
+                            <a:ext cx="1440000" cy="3200000"/>
+                          </a:xfrm>
+                          <a:prstGeom prst="rect"/>
+                        </pic:spPr>
+                      </pic:pic>
+                    </a:graphicData>
+                  </a:graphic>
+                </wp:inline>
+              </w:drawing>
+            </w:r>
+          </w:p>
+          <w:p>
+            <w:pPr>
+              <w:jc w:val="center"/>
+            </w:pPr>
+            <w:r>
+              <w:rPr>
+                <w:rFonts w:ascii="Times New Roman" w:hAnsi="Times New Roman" w:eastAsia="Times New Roman" w:cs="Times New Roman"/>
+                <w:b w:val="0"/>
+                <w:color w:val="161616"/>
+                <w:sz w:val="16"/>
+              </w:rPr>
+              <w:t>7. Succès</w:t>
+            </w:r>
+          </w:p>
+        </w:tc>
+      </w:tr>
+    </w:tbl>
+    <w:p/>
+    <w:p>
+      <w:pPr>
+        <w:pStyle w:val="Titre2"/>
+      </w:pPr>
+      <w:r>
+        <w:rPr>
+          <w:rFonts w:ascii="Times New Roman" w:hAnsi="Times New Roman" w:eastAsia="Times New Roman" w:cs="Times New Roman"/>
+          <w:b/>
+          <w:sz w:val="22"/>
+        </w:rPr>
+        <w:t>17.6. Mes démarches (Ny fangatahana)</w:t>
+      </w:r>
+    </w:p>
+    <w:p>
+      <w:pPr/>
+      <w:r>
+        <w:rPr>
+          <w:rFonts w:ascii="Times New Roman" w:hAnsi="Times New Roman" w:eastAsia="Times New Roman" w:cs="Times New Roman"/>
+          <w:b w:val="0"/>
+          <w:sz w:val="22"/>
+        </w:rPr>
+        <w:t>Suivi des dossiers déposés.</w:t>
+      </w:r>
+    </w:p>
+    <w:tbl>
+      <w:tblPr>
+        <w:tblW w:type="auto" w:w="0"/>
+        <w:tblLook w:firstColumn="1" w:firstRow="1" w:lastColumn="0" w:lastRow="0" w:noHBand="0" w:noVBand="1" w:val="04A0"/>
+      </w:tblPr>
+      <w:tblGrid>
+        <w:gridCol w:w="4873"/>
+        <w:gridCol w:w="4873"/>
+      </w:tblGrid>
+      <w:tr>
+        <w:tc>
+          <w:tcPr>
+            <w:tcW w:type="dxa" w:w="4873"/>
+            <w:tcBorders>
+              <w:top w:val="nil"/>
+              <w:left w:val="nil"/>
+              <w:bottom w:val="nil"/>
+              <w:right w:val="nil"/>
+            </w:tcBorders>
+          </w:tcPr>
+          <w:p>
+            <w:pPr>
+              <w:jc w:val="center"/>
+            </w:pPr>
+            <w:r>
+              <w:drawing>
+                <wp:inline xmlns:a="http://schemas.openxmlformats.org/drawingml/2006/main" xmlns:pic="http://schemas.openxmlformats.org/drawingml/2006/picture">
+                  <wp:extent cx="1440000" cy="3200000"/>
+                  <wp:docPr id="30" name="Picture 30"/>
+                  <wp:cNvGraphicFramePr>
+                    <a:graphicFrameLocks noChangeAspect="1"/>
+                  </wp:cNvGraphicFramePr>
+                  <a:graphic>
+                    <a:graphicData uri="http://schemas.openxmlformats.org/drawingml/2006/picture">
+                      <pic:pic>
+                        <pic:nvPicPr>
+                          <pic:cNvPr id="0" name="image.jpg"/>
+                          <pic:cNvPicPr/>
+                        </pic:nvPicPr>
+                        <pic:blipFill>
+                          <a:blip r:embed="rId29"/>
+                          <a:stretch>
+                            <a:fillRect/>
+                          </a:stretch>
+                        </pic:blipFill>
+                        <pic:spPr>
+                          <a:xfrm>
+                            <a:off x="0" y="0"/>
+                            <a:ext cx="1440000" cy="3200000"/>
+                          </a:xfrm>
+                          <a:prstGeom prst="rect"/>
+                        </pic:spPr>
+                      </pic:pic>
+                    </a:graphicData>
+                  </a:graphic>
+                </wp:inline>
+              </w:drawing>
+            </w:r>
+          </w:p>
+          <w:p>
+            <w:pPr>
+              <w:jc w:val="center"/>
+            </w:pPr>
+            <w:r>
+              <w:rPr>
+                <w:rFonts w:ascii="Times New Roman" w:hAnsi="Times New Roman" w:eastAsia="Times New Roman" w:cs="Times New Roman"/>
+                <w:b w:val="0"/>
+                <w:color w:val="161616"/>
+                <w:sz w:val="16"/>
+              </w:rPr>
+              <w:t>Liste vide</w:t>
+            </w:r>
+          </w:p>
+        </w:tc>
+        <w:tc>
+          <w:tcPr>
+            <w:tcW w:type="dxa" w:w="4873"/>
+            <w:tcBorders>
+              <w:top w:val="nil"/>
+              <w:left w:val="nil"/>
+              <w:bottom w:val="nil"/>
+              <w:right w:val="nil"/>
+            </w:tcBorders>
+          </w:tcPr>
+          <w:p>
+            <w:pPr>
+              <w:jc w:val="center"/>
+            </w:pPr>
+            <w:r>
+              <w:drawing>
+                <wp:inline xmlns:a="http://schemas.openxmlformats.org/drawingml/2006/main" xmlns:pic="http://schemas.openxmlformats.org/drawingml/2006/picture">
+                  <wp:extent cx="1440000" cy="3200000"/>
+                  <wp:docPr id="31" name="Picture 31"/>
+                  <wp:cNvGraphicFramePr>
+                    <a:graphicFrameLocks noChangeAspect="1"/>
+                  </wp:cNvGraphicFramePr>
+                  <a:graphic>
+                    <a:graphicData uri="http://schemas.openxmlformats.org/drawingml/2006/picture">
+                      <pic:pic>
+                        <pic:nvPicPr>
+                          <pic:cNvPr id="0" name="image.jpg"/>
+                          <pic:cNvPicPr/>
+                        </pic:nvPicPr>
+                        <pic:blipFill>
+                          <a:blip r:embed="rId30"/>
+                          <a:stretch>
+                            <a:fillRect/>
+                          </a:stretch>
+                        </pic:blipFill>
+                        <pic:spPr>
+                          <a:xfrm>
+                            <a:off x="0" y="0"/>
+                            <a:ext cx="1440000" cy="3200000"/>
+                          </a:xfrm>
+                          <a:prstGeom prst="rect"/>
+                        </pic:spPr>
+                      </pic:pic>
+                    </a:graphicData>
+                  </a:graphic>
+                </wp:inline>
+              </w:drawing>
+            </w:r>
+          </w:p>
+          <w:p>
+            <w:pPr>
+              <w:jc w:val="center"/>
+            </w:pPr>
+            <w:r>
+              <w:rPr>
+                <w:rFonts w:ascii="Times New Roman" w:hAnsi="Times New Roman" w:eastAsia="Times New Roman" w:cs="Times New Roman"/>
+                <w:b w:val="0"/>
+                <w:color w:val="161616"/>
+                <w:sz w:val="16"/>
+              </w:rPr>
+              <w:t>Avec dossier</w:t>
+            </w:r>
+          </w:p>
+        </w:tc>
+      </w:tr>
+    </w:tbl>
+    <w:p/>
+    <w:p>
+      <w:pPr>
+        <w:pStyle w:val="Titre2"/>
+      </w:pPr>
+      <w:r>
+        <w:rPr>
+          <w:rFonts w:ascii="Times New Roman" w:hAnsi="Times New Roman" w:eastAsia="Times New Roman" w:cs="Times New Roman"/>
+          <w:b/>
+          <w:sz w:val="22"/>
+        </w:rPr>
+        <w:t>17.7. Tatitra — catégories</w:t>
+      </w:r>
+    </w:p>
+    <w:p>
+      <w:pPr/>
+      <w:r>
+        <w:rPr>
+          <w:rFonts w:ascii="Times New Roman" w:hAnsi="Times New Roman" w:eastAsia="Times New Roman" w:cs="Times New Roman"/>
+          <w:b w:val="0"/>
+          <w:sz w:val="22"/>
+        </w:rPr>
+        <w:t>Choix du type de problème avant la localisation.</w:t>
+      </w:r>
+    </w:p>
+    <w:tbl>
+      <w:tblPr>
+        <w:tblW w:type="auto" w:w="0"/>
+        <w:tblLook w:firstColumn="1" w:firstRow="1" w:lastColumn="0" w:lastRow="0" w:noHBand="0" w:noVBand="1" w:val="04A0"/>
+      </w:tblPr>
+      <w:tblGrid>
+        <w:gridCol w:w="3249"/>
+        <w:gridCol w:w="3249"/>
+        <w:gridCol w:w="3249"/>
+      </w:tblGrid>
+      <w:tr>
+        <w:tc>
+          <w:tcPr>
+            <w:tcW w:type="dxa" w:w="3249"/>
+            <w:tcBorders>
+              <w:top w:val="nil"/>
+              <w:left w:val="nil"/>
+              <w:bottom w:val="nil"/>
+              <w:right w:val="nil"/>
+            </w:tcBorders>
+          </w:tcPr>
+          <w:p>
+            <w:pPr>
+              <w:jc w:val="center"/>
+            </w:pPr>
+            <w:r>
+              <w:drawing>
+                <wp:inline xmlns:a="http://schemas.openxmlformats.org/drawingml/2006/main" xmlns:pic="http://schemas.openxmlformats.org/drawingml/2006/picture">
+                  <wp:extent cx="1440000" cy="3200000"/>
+                  <wp:docPr id="32" name="Picture 32"/>
+                  <wp:cNvGraphicFramePr>
+                    <a:graphicFrameLocks noChangeAspect="1"/>
+                  </wp:cNvGraphicFramePr>
+                  <a:graphic>
+                    <a:graphicData uri="http://schemas.openxmlformats.org/drawingml/2006/picture">
+                      <pic:pic>
+                        <pic:nvPicPr>
+                          <pic:cNvPr id="0" name="image.jpg"/>
+                          <pic:cNvPicPr/>
+                        </pic:nvPicPr>
+                        <pic:blipFill>
+                          <a:blip r:embed="rId26"/>
+                          <a:stretch>
+                            <a:fillRect/>
+                          </a:stretch>
+                        </pic:blipFill>
+                        <pic:spPr>
+                          <a:xfrm>
+                            <a:off x="0" y="0"/>
+                            <a:ext cx="1440000" cy="3200000"/>
+                          </a:xfrm>
+                          <a:prstGeom prst="rect"/>
+                        </pic:spPr>
+                      </pic:pic>
+                    </a:graphicData>
+                  </a:graphic>
+                </wp:inline>
+              </w:drawing>
+            </w:r>
+          </w:p>
+          <w:p>
+            <w:pPr>
+              <w:jc w:val="center"/>
+            </w:pPr>
+            <w:r>
+              <w:rPr>
+                <w:rFonts w:ascii="Times New Roman" w:hAnsi="Times New Roman" w:eastAsia="Times New Roman" w:cs="Times New Roman"/>
+                <w:b w:val="0"/>
+                <w:color w:val="161616"/>
+                <w:sz w:val="16"/>
+              </w:rPr>
+              <w:t>1. Catégories</w:t>
+            </w:r>
+          </w:p>
+        </w:tc>
+        <w:tc>
+          <w:tcPr>
+            <w:tcW w:type="dxa" w:w="3249"/>
+            <w:tcBorders>
+              <w:top w:val="nil"/>
+              <w:left w:val="nil"/>
+              <w:bottom w:val="nil"/>
+              <w:right w:val="nil"/>
+            </w:tcBorders>
+          </w:tcPr>
+          <w:p>
+            <w:pPr>
+              <w:jc w:val="center"/>
+            </w:pPr>
+            <w:r>
+              <w:drawing>
+                <wp:inline xmlns:a="http://schemas.openxmlformats.org/drawingml/2006/main" xmlns:pic="http://schemas.openxmlformats.org/drawingml/2006/picture">
+                  <wp:extent cx="1440000" cy="3200000"/>
+                  <wp:docPr id="33" name="Picture 33"/>
+                  <wp:cNvGraphicFramePr>
+                    <a:graphicFrameLocks noChangeAspect="1"/>
+                  </wp:cNvGraphicFramePr>
+                  <a:graphic>
+                    <a:graphicData uri="http://schemas.openxmlformats.org/drawingml/2006/picture">
+                      <pic:pic>
+                        <pic:nvPicPr>
+                          <pic:cNvPr id="0" name="image.jpg"/>
+                          <pic:cNvPicPr/>
+                        </pic:nvPicPr>
+                        <pic:blipFill>
+                          <a:blip r:embed="rId27"/>
+                          <a:stretch>
+                            <a:fillRect/>
+                          </a:stretch>
+                        </pic:blipFill>
+                        <pic:spPr>
+                          <a:xfrm>
+                            <a:off x="0" y="0"/>
+                            <a:ext cx="1440000" cy="3200000"/>
+                          </a:xfrm>
+                          <a:prstGeom prst="rect"/>
+                        </pic:spPr>
+                      </pic:pic>
+                    </a:graphicData>
+                  </a:graphic>
+                </wp:inline>
+              </w:drawing>
+            </w:r>
+          </w:p>
+          <w:p>
+            <w:pPr>
+              <w:jc w:val="center"/>
+            </w:pPr>
+            <w:r>
+              <w:rPr>
+                <w:rFonts w:ascii="Times New Roman" w:hAnsi="Times New Roman" w:eastAsia="Times New Roman" w:cs="Times New Roman"/>
+                <w:b w:val="0"/>
+                <w:color w:val="161616"/>
+                <w:sz w:val="16"/>
+              </w:rPr>
+              <w:t>2. Suite liste</w:t>
+            </w:r>
+          </w:p>
+        </w:tc>
+        <w:tc>
+          <w:tcPr>
+            <w:tcW w:type="dxa" w:w="3249"/>
+            <w:tcBorders>
+              <w:top w:val="nil"/>
+              <w:left w:val="nil"/>
+              <w:bottom w:val="nil"/>
+              <w:right w:val="nil"/>
+            </w:tcBorders>
+          </w:tcPr>
+          <w:p>
+            <w:pPr>
+              <w:jc w:val="center"/>
+            </w:pPr>
+            <w:r>
+              <w:drawing>
+                <wp:inline xmlns:a="http://schemas.openxmlformats.org/drawingml/2006/main" xmlns:pic="http://schemas.openxmlformats.org/drawingml/2006/picture">
+                  <wp:extent cx="1440000" cy="3200000"/>
+                  <wp:docPr id="34" name="Picture 34"/>
+                  <wp:cNvGraphicFramePr>
+                    <a:graphicFrameLocks noChangeAspect="1"/>
+                  </wp:cNvGraphicFramePr>
+                  <a:graphic>
+                    <a:graphicData uri="http://schemas.openxmlformats.org/drawingml/2006/picture">
+                      <pic:pic>
+                        <pic:nvPicPr>
+                          <pic:cNvPr id="0" name="image.jpg"/>
+                          <pic:cNvPicPr/>
+                        </pic:nvPicPr>
+                        <pic:blipFill>
+                          <a:blip r:embed="rId28"/>
+                          <a:stretch>
+                            <a:fillRect/>
+                          </a:stretch>
+                        </pic:blipFill>
+                        <pic:spPr>
+                          <a:xfrm>
+                            <a:off x="0" y="0"/>
+                            <a:ext cx="1440000" cy="3200000"/>
+                          </a:xfrm>
+                          <a:prstGeom prst="rect"/>
+                        </pic:spPr>
+                      </pic:pic>
+                    </a:graphicData>
+                  </a:graphic>
+                </wp:inline>
+              </w:drawing>
+            </w:r>
+          </w:p>
+          <w:p>
+            <w:pPr>
+              <w:jc w:val="center"/>
+            </w:pPr>
+            <w:r>
+              <w:rPr>
+                <w:rFonts w:ascii="Times New Roman" w:hAnsi="Times New Roman" w:eastAsia="Times New Roman" w:cs="Times New Roman"/>
+                <w:b w:val="0"/>
+                <w:color w:val="161616"/>
+                <w:sz w:val="16"/>
+              </w:rPr>
+              <w:t>3. Sous-catégorie</w:t>
+            </w:r>
+          </w:p>
+        </w:tc>
+      </w:tr>
+    </w:tbl>
+    <w:p/>
+    <w:p>
+      <w:pPr>
+        <w:pStyle w:val="Titre2"/>
+      </w:pPr>
+      <w:r>
+        <w:rPr>
+          <w:rFonts w:ascii="Times New Roman" w:hAnsi="Times New Roman" w:eastAsia="Times New Roman" w:cs="Times New Roman"/>
+          <w:b/>
+          <w:sz w:val="22"/>
+        </w:rPr>
+        <w:t>17.8. Tatitra — Toerana (carte et GPS)</w:t>
+      </w:r>
+    </w:p>
+    <w:p>
+      <w:pPr/>
+      <w:r>
+        <w:rPr>
+          <w:rFonts w:ascii="Times New Roman" w:hAnsi="Times New Roman" w:eastAsia="Times New Roman" w:cs="Times New Roman"/>
+          <w:b w:val="0"/>
+          <w:sz w:val="22"/>
+        </w:rPr>
+        <w:t>Localisation du problème. Même rubrique, plusieurs états de l’écran carte.</w:t>
+      </w:r>
+    </w:p>
+    <w:tbl>
+      <w:tblPr>
+        <w:tblW w:type="auto" w:w="0"/>
+        <w:tblLook w:firstColumn="1" w:firstRow="1" w:lastColumn="0" w:lastRow="0" w:noHBand="0" w:noVBand="1" w:val="04A0"/>
+      </w:tblPr>
+      <w:tblGrid>
+        <w:gridCol w:w="2436"/>
+        <w:gridCol w:w="2436"/>
+        <w:gridCol w:w="2436"/>
+        <w:gridCol w:w="2436"/>
+      </w:tblGrid>
+      <w:tr>
+        <w:tc>
+          <w:tcPr>
+            <w:tcW w:type="dxa" w:w="2436"/>
+            <w:tcBorders>
+              <w:top w:val="nil"/>
+              <w:left w:val="nil"/>
+              <w:bottom w:val="nil"/>
+              <w:right w:val="nil"/>
+            </w:tcBorders>
+          </w:tcPr>
+          <w:p>
+            <w:pPr>
+              <w:jc w:val="center"/>
+            </w:pPr>
+            <w:r>
+              <w:drawing>
+                <wp:inline xmlns:a="http://schemas.openxmlformats.org/drawingml/2006/main" xmlns:pic="http://schemas.openxmlformats.org/drawingml/2006/picture">
+                  <wp:extent cx="1395000" cy="3100000"/>
+                  <wp:docPr id="35" name="Picture 35"/>
+                  <wp:cNvGraphicFramePr>
+                    <a:graphicFrameLocks noChangeAspect="1"/>
+                  </wp:cNvGraphicFramePr>
+                  <a:graphic>
+                    <a:graphicData uri="http://schemas.openxmlformats.org/drawingml/2006/picture">
+                      <pic:pic>
+                        <pic:nvPicPr>
+                          <pic:cNvPr id="0" name="image.jpg"/>
+                          <pic:cNvPicPr/>
+                        </pic:nvPicPr>
+                        <pic:blipFill>
+                          <a:blip r:embed="rId22"/>
+                          <a:stretch>
+                            <a:fillRect/>
+                          </a:stretch>
+                        </pic:blipFill>
+                        <pic:spPr>
+                          <a:xfrm>
+                            <a:off x="0" y="0"/>
+                            <a:ext cx="1395000" cy="3100000"/>
+                          </a:xfrm>
+                          <a:prstGeom prst="rect"/>
+                        </pic:spPr>
+                      </pic:pic>
+                    </a:graphicData>
+                  </a:graphic>
+                </wp:inline>
+              </w:drawing>
+            </w:r>
+          </w:p>
+          <w:p>
+            <w:pPr>
+              <w:jc w:val="center"/>
+            </w:pPr>
+            <w:r>
+              <w:rPr>
+                <w:rFonts w:ascii="Times New Roman" w:hAnsi="Times New Roman" w:eastAsia="Times New Roman" w:cs="Times New Roman"/>
+                <w:b w:val="0"/>
+                <w:color w:val="161616"/>
+                <w:sz w:val="16"/>
+              </w:rPr>
+              <w:t>1. Carte</w:t>
+            </w:r>
+          </w:p>
+        </w:tc>
+        <w:tc>
+          <w:tcPr>
+            <w:tcW w:type="dxa" w:w="2436"/>
+            <w:tcBorders>
+              <w:top w:val="nil"/>
+              <w:left w:val="nil"/>
+              <w:bottom w:val="nil"/>
+              <w:right w:val="nil"/>
+            </w:tcBorders>
+          </w:tcPr>
+          <w:p>
+            <w:pPr>
+              <w:jc w:val="center"/>
+            </w:pPr>
+            <w:r>
+              <w:drawing>
+                <wp:inline xmlns:a="http://schemas.openxmlformats.org/drawingml/2006/main" xmlns:pic="http://schemas.openxmlformats.org/drawingml/2006/picture">
+                  <wp:extent cx="1395000" cy="3100000"/>
+                  <wp:docPr id="36" name="Picture 36"/>
+                  <wp:cNvGraphicFramePr>
+                    <a:graphicFrameLocks noChangeAspect="1"/>
+                  </wp:cNvGraphicFramePr>
+                  <a:graphic>
+                    <a:graphicData uri="http://schemas.openxmlformats.org/drawingml/2006/picture">
+                      <pic:pic>
+                        <pic:nvPicPr>
+                          <pic:cNvPr id="0" name="image.jpg"/>
+                          <pic:cNvPicPr/>
+                        </pic:nvPicPr>
+                        <pic:blipFill>
+                          <a:blip r:embed="rId23"/>
+                          <a:stretch>
+                            <a:fillRect/>
+                          </a:stretch>
+                        </pic:blipFill>
+                        <pic:spPr>
+                          <a:xfrm>
+                            <a:off x="0" y="0"/>
+                            <a:ext cx="1395000" cy="3100000"/>
+                          </a:xfrm>
+                          <a:prstGeom prst="rect"/>
+                        </pic:spPr>
+                      </pic:pic>
+                    </a:graphicData>
+                  </a:graphic>
+                </wp:inline>
+              </w:drawing>
+            </w:r>
+          </w:p>
+          <w:p>
+            <w:pPr>
+              <w:jc w:val="center"/>
+            </w:pPr>
+            <w:r>
+              <w:rPr>
+                <w:rFonts w:ascii="Times New Roman" w:hAnsi="Times New Roman" w:eastAsia="Times New Roman" w:cs="Times New Roman"/>
+                <w:b w:val="0"/>
+                <w:color w:val="161616"/>
+                <w:sz w:val="16"/>
+              </w:rPr>
+              <w:t>2. Tohizo grisé</w:t>
+            </w:r>
+          </w:p>
+        </w:tc>
+        <w:tc>
+          <w:tcPr>
+            <w:tcW w:type="dxa" w:w="2436"/>
+            <w:tcBorders>
+              <w:top w:val="nil"/>
+              <w:left w:val="nil"/>
+              <w:bottom w:val="nil"/>
+              <w:right w:val="nil"/>
+            </w:tcBorders>
+          </w:tcPr>
+          <w:p>
+            <w:pPr>
+              <w:jc w:val="center"/>
+            </w:pPr>
+            <w:r>
+              <w:drawing>
+                <wp:inline xmlns:a="http://schemas.openxmlformats.org/drawingml/2006/main" xmlns:pic="http://schemas.openxmlformats.org/drawingml/2006/picture">
+                  <wp:extent cx="1395000" cy="3100000"/>
+                  <wp:docPr id="37" name="Picture 37"/>
+                  <wp:cNvGraphicFramePr>
+                    <a:graphicFrameLocks noChangeAspect="1"/>
+                  </wp:cNvGraphicFramePr>
+                  <a:graphic>
+                    <a:graphicData uri="http://schemas.openxmlformats.org/drawingml/2006/picture">
+                      <pic:pic>
+                        <pic:nvPicPr>
+                          <pic:cNvPr id="0" name="image.jpg"/>
+                          <pic:cNvPicPr/>
+                        </pic:nvPicPr>
+                        <pic:blipFill>
+                          <a:blip r:embed="rId24"/>
+                          <a:stretch>
+                            <a:fillRect/>
+                          </a:stretch>
+                        </pic:blipFill>
+                        <pic:spPr>
+                          <a:xfrm>
+                            <a:off x="0" y="0"/>
+                            <a:ext cx="1395000" cy="3100000"/>
+                          </a:xfrm>
+                          <a:prstGeom prst="rect"/>
+                        </pic:spPr>
+                      </pic:pic>
+                    </a:graphicData>
+                  </a:graphic>
+                </wp:inline>
+              </w:drawing>
+            </w:r>
+          </w:p>
+          <w:p>
+            <w:pPr>
+              <w:jc w:val="center"/>
+            </w:pPr>
+            <w:r>
+              <w:rPr>
+                <w:rFonts w:ascii="Times New Roman" w:hAnsi="Times New Roman" w:eastAsia="Times New Roman" w:cs="Times New Roman"/>
+                <w:b w:val="0"/>
+                <w:color w:val="161616"/>
+                <w:sz w:val="16"/>
+              </w:rPr>
+              <w:t>3. Permission GPS</w:t>
+            </w:r>
+          </w:p>
+        </w:tc>
+        <w:tc>
+          <w:tcPr>
+            <w:tcW w:type="dxa" w:w="2436"/>
+            <w:tcBorders>
+              <w:top w:val="nil"/>
+              <w:left w:val="nil"/>
+              <w:bottom w:val="nil"/>
+              <w:right w:val="nil"/>
+            </w:tcBorders>
+          </w:tcPr>
+          <w:p>
+            <w:pPr>
+              <w:jc w:val="center"/>
+            </w:pPr>
+            <w:r>
+              <w:drawing>
+                <wp:inline xmlns:a="http://schemas.openxmlformats.org/drawingml/2006/main" xmlns:pic="http://schemas.openxmlformats.org/drawingml/2006/picture">
+                  <wp:extent cx="1395000" cy="3100000"/>
+                  <wp:docPr id="38" name="Picture 38"/>
+                  <wp:cNvGraphicFramePr>
+                    <a:graphicFrameLocks noChangeAspect="1"/>
+                  </wp:cNvGraphicFramePr>
+                  <a:graphic>
+                    <a:graphicData uri="http://schemas.openxmlformats.org/drawingml/2006/picture">
+                      <pic:pic>
+                        <pic:nvPicPr>
+                          <pic:cNvPr id="0" name="image.jpg"/>
+                          <pic:cNvPicPr/>
+                        </pic:nvPicPr>
+                        <pic:blipFill>
+                          <a:blip r:embed="rId25"/>
+                          <a:stretch>
+                            <a:fillRect/>
+                          </a:stretch>
+                        </pic:blipFill>
+                        <pic:spPr>
+                          <a:xfrm>
+                            <a:off x="0" y="0"/>
+                            <a:ext cx="1395000" cy="3100000"/>
+                          </a:xfrm>
+                          <a:prstGeom prst="rect"/>
+                        </pic:spPr>
+                      </pic:pic>
+                    </a:graphicData>
+                  </a:graphic>
+                </wp:inline>
+              </w:drawing>
+            </w:r>
+          </w:p>
+          <w:p>
+            <w:pPr>
+              <w:jc w:val="center"/>
+            </w:pPr>
+            <w:r>
+              <w:rPr>
+                <w:rFonts w:ascii="Times New Roman" w:hAnsi="Times New Roman" w:eastAsia="Times New Roman" w:cs="Times New Roman"/>
+                <w:b w:val="0"/>
+                <w:color w:val="161616"/>
+                <w:sz w:val="16"/>
+              </w:rPr>
+              <w:t>4. Coordonnées OK</w:t>
+            </w:r>
+          </w:p>
+        </w:tc>
+      </w:tr>
+    </w:tbl>
+    <w:p/>
+    <w:p>
+      <w:pPr>
+        <w:pStyle w:val="Titre2"/>
+      </w:pPr>
+      <w:r>
+        <w:rPr>
+          <w:rFonts w:ascii="Times New Roman" w:hAnsi="Times New Roman" w:eastAsia="Times New Roman" w:cs="Times New Roman"/>
+          <w:b/>
+          <w:sz w:val="22"/>
+        </w:rPr>
+        <w:t>17.9. Tatitra — détails, envoi et succès</w:t>
+      </w:r>
+    </w:p>
+    <w:p>
+      <w:pPr/>
+      <w:r>
+        <w:rPr>
+          <w:rFonts w:ascii="Times New Roman" w:hAnsi="Times New Roman" w:eastAsia="Times New Roman" w:cs="Times New Roman"/>
+          <w:b w:val="0"/>
+          <w:sz w:val="22"/>
+        </w:rPr>
+        <w:t>Description / photo, confirmation, puis numéro de suivi.</w:t>
+      </w:r>
+    </w:p>
+    <w:tbl>
+      <w:tblPr>
+        <w:tblW w:type="auto" w:w="0"/>
+        <w:tblLook w:firstColumn="1" w:firstRow="1" w:lastColumn="0" w:lastRow="0" w:noHBand="0" w:noVBand="1" w:val="04A0"/>
+      </w:tblPr>
+      <w:tblGrid>
+        <w:gridCol w:w="3249"/>
+        <w:gridCol w:w="3249"/>
+        <w:gridCol w:w="3249"/>
+      </w:tblGrid>
+      <w:tr>
+        <w:tc>
+          <w:tcPr>
+            <w:tcW w:type="dxa" w:w="3249"/>
+            <w:tcBorders>
+              <w:top w:val="nil"/>
+              <w:left w:val="nil"/>
+              <w:bottom w:val="nil"/>
+              <w:right w:val="nil"/>
+            </w:tcBorders>
+          </w:tcPr>
+          <w:p>
+            <w:pPr>
+              <w:jc w:val="center"/>
+            </w:pPr>
+            <w:r>
+              <w:drawing>
+                <wp:inline xmlns:a="http://schemas.openxmlformats.org/drawingml/2006/main" xmlns:pic="http://schemas.openxmlformats.org/drawingml/2006/picture">
+                  <wp:extent cx="1440000" cy="3200000"/>
+                  <wp:docPr id="39" name="Picture 39"/>
+                  <wp:cNvGraphicFramePr>
+                    <a:graphicFrameLocks noChangeAspect="1"/>
+                  </wp:cNvGraphicFramePr>
+                  <a:graphic>
+                    <a:graphicData uri="http://schemas.openxmlformats.org/drawingml/2006/picture">
+                      <pic:pic>
+                        <pic:nvPicPr>
+                          <pic:cNvPr id="0" name="image.jpg"/>
+                          <pic:cNvPicPr/>
+                        </pic:nvPicPr>
+                        <pic:blipFill>
+                          <a:blip r:embed="rId19"/>
+                          <a:stretch>
+                            <a:fillRect/>
+                          </a:stretch>
+                        </pic:blipFill>
+                        <pic:spPr>
+                          <a:xfrm>
+                            <a:off x="0" y="0"/>
+                            <a:ext cx="1440000" cy="3200000"/>
+                          </a:xfrm>
+                          <a:prstGeom prst="rect"/>
+                        </pic:spPr>
+                      </pic:pic>
+                    </a:graphicData>
+                  </a:graphic>
+                </wp:inline>
+              </w:drawing>
+            </w:r>
+          </w:p>
+          <w:p>
+            <w:pPr>
+              <w:jc w:val="center"/>
+            </w:pPr>
+            <w:r>
+              <w:rPr>
+                <w:rFonts w:ascii="Times New Roman" w:hAnsi="Times New Roman" w:eastAsia="Times New Roman" w:cs="Times New Roman"/>
+                <w:b w:val="0"/>
+                <w:color w:val="161616"/>
+                <w:sz w:val="16"/>
+              </w:rPr>
+              <w:t>1. Détails + photos</w:t>
+            </w:r>
+          </w:p>
+        </w:tc>
+        <w:tc>
+          <w:tcPr>
+            <w:tcW w:type="dxa" w:w="3249"/>
+            <w:tcBorders>
+              <w:top w:val="nil"/>
+              <w:left w:val="nil"/>
+              <w:bottom w:val="nil"/>
+              <w:right w:val="nil"/>
+            </w:tcBorders>
+          </w:tcPr>
+          <w:p>
+            <w:pPr>
+              <w:jc w:val="center"/>
+            </w:pPr>
+            <w:r>
+              <w:drawing>
+                <wp:inline xmlns:a="http://schemas.openxmlformats.org/drawingml/2006/main" xmlns:pic="http://schemas.openxmlformats.org/drawingml/2006/picture">
+                  <wp:extent cx="1440000" cy="3200000"/>
+                  <wp:docPr id="40" name="Picture 40"/>
+                  <wp:cNvGraphicFramePr>
+                    <a:graphicFrameLocks noChangeAspect="1"/>
+                  </wp:cNvGraphicFramePr>
+                  <a:graphic>
+                    <a:graphicData uri="http://schemas.openxmlformats.org/drawingml/2006/picture">
+                      <pic:pic>
+                        <pic:nvPicPr>
+                          <pic:cNvPr id="0" name="image.jpg"/>
+                          <pic:cNvPicPr/>
+                        </pic:nvPicPr>
+                        <pic:blipFill>
+                          <a:blip r:embed="rId20"/>
+                          <a:stretch>
+                            <a:fillRect/>
+                          </a:stretch>
+                        </pic:blipFill>
+                        <pic:spPr>
+                          <a:xfrm>
+                            <a:off x="0" y="0"/>
+                            <a:ext cx="1440000" cy="3200000"/>
+                          </a:xfrm>
+                          <a:prstGeom prst="rect"/>
+                        </pic:spPr>
+                      </pic:pic>
+                    </a:graphicData>
+                  </a:graphic>
+                </wp:inline>
+              </w:drawing>
+            </w:r>
+          </w:p>
+          <w:p>
+            <w:pPr>
+              <w:jc w:val="center"/>
+            </w:pPr>
+            <w:r>
+              <w:rPr>
+                <w:rFonts w:ascii="Times New Roman" w:hAnsi="Times New Roman" w:eastAsia="Times New Roman" w:cs="Times New Roman"/>
+                <w:b w:val="0"/>
+                <w:color w:val="161616"/>
+                <w:sz w:val="16"/>
+              </w:rPr>
+              <w:t>2. Confirmation</w:t>
+            </w:r>
+          </w:p>
+        </w:tc>
+        <w:tc>
+          <w:tcPr>
+            <w:tcW w:type="dxa" w:w="3249"/>
+            <w:tcBorders>
+              <w:top w:val="nil"/>
+              <w:left w:val="nil"/>
+              <w:bottom w:val="nil"/>
+              <w:right w:val="nil"/>
+            </w:tcBorders>
+          </w:tcPr>
+          <w:p>
+            <w:pPr>
+              <w:jc w:val="center"/>
+            </w:pPr>
+            <w:r>
+              <w:drawing>
+                <wp:inline xmlns:a="http://schemas.openxmlformats.org/drawingml/2006/main" xmlns:pic="http://schemas.openxmlformats.org/drawingml/2006/picture">
+                  <wp:extent cx="1440000" cy="3200000"/>
+                  <wp:docPr id="41" name="Picture 41"/>
+                  <wp:cNvGraphicFramePr>
+                    <a:graphicFrameLocks noChangeAspect="1"/>
+                  </wp:cNvGraphicFramePr>
+                  <a:graphic>
+                    <a:graphicData uri="http://schemas.openxmlformats.org/drawingml/2006/picture">
+                      <pic:pic>
+                        <pic:nvPicPr>
+                          <pic:cNvPr id="0" name="image.jpg"/>
+                          <pic:cNvPicPr/>
+                        </pic:nvPicPr>
+                        <pic:blipFill>
+                          <a:blip r:embed="rId21"/>
+                          <a:stretch>
+                            <a:fillRect/>
+                          </a:stretch>
+                        </pic:blipFill>
+                        <pic:spPr>
+                          <a:xfrm>
+                            <a:off x="0" y="0"/>
+                            <a:ext cx="1440000" cy="3200000"/>
+                          </a:xfrm>
+                          <a:prstGeom prst="rect"/>
+                        </pic:spPr>
+                      </pic:pic>
+                    </a:graphicData>
+                  </a:graphic>
+                </wp:inline>
+              </w:drawing>
+            </w:r>
+          </w:p>
+          <w:p>
+            <w:pPr>
+              <w:jc w:val="center"/>
+            </w:pPr>
+            <w:r>
+              <w:rPr>
+                <w:rFonts w:ascii="Times New Roman" w:hAnsi="Times New Roman" w:eastAsia="Times New Roman" w:cs="Times New Roman"/>
+                <w:b w:val="0"/>
+                <w:color w:val="161616"/>
+                <w:sz w:val="16"/>
+              </w:rPr>
+              <w:t>3. Succès</w:t>
+            </w:r>
+          </w:p>
+        </w:tc>
+      </w:tr>
+    </w:tbl>
+    <w:p/>
+    <w:p>
+      <w:pPr>
+        <w:pStyle w:val="Titre2"/>
+      </w:pPr>
+      <w:r>
+        <w:rPr>
+          <w:rFonts w:ascii="Times New Roman" w:hAnsi="Times New Roman" w:eastAsia="Times New Roman" w:cs="Times New Roman"/>
+          <w:b/>
+          <w:sz w:val="22"/>
+        </w:rPr>
+        <w:t>17.10. Mes signalements (Ny tatitra)</w:t>
+      </w:r>
+    </w:p>
+    <w:p>
+      <w:pPr/>
+      <w:r>
+        <w:rPr>
+          <w:rFonts w:ascii="Times New Roman" w:hAnsi="Times New Roman" w:eastAsia="Times New Roman" w:cs="Times New Roman"/>
+          <w:b w:val="0"/>
+          <w:sz w:val="22"/>
+        </w:rPr>
+        <w:t>Liste et filtres des tatitra déjà envoyés.</w:t>
+      </w:r>
+    </w:p>
+    <w:tbl>
+      <w:tblPr>
+        <w:tblW w:type="auto" w:w="0"/>
+        <w:tblLook w:firstColumn="1" w:firstRow="1" w:lastColumn="0" w:lastRow="0" w:noHBand="0" w:noVBand="1" w:val="04A0"/>
+      </w:tblPr>
+      <w:tblGrid>
+        <w:gridCol w:w="3249"/>
+        <w:gridCol w:w="3249"/>
+        <w:gridCol w:w="3249"/>
+      </w:tblGrid>
+      <w:tr>
+        <w:tc>
+          <w:tcPr>
+            <w:tcW w:type="dxa" w:w="3249"/>
+            <w:tcBorders>
+              <w:top w:val="nil"/>
+              <w:left w:val="nil"/>
+              <w:bottom w:val="nil"/>
+              <w:right w:val="nil"/>
+            </w:tcBorders>
+          </w:tcPr>
+          <w:p>
+            <w:pPr>
+              <w:jc w:val="center"/>
+            </w:pPr>
+            <w:r>
+              <w:drawing>
+                <wp:inline xmlns:a="http://schemas.openxmlformats.org/drawingml/2006/main" xmlns:pic="http://schemas.openxmlformats.org/drawingml/2006/picture">
+                  <wp:extent cx="1440000" cy="3200000"/>
+                  <wp:docPr id="42" name="Picture 42"/>
+                  <wp:cNvGraphicFramePr>
+                    <a:graphicFrameLocks noChangeAspect="1"/>
+                  </wp:cNvGraphicFramePr>
+                  <a:graphic>
+                    <a:graphicData uri="http://schemas.openxmlformats.org/drawingml/2006/picture">
+                      <pic:pic>
+                        <pic:nvPicPr>
+                          <pic:cNvPr id="0" name="image.jpg"/>
+                          <pic:cNvPicPr/>
+                        </pic:nvPicPr>
+                        <pic:blipFill>
+                          <a:blip r:embed="rId16"/>
+                          <a:stretch>
+                            <a:fillRect/>
+                          </a:stretch>
+                        </pic:blipFill>
+                        <pic:spPr>
+                          <a:xfrm>
+                            <a:off x="0" y="0"/>
+                            <a:ext cx="1440000" cy="3200000"/>
+                          </a:xfrm>
+                          <a:prstGeom prst="rect"/>
+                        </pic:spPr>
+                      </pic:pic>
+                    </a:graphicData>
+                  </a:graphic>
+                </wp:inline>
+              </w:drawing>
+            </w:r>
+          </w:p>
+          <w:p>
+            <w:pPr>
+              <w:jc w:val="center"/>
+            </w:pPr>
+            <w:r>
+              <w:rPr>
+                <w:rFonts w:ascii="Times New Roman" w:hAnsi="Times New Roman" w:eastAsia="Times New Roman" w:cs="Times New Roman"/>
+                <w:b w:val="0"/>
+                <w:color w:val="161616"/>
+                <w:sz w:val="16"/>
+              </w:rPr>
+              <w:t>Liste vide</w:t>
+            </w:r>
+          </w:p>
+        </w:tc>
+        <w:tc>
+          <w:tcPr>
+            <w:tcW w:type="dxa" w:w="3249"/>
+            <w:tcBorders>
+              <w:top w:val="nil"/>
+              <w:left w:val="nil"/>
+              <w:bottom w:val="nil"/>
+              <w:right w:val="nil"/>
+            </w:tcBorders>
+          </w:tcPr>
+          <w:p>
+            <w:pPr>
+              <w:jc w:val="center"/>
+            </w:pPr>
+            <w:r>
+              <w:drawing>
+                <wp:inline xmlns:a="http://schemas.openxmlformats.org/drawingml/2006/main" xmlns:pic="http://schemas.openxmlformats.org/drawingml/2006/picture">
+                  <wp:extent cx="1440000" cy="3200000"/>
+                  <wp:docPr id="43" name="Picture 43"/>
+                  <wp:cNvGraphicFramePr>
+                    <a:graphicFrameLocks noChangeAspect="1"/>
+                  </wp:cNvGraphicFramePr>
+                  <a:graphic>
+                    <a:graphicData uri="http://schemas.openxmlformats.org/drawingml/2006/picture">
+                      <pic:pic>
+                        <pic:nvPicPr>
+                          <pic:cNvPr id="0" name="image.jpg"/>
+                          <pic:cNvPicPr/>
+                        </pic:nvPicPr>
+                        <pic:blipFill>
+                          <a:blip r:embed="rId17"/>
+                          <a:stretch>
+                            <a:fillRect/>
+                          </a:stretch>
+                        </pic:blipFill>
+                        <pic:spPr>
+                          <a:xfrm>
+                            <a:off x="0" y="0"/>
+                            <a:ext cx="1440000" cy="3200000"/>
+                          </a:xfrm>
+                          <a:prstGeom prst="rect"/>
+                        </pic:spPr>
+                      </pic:pic>
+                    </a:graphicData>
+                  </a:graphic>
+                </wp:inline>
+              </w:drawing>
+            </w:r>
+          </w:p>
+          <w:p>
+            <w:pPr>
+              <w:jc w:val="center"/>
+            </w:pPr>
+            <w:r>
+              <w:rPr>
+                <w:rFonts w:ascii="Times New Roman" w:hAnsi="Times New Roman" w:eastAsia="Times New Roman" w:cs="Times New Roman"/>
+                <w:b w:val="0"/>
+                <w:color w:val="161616"/>
+                <w:sz w:val="16"/>
+              </w:rPr>
+              <w:t>Avec signalement</w:t>
+            </w:r>
+          </w:p>
+        </w:tc>
+        <w:tc>
+          <w:tcPr>
+            <w:tcW w:type="dxa" w:w="3249"/>
+            <w:tcBorders>
+              <w:top w:val="nil"/>
+              <w:left w:val="nil"/>
+              <w:bottom w:val="nil"/>
+              <w:right w:val="nil"/>
+            </w:tcBorders>
+          </w:tcPr>
+          <w:p>
+            <w:pPr>
+              <w:jc w:val="center"/>
+            </w:pPr>
+            <w:r>
+              <w:drawing>
+                <wp:inline xmlns:a="http://schemas.openxmlformats.org/drawingml/2006/main" xmlns:pic="http://schemas.openxmlformats.org/drawingml/2006/picture">
+                  <wp:extent cx="1440000" cy="3200000"/>
+                  <wp:docPr id="44" name="Picture 44"/>
+                  <wp:cNvGraphicFramePr>
+                    <a:graphicFrameLocks noChangeAspect="1"/>
+                  </wp:cNvGraphicFramePr>
+                  <a:graphic>
+                    <a:graphicData uri="http://schemas.openxmlformats.org/drawingml/2006/picture">
+                      <pic:pic>
+                        <pic:nvPicPr>
+                          <pic:cNvPr id="0" name="image.jpg"/>
+                          <pic:cNvPicPr/>
+                        </pic:nvPicPr>
+                        <pic:blipFill>
+                          <a:blip r:embed="rId18"/>
+                          <a:stretch>
+                            <a:fillRect/>
+                          </a:stretch>
+                        </pic:blipFill>
+                        <pic:spPr>
+                          <a:xfrm>
+                            <a:off x="0" y="0"/>
+                            <a:ext cx="1440000" cy="3200000"/>
+                          </a:xfrm>
+                          <a:prstGeom prst="rect"/>
+                        </pic:spPr>
+                      </pic:pic>
+                    </a:graphicData>
+                  </a:graphic>
+                </wp:inline>
+              </w:drawing>
+            </w:r>
+          </w:p>
+          <w:p>
+            <w:pPr>
+              <w:jc w:val="center"/>
+            </w:pPr>
+            <w:r>
+              <w:rPr>
+                <w:rFonts w:ascii="Times New Roman" w:hAnsi="Times New Roman" w:eastAsia="Times New Roman" w:cs="Times New Roman"/>
+                <w:b w:val="0"/>
+                <w:color w:val="161616"/>
+                <w:sz w:val="16"/>
+              </w:rPr>
+              <w:t>Filtre Vita (vide)</w:t>
+            </w:r>
+          </w:p>
+        </w:tc>
+      </w:tr>
+    </w:tbl>
+    <w:p/>
+    <w:p>
+      <w:pPr>
+        <w:pStyle w:val="Titre2"/>
+      </w:pPr>
+      <w:r>
+        <w:rPr>
+          <w:rFonts w:ascii="Times New Roman" w:hAnsi="Times New Roman" w:eastAsia="Times New Roman" w:cs="Times New Roman"/>
+          <w:b/>
+          <w:sz w:val="22"/>
+        </w:rPr>
+        <w:t>17.11. Notifications et Mon profil</w:t>
+      </w:r>
+    </w:p>
+    <w:p>
+      <w:pPr/>
+      <w:r>
+        <w:rPr>
+          <w:rFonts w:ascii="Times New Roman" w:hAnsi="Times New Roman" w:eastAsia="Times New Roman" w:cs="Times New Roman"/>
+          <w:b w:val="0"/>
+          <w:sz w:val="22"/>
+        </w:rPr>
+        <w:t>Écrans transverses hors parcours de dépôt.</w:t>
+      </w:r>
+    </w:p>
+    <w:tbl>
+      <w:tblPr>
+        <w:tblW w:type="auto" w:w="0"/>
+        <w:tblLook w:firstColumn="1" w:firstRow="1" w:lastColumn="0" w:lastRow="0" w:noHBand="0" w:noVBand="1" w:val="04A0"/>
+      </w:tblPr>
+      <w:tblGrid>
+        <w:gridCol w:w="2436"/>
+        <w:gridCol w:w="2436"/>
+        <w:gridCol w:w="2436"/>
+        <w:gridCol w:w="2436"/>
+      </w:tblGrid>
+      <w:tr>
+        <w:tc>
+          <w:tcPr>
+            <w:tcW w:type="dxa" w:w="2436"/>
+            <w:tcBorders>
+              <w:top w:val="nil"/>
+              <w:left w:val="nil"/>
+              <w:bottom w:val="nil"/>
+              <w:right w:val="nil"/>
+            </w:tcBorders>
+          </w:tcPr>
+          <w:p>
+            <w:pPr>
+              <w:jc w:val="center"/>
+            </w:pPr>
+            <w:r>
+              <w:drawing>
+                <wp:inline xmlns:a="http://schemas.openxmlformats.org/drawingml/2006/main" xmlns:pic="http://schemas.openxmlformats.org/drawingml/2006/picture">
+                  <wp:extent cx="1395000" cy="3100000"/>
+                  <wp:docPr id="45" name="Picture 45"/>
+                  <wp:cNvGraphicFramePr>
+                    <a:graphicFrameLocks noChangeAspect="1"/>
+                  </wp:cNvGraphicFramePr>
+                  <a:graphic>
+                    <a:graphicData uri="http://schemas.openxmlformats.org/drawingml/2006/picture">
+                      <pic:pic>
+                        <pic:nvPicPr>
+                          <pic:cNvPr id="0" name="image.jpg"/>
+                          <pic:cNvPicPr/>
+                        </pic:nvPicPr>
+                        <pic:blipFill>
+                          <a:blip r:embed="rId12"/>
+                          <a:stretch>
+                            <a:fillRect/>
+                          </a:stretch>
+                        </pic:blipFill>
+                        <pic:spPr>
+                          <a:xfrm>
+                            <a:off x="0" y="0"/>
+                            <a:ext cx="1395000" cy="3100000"/>
+                          </a:xfrm>
+                          <a:prstGeom prst="rect"/>
+                        </pic:spPr>
+                      </pic:pic>
+                    </a:graphicData>
+                  </a:graphic>
+                </wp:inline>
+              </w:drawing>
+            </w:r>
+          </w:p>
+          <w:p>
+            <w:pPr>
+              <w:jc w:val="center"/>
+            </w:pPr>
+            <w:r>
+              <w:rPr>
+                <w:rFonts w:ascii="Times New Roman" w:hAnsi="Times New Roman" w:eastAsia="Times New Roman" w:cs="Times New Roman"/>
+                <w:b w:val="0"/>
+                <w:color w:val="161616"/>
+                <w:sz w:val="16"/>
+              </w:rPr>
+              <w:t>Notifications</w:t>
+            </w:r>
+          </w:p>
+        </w:tc>
+        <w:tc>
+          <w:tcPr>
+            <w:tcW w:type="dxa" w:w="2436"/>
+            <w:tcBorders>
+              <w:top w:val="nil"/>
+              <w:left w:val="nil"/>
+              <w:bottom w:val="nil"/>
+              <w:right w:val="nil"/>
+            </w:tcBorders>
+          </w:tcPr>
+          <w:p>
+            <w:pPr>
+              <w:jc w:val="center"/>
+            </w:pPr>
+            <w:r>
+              <w:drawing>
+                <wp:inline xmlns:a="http://schemas.openxmlformats.org/drawingml/2006/main" xmlns:pic="http://schemas.openxmlformats.org/drawingml/2006/picture">
+                  <wp:extent cx="1395000" cy="3100000"/>
+                  <wp:docPr id="46" name="Picture 46"/>
+                  <wp:cNvGraphicFramePr>
+                    <a:graphicFrameLocks noChangeAspect="1"/>
+                  </wp:cNvGraphicFramePr>
+                  <a:graphic>
+                    <a:graphicData uri="http://schemas.openxmlformats.org/drawingml/2006/picture">
+                      <pic:pic>
+                        <pic:nvPicPr>
+                          <pic:cNvPr id="0" name="image.jpg"/>
+                          <pic:cNvPicPr/>
+                        </pic:nvPicPr>
+                        <pic:blipFill>
+                          <a:blip r:embed="rId13"/>
+                          <a:stretch>
+                            <a:fillRect/>
+                          </a:stretch>
+                        </pic:blipFill>
+                        <pic:spPr>
+                          <a:xfrm>
+                            <a:off x="0" y="0"/>
+                            <a:ext cx="1395000" cy="3100000"/>
+                          </a:xfrm>
+                          <a:prstGeom prst="rect"/>
+                        </pic:spPr>
+                      </pic:pic>
+                    </a:graphicData>
+                  </a:graphic>
+                </wp:inline>
+              </w:drawing>
+            </w:r>
+          </w:p>
+          <w:p>
+            <w:pPr>
+              <w:jc w:val="center"/>
+            </w:pPr>
+            <w:r>
+              <w:rPr>
+                <w:rFonts w:ascii="Times New Roman" w:hAnsi="Times New Roman" w:eastAsia="Times New Roman" w:cs="Times New Roman"/>
+                <w:b w:val="0"/>
+                <w:color w:val="161616"/>
+                <w:sz w:val="16"/>
+              </w:rPr>
+              <w:t>Non lues</w:t>
+            </w:r>
+          </w:p>
+        </w:tc>
+        <w:tc>
+          <w:tcPr>
+            <w:tcW w:type="dxa" w:w="2436"/>
+            <w:tcBorders>
+              <w:top w:val="nil"/>
+              <w:left w:val="nil"/>
+              <w:bottom w:val="nil"/>
+              <w:right w:val="nil"/>
+            </w:tcBorders>
+          </w:tcPr>
+          <w:p>
+            <w:pPr>
+              <w:jc w:val="center"/>
+            </w:pPr>
+            <w:r>
+              <w:drawing>
+                <wp:inline xmlns:a="http://schemas.openxmlformats.org/drawingml/2006/main" xmlns:pic="http://schemas.openxmlformats.org/drawingml/2006/picture">
+                  <wp:extent cx="1395000" cy="3100000"/>
+                  <wp:docPr id="47" name="Picture 47"/>
+                  <wp:cNvGraphicFramePr>
+                    <a:graphicFrameLocks noChangeAspect="1"/>
+                  </wp:cNvGraphicFramePr>
+                  <a:graphic>
+                    <a:graphicData uri="http://schemas.openxmlformats.org/drawingml/2006/picture">
+                      <pic:pic>
+                        <pic:nvPicPr>
+                          <pic:cNvPr id="0" name="image.jpg"/>
+                          <pic:cNvPicPr/>
+                        </pic:nvPicPr>
+                        <pic:blipFill>
+                          <a:blip r:embed="rId14"/>
+                          <a:stretch>
+                            <a:fillRect/>
+                          </a:stretch>
+                        </pic:blipFill>
+                        <pic:spPr>
+                          <a:xfrm>
+                            <a:off x="0" y="0"/>
+                            <a:ext cx="1395000" cy="3100000"/>
+                          </a:xfrm>
+                          <a:prstGeom prst="rect"/>
+                        </pic:spPr>
+                      </pic:pic>
+                    </a:graphicData>
+                  </a:graphic>
+                </wp:inline>
+              </w:drawing>
+            </w:r>
+          </w:p>
+          <w:p>
+            <w:pPr>
+              <w:jc w:val="center"/>
+            </w:pPr>
+            <w:r>
+              <w:rPr>
+                <w:rFonts w:ascii="Times New Roman" w:hAnsi="Times New Roman" w:eastAsia="Times New Roman" w:cs="Times New Roman"/>
+                <w:b w:val="0"/>
+                <w:color w:val="161616"/>
+                <w:sz w:val="16"/>
+              </w:rPr>
+              <w:t>Filtre fangatahana</w:t>
+            </w:r>
+          </w:p>
+        </w:tc>
+        <w:tc>
+          <w:tcPr>
+            <w:tcW w:type="dxa" w:w="2436"/>
+            <w:tcBorders>
+              <w:top w:val="nil"/>
+              <w:left w:val="nil"/>
+              <w:bottom w:val="nil"/>
+              <w:right w:val="nil"/>
+            </w:tcBorders>
+          </w:tcPr>
+          <w:p>
+            <w:pPr>
+              <w:jc w:val="center"/>
+            </w:pPr>
+            <w:r>
+              <w:drawing>
+                <wp:inline xmlns:a="http://schemas.openxmlformats.org/drawingml/2006/main" xmlns:pic="http://schemas.openxmlformats.org/drawingml/2006/picture">
+                  <wp:extent cx="1395000" cy="3100000"/>
+                  <wp:docPr id="48" name="Picture 48"/>
+                  <wp:cNvGraphicFramePr>
+                    <a:graphicFrameLocks noChangeAspect="1"/>
+                  </wp:cNvGraphicFramePr>
+                  <a:graphic>
+                    <a:graphicData uri="http://schemas.openxmlformats.org/drawingml/2006/picture">
+                      <pic:pic>
+                        <pic:nvPicPr>
+                          <pic:cNvPr id="0" name="image.jpg"/>
+                          <pic:cNvPicPr/>
+                        </pic:nvPicPr>
+                        <pic:blipFill>
+                          <a:blip r:embed="rId15"/>
+                          <a:stretch>
+                            <a:fillRect/>
+                          </a:stretch>
+                        </pic:blipFill>
+                        <pic:spPr>
+                          <a:xfrm>
+                            <a:off x="0" y="0"/>
+                            <a:ext cx="1395000" cy="3100000"/>
+                          </a:xfrm>
+                          <a:prstGeom prst="rect"/>
+                        </pic:spPr>
+                      </pic:pic>
+                    </a:graphicData>
+                  </a:graphic>
+                </wp:inline>
+              </w:drawing>
+            </w:r>
+          </w:p>
+          <w:p>
+            <w:pPr>
+              <w:jc w:val="center"/>
+            </w:pPr>
+            <w:r>
+              <w:rPr>
+                <w:rFonts w:ascii="Times New Roman" w:hAnsi="Times New Roman" w:eastAsia="Times New Roman" w:cs="Times New Roman"/>
+                <w:b w:val="0"/>
+                <w:color w:val="161616"/>
+                <w:sz w:val="16"/>
+              </w:rPr>
+              <w:t>Mon profil</w:t>
+            </w:r>
+          </w:p>
+        </w:tc>
+      </w:tr>
+    </w:tbl>
+    <w:p/>
+    <w:p>
+      <w:pPr>
+        <w:pStyle w:val="Titre1"/>
+      </w:pPr>
+      <w:r>
+        <w:rPr>
+          <w:rFonts w:ascii="Times New Roman" w:hAnsi="Times New Roman" w:eastAsia="Times New Roman" w:cs="Times New Roman"/>
+          <w:b/>
+          <w:sz w:val="22"/>
+        </w:rPr>
+        <w:t>18. Liens code source et APK</w:t>
       </w:r>
     </w:p>
     <w:p>
@@ -3786,9 +7377,13 @@
           <w:rFonts w:ascii="Times New Roman" w:hAnsi="Times New Roman" w:cs="Times New Roman"/>
         </w:rPr>
       </w:pPr>
-      <w:r/>
-      <w:r>
-        <w:t>18. Conclusion</w:t>
+      <w:r>
+        <w:rPr>
+          <w:rFonts w:ascii="Times New Roman" w:hAnsi="Times New Roman" w:eastAsia="Times New Roman" w:cs="Times New Roman"/>
+          <w:b/>
+          <w:sz w:val="22"/>
+        </w:rPr>
+        <w:t>19. Conclusion</w:t>
       </w:r>
     </w:p>
     <w:p>
@@ -3839,7 +7434,7 @@
           <w:b w:val="0"/>
           <w:sz w:val="22"/>
         </w:rPr>
-        <w:t>Document mis à jour le 17/09/2026 selon l’état du dépôt iray (MapLibre / OSM / packs carte hors-ligne).</w:t>
+        <w:t>Document mis à jour le 17/09/2026 selon l’état du dépôt iray (captures d’écran img/ ajoutées en section 17).</w:t>
       </w:r>
     </w:p>
     <w:sectPr>

</xml_diff>

<commit_message>
doc w screens v2
</commit_message>
<xml_diff>
--- a/doc/documentation-projet-iray.docx
+++ b/doc/documentation-projet-iray.docx
@@ -3604,6 +3604,68 @@
         </w:tc>
       </w:tr>
     </w:tbl>
+    <w:p>
+      <w:pPr/>
+    </w:p>
+    <w:p>
+      <w:pPr>
+        <w:pStyle w:val="Titre1"/>
+      </w:pPr>
+      <w:r>
+        <w:rPr>
+          <w:rFonts w:ascii="Times New Roman" w:hAnsi="Times New Roman" w:eastAsia="Times New Roman" w:cs="Times New Roman"/>
+          <w:b/>
+          <w:sz w:val="22"/>
+        </w:rPr>
+        <w:t>17. Captures d’écran</w:t>
+      </w:r>
+    </w:p>
+    <w:p>
+      <w:pPr/>
+      <w:r>
+        <w:rPr>
+          <w:rFonts w:ascii="Times New Roman" w:hAnsi="Times New Roman" w:eastAsia="Times New Roman" w:cs="Times New Roman"/>
+          <w:b w:val="0"/>
+          <w:sz w:val="22"/>
+        </w:rPr>
+        <w:t>Cette section regroupe les captures d’écran de l’application citoyenne Iray (dossier img/). Elles illustrent les parcours décrits en section 4.</w:t>
+      </w:r>
+    </w:p>
+    <w:p>
+      <w:pPr/>
+      <w:r>
+        <w:rPr>
+          <w:rFonts w:ascii="Times New Roman" w:hAnsi="Times New Roman" w:eastAsia="Times New Roman" w:cs="Times New Roman"/>
+          <w:b w:val="0"/>
+          <w:sz w:val="22"/>
+        </w:rPr>
+        <w:t>Lecture : dans chaque rubrique, les captures d’une même phase sont assemblées sur une seule ligne (de gauche à droite = ordre des étapes). Une nouvelle ligne = autre phase du même parcours, ou autre état.</w:t>
+      </w:r>
+    </w:p>
+    <w:p>
+      <w:pPr>
+        <w:pStyle w:val="Titre2"/>
+      </w:pPr>
+      <w:r>
+        <w:rPr>
+          <w:rFonts w:ascii="Times New Roman" w:hAnsi="Times New Roman" w:eastAsia="Times New Roman" w:cs="Times New Roman"/>
+          <w:b/>
+          <w:sz w:val="22"/>
+        </w:rPr>
+        <w:t>17.1. Lancement et accueil</w:t>
+      </w:r>
+    </w:p>
+    <w:p>
+      <w:pPr/>
+      <w:r>
+        <w:rPr>
+          <w:rFonts w:ascii="Times New Roman" w:hAnsi="Times New Roman" w:eastAsia="Times New Roman" w:cs="Times New Roman"/>
+          <w:b w:val="0"/>
+          <w:sz w:val="22"/>
+        </w:rPr>
+        <w:t>Liste des applications, puis écran de chargement, onboarding, et accueil.</w:t>
+      </w:r>
+    </w:p>
     <w:tbl>
       <w:tblPr>
         <w:tblW w:type="auto" w:w="0"/>
@@ -3634,7 +3696,7 @@
               <w:drawing>
                 <wp:inline xmlns:a="http://schemas.openxmlformats.org/drawingml/2006/main" xmlns:pic="http://schemas.openxmlformats.org/drawingml/2006/picture">
                   <wp:extent cx="1395000" cy="3100000"/>
-                  <wp:docPr id="1" name="Picture 1"/>
+                  <wp:docPr id="6" name="Picture 6"/>
                   <wp:cNvGraphicFramePr>
                     <a:graphicFrameLocks noChangeAspect="1"/>
                   </wp:cNvGraphicFramePr>
@@ -3642,11 +3704,11 @@
                     <a:graphicData uri="http://schemas.openxmlformats.org/drawingml/2006/picture">
                       <pic:pic>
                         <pic:nvPicPr>
-                          <pic:cNvPr id="0" name="notifications-liste.jpg"/>
+                          <pic:cNvPr id="0" name="image.jpg"/>
                           <pic:cNvPicPr/>
                         </pic:nvPicPr>
                         <pic:blipFill>
-                          <a:blip r:embed="rId12"/>
+                          <a:blip r:embed="rId53"/>
                           <a:stretch>
                             <a:fillRect/>
                           </a:stretch>
@@ -3676,289 +3738,10 @@
                 <w:color w:val="161616"/>
                 <w:sz w:val="16"/>
               </w:rPr>
-              <w:t>Notifications</w:t>
+              <w:t>1. Liste des applications</w:t>
             </w:r>
           </w:p>
         </w:tc>
-        <w:tc>
-          <w:tcPr>
-            <w:tcW w:type="dxa" w:w="2436"/>
-            <w:tcBorders>
-              <w:top w:val="nil"/>
-              <w:left w:val="nil"/>
-              <w:bottom w:val="nil"/>
-              <w:right w:val="nil"/>
-            </w:tcBorders>
-          </w:tcPr>
-          <w:p>
-            <w:pPr>
-              <w:jc w:val="center"/>
-            </w:pPr>
-            <w:r>
-              <w:drawing>
-                <wp:inline xmlns:a="http://schemas.openxmlformats.org/drawingml/2006/main" xmlns:pic="http://schemas.openxmlformats.org/drawingml/2006/picture">
-                  <wp:extent cx="1395000" cy="3100000"/>
-                  <wp:docPr id="2" name="Picture 2"/>
-                  <wp:cNvGraphicFramePr>
-                    <a:graphicFrameLocks noChangeAspect="1"/>
-                  </wp:cNvGraphicFramePr>
-                  <a:graphic>
-                    <a:graphicData uri="http://schemas.openxmlformats.org/drawingml/2006/picture">
-                      <pic:pic>
-                        <pic:nvPicPr>
-                          <pic:cNvPr id="0" name="notifications-filtre-non-lues.jpg"/>
-                          <pic:cNvPicPr/>
-                        </pic:nvPicPr>
-                        <pic:blipFill>
-                          <a:blip r:embed="rId13"/>
-                          <a:stretch>
-                            <a:fillRect/>
-                          </a:stretch>
-                        </pic:blipFill>
-                        <pic:spPr>
-                          <a:xfrm>
-                            <a:off x="0" y="0"/>
-                            <a:ext cx="1395000" cy="3100000"/>
-                          </a:xfrm>
-                          <a:prstGeom prst="rect"/>
-                        </pic:spPr>
-                      </pic:pic>
-                    </a:graphicData>
-                  </a:graphic>
-                </wp:inline>
-              </w:drawing>
-            </w:r>
-          </w:p>
-          <w:p>
-            <w:pPr>
-              <w:jc w:val="center"/>
-            </w:pPr>
-            <w:r>
-              <w:rPr>
-                <w:rFonts w:ascii="Times New Roman" w:hAnsi="Times New Roman" w:eastAsia="Times New Roman" w:cs="Times New Roman"/>
-                <w:b w:val="0"/>
-                <w:color w:val="161616"/>
-                <w:sz w:val="16"/>
-              </w:rPr>
-              <w:t>Non lues</w:t>
-            </w:r>
-          </w:p>
-        </w:tc>
-        <w:tc>
-          <w:tcPr>
-            <w:tcW w:type="dxa" w:w="2436"/>
-            <w:tcBorders>
-              <w:top w:val="nil"/>
-              <w:left w:val="nil"/>
-              <w:bottom w:val="nil"/>
-              <w:right w:val="nil"/>
-            </w:tcBorders>
-          </w:tcPr>
-          <w:p>
-            <w:pPr>
-              <w:jc w:val="center"/>
-            </w:pPr>
-            <w:r>
-              <w:drawing>
-                <wp:inline xmlns:a="http://schemas.openxmlformats.org/drawingml/2006/main" xmlns:pic="http://schemas.openxmlformats.org/drawingml/2006/picture">
-                  <wp:extent cx="1395000" cy="3100000"/>
-                  <wp:docPr id="3" name="Picture 3"/>
-                  <wp:cNvGraphicFramePr>
-                    <a:graphicFrameLocks noChangeAspect="1"/>
-                  </wp:cNvGraphicFramePr>
-                  <a:graphic>
-                    <a:graphicData uri="http://schemas.openxmlformats.org/drawingml/2006/picture">
-                      <pic:pic>
-                        <pic:nvPicPr>
-                          <pic:cNvPr id="0" name="notifications-filtre-fangatahana.jpg"/>
-                          <pic:cNvPicPr/>
-                        </pic:nvPicPr>
-                        <pic:blipFill>
-                          <a:blip r:embed="rId14"/>
-                          <a:stretch>
-                            <a:fillRect/>
-                          </a:stretch>
-                        </pic:blipFill>
-                        <pic:spPr>
-                          <a:xfrm>
-                            <a:off x="0" y="0"/>
-                            <a:ext cx="1395000" cy="3100000"/>
-                          </a:xfrm>
-                          <a:prstGeom prst="rect"/>
-                        </pic:spPr>
-                      </pic:pic>
-                    </a:graphicData>
-                  </a:graphic>
-                </wp:inline>
-              </w:drawing>
-            </w:r>
-          </w:p>
-          <w:p>
-            <w:pPr>
-              <w:jc w:val="center"/>
-            </w:pPr>
-            <w:r>
-              <w:rPr>
-                <w:rFonts w:ascii="Times New Roman" w:hAnsi="Times New Roman" w:eastAsia="Times New Roman" w:cs="Times New Roman"/>
-                <w:b w:val="0"/>
-                <w:color w:val="161616"/>
-                <w:sz w:val="16"/>
-              </w:rPr>
-              <w:t>Filtre fangatahana</w:t>
-            </w:r>
-          </w:p>
-        </w:tc>
-        <w:tc>
-          <w:tcPr>
-            <w:tcW w:type="dxa" w:w="2436"/>
-            <w:tcBorders>
-              <w:top w:val="nil"/>
-              <w:left w:val="nil"/>
-              <w:bottom w:val="nil"/>
-              <w:right w:val="nil"/>
-            </w:tcBorders>
-          </w:tcPr>
-          <w:p>
-            <w:pPr>
-              <w:jc w:val="center"/>
-            </w:pPr>
-            <w:r>
-              <w:drawing>
-                <wp:inline xmlns:a="http://schemas.openxmlformats.org/drawingml/2006/main" xmlns:pic="http://schemas.openxmlformats.org/drawingml/2006/picture">
-                  <wp:extent cx="1395000" cy="3100000"/>
-                  <wp:docPr id="4" name="Picture 4"/>
-                  <wp:cNvGraphicFramePr>
-                    <a:graphicFrameLocks noChangeAspect="1"/>
-                  </wp:cNvGraphicFramePr>
-                  <a:graphic>
-                    <a:graphicData uri="http://schemas.openxmlformats.org/drawingml/2006/picture">
-                      <pic:pic>
-                        <pic:nvPicPr>
-                          <pic:cNvPr id="0" name="mon-profil.jpg"/>
-                          <pic:cNvPicPr/>
-                        </pic:nvPicPr>
-                        <pic:blipFill>
-                          <a:blip r:embed="rId15"/>
-                          <a:stretch>
-                            <a:fillRect/>
-                          </a:stretch>
-                        </pic:blipFill>
-                        <pic:spPr>
-                          <a:xfrm>
-                            <a:off x="0" y="0"/>
-                            <a:ext cx="1395000" cy="3100000"/>
-                          </a:xfrm>
-                          <a:prstGeom prst="rect"/>
-                        </pic:spPr>
-                      </pic:pic>
-                    </a:graphicData>
-                  </a:graphic>
-                </wp:inline>
-              </w:drawing>
-            </w:r>
-          </w:p>
-          <w:p>
-            <w:pPr>
-              <w:jc w:val="center"/>
-            </w:pPr>
-            <w:r>
-              <w:rPr>
-                <w:rFonts w:ascii="Times New Roman" w:hAnsi="Times New Roman" w:eastAsia="Times New Roman" w:cs="Times New Roman"/>
-                <w:b w:val="0"/>
-                <w:color w:val="161616"/>
-                <w:sz w:val="16"/>
-              </w:rPr>
-              <w:t>Mon profil</w:t>
-            </w:r>
-          </w:p>
-        </w:tc>
-      </w:tr>
-    </w:tbl>
-    <w:p>
-      <w:pPr/>
-    </w:p>
-    <w:p>
-      <w:pPr/>
-      <w:r>
-        <w:rPr>
-          <w:rFonts w:ascii="Times New Roman" w:hAnsi="Times New Roman" w:eastAsia="Times New Roman" w:cs="Times New Roman"/>
-          <w:b w:val="0"/>
-          <w:sz w:val="22"/>
-        </w:rPr>
-        <w:t>Écrans transverses hors parcours de dépôt.</w:t>
-      </w:r>
-    </w:p>
-    <w:p>
-      <w:pPr>
-        <w:pStyle w:val="Titre1"/>
-      </w:pPr>
-      <w:r>
-        <w:rPr>
-          <w:rFonts w:ascii="Times New Roman" w:hAnsi="Times New Roman" w:eastAsia="Times New Roman" w:cs="Times New Roman"/>
-          <w:b/>
-          <w:sz w:val="22"/>
-        </w:rPr>
-        <w:t>17. Captures d’écran</w:t>
-      </w:r>
-    </w:p>
-    <w:p>
-      <w:pPr/>
-      <w:r>
-        <w:rPr>
-          <w:rFonts w:ascii="Times New Roman" w:hAnsi="Times New Roman" w:eastAsia="Times New Roman" w:cs="Times New Roman"/>
-          <w:b w:val="0"/>
-          <w:sz w:val="22"/>
-        </w:rPr>
-        <w:t>Cette section regroupe les captures d’écran de l’application citoyenne Iray (dossier img/). Elles illustrent les parcours décrits en section 4.</w:t>
-      </w:r>
-    </w:p>
-    <w:p>
-      <w:pPr/>
-      <w:r>
-        <w:rPr>
-          <w:rFonts w:ascii="Times New Roman" w:hAnsi="Times New Roman" w:eastAsia="Times New Roman" w:cs="Times New Roman"/>
-          <w:b w:val="0"/>
-          <w:sz w:val="22"/>
-        </w:rPr>
-        <w:t>Lecture : dans chaque rubrique, les captures d’une même phase sont assemblées sur une seule ligne (de gauche à droite = ordre des étapes). Une nouvelle ligne = autre phase du même parcours, ou autre état.</w:t>
-      </w:r>
-    </w:p>
-    <w:p>
-      <w:pPr>
-        <w:pStyle w:val="Titre2"/>
-      </w:pPr>
-      <w:r>
-        <w:rPr>
-          <w:rFonts w:ascii="Times New Roman" w:hAnsi="Times New Roman" w:eastAsia="Times New Roman" w:cs="Times New Roman"/>
-          <w:b/>
-          <w:sz w:val="22"/>
-        </w:rPr>
-        <w:t>17.1. Lancement et accueil</w:t>
-      </w:r>
-    </w:p>
-    <w:p>
-      <w:pPr/>
-      <w:r>
-        <w:rPr>
-          <w:rFonts w:ascii="Times New Roman" w:hAnsi="Times New Roman" w:eastAsia="Times New Roman" w:cs="Times New Roman"/>
-          <w:b w:val="0"/>
-          <w:sz w:val="22"/>
-        </w:rPr>
-        <w:t>Ouverture de l’application jusqu’à l’écran d’accueil.</w:t>
-      </w:r>
-    </w:p>
-    <w:tbl>
-      <w:tblPr>
-        <w:tblW w:type="auto" w:w="0"/>
-        <w:tblLook w:firstColumn="1" w:firstRow="1" w:lastColumn="0" w:lastRow="0" w:noHBand="0" w:noVBand="1" w:val="04A0"/>
-      </w:tblPr>
-      <w:tblGrid>
-        <w:gridCol w:w="2436"/>
-        <w:gridCol w:w="2436"/>
-        <w:gridCol w:w="2436"/>
-        <w:gridCol w:w="2436"/>
-      </w:tblGrid>
-      <w:tr>
         <w:tc>
           <w:tcPr>
             <w:tcW w:type="dxa" w:w="2436"/>
@@ -4019,71 +3802,7 @@
                 <w:color w:val="161616"/>
                 <w:sz w:val="16"/>
               </w:rPr>
-              <w:t>Splash</w:t>
-            </w:r>
-          </w:p>
-        </w:tc>
-        <w:tc>
-          <w:tcPr>
-            <w:tcW w:type="dxa" w:w="2436"/>
-            <w:tcBorders>
-              <w:top w:val="nil"/>
-              <w:left w:val="nil"/>
-              <w:bottom w:val="nil"/>
-              <w:right w:val="nil"/>
-            </w:tcBorders>
-          </w:tcPr>
-          <w:p>
-            <w:pPr>
-              <w:jc w:val="center"/>
-            </w:pPr>
-            <w:r>
-              <w:drawing>
-                <wp:inline xmlns:a="http://schemas.openxmlformats.org/drawingml/2006/main" xmlns:pic="http://schemas.openxmlformats.org/drawingml/2006/picture">
-                  <wp:extent cx="1395000" cy="3100000"/>
-                  <wp:docPr id="6" name="Picture 6"/>
-                  <wp:cNvGraphicFramePr>
-                    <a:graphicFrameLocks noChangeAspect="1"/>
-                  </wp:cNvGraphicFramePr>
-                  <a:graphic>
-                    <a:graphicData uri="http://schemas.openxmlformats.org/drawingml/2006/picture">
-                      <pic:pic>
-                        <pic:nvPicPr>
-                          <pic:cNvPr id="0" name="image.jpg"/>
-                          <pic:cNvPicPr/>
-                        </pic:nvPicPr>
-                        <pic:blipFill>
-                          <a:blip r:embed="rId53"/>
-                          <a:stretch>
-                            <a:fillRect/>
-                          </a:stretch>
-                        </pic:blipFill>
-                        <pic:spPr>
-                          <a:xfrm>
-                            <a:off x="0" y="0"/>
-                            <a:ext cx="1395000" cy="3100000"/>
-                          </a:xfrm>
-                          <a:prstGeom prst="rect"/>
-                        </pic:spPr>
-                      </pic:pic>
-                    </a:graphicData>
-                  </a:graphic>
-                </wp:inline>
-              </w:drawing>
-            </w:r>
-          </w:p>
-          <w:p>
-            <w:pPr>
-              <w:jc w:val="center"/>
-            </w:pPr>
-            <w:r>
-              <w:rPr>
-                <w:rFonts w:ascii="Times New Roman" w:hAnsi="Times New Roman" w:eastAsia="Times New Roman" w:cs="Times New Roman"/>
-                <w:b w:val="0"/>
-                <w:color w:val="161616"/>
-                <w:sz w:val="16"/>
-              </w:rPr>
-              <w:t>Icône Iray</w:t>
+              <w:t>2. Chargement</w:t>
             </w:r>
           </w:p>
         </w:tc>
@@ -4147,7 +3866,7 @@
                 <w:color w:val="161616"/>
                 <w:sz w:val="16"/>
               </w:rPr>
-              <w:t>Onboarding</w:t>
+              <w:t>3. Onboarding</w:t>
             </w:r>
           </w:p>
         </w:tc>
@@ -4211,7 +3930,7 @@
                 <w:color w:val="161616"/>
                 <w:sz w:val="16"/>
               </w:rPr>
-              <w:t>Welcome</w:t>
+              <w:t>4. Welcome</w:t>
             </w:r>
           </w:p>
         </w:tc>
@@ -4959,7 +4678,237 @@
           <w:b/>
           <w:sz w:val="22"/>
         </w:rPr>
-        <w:t>17.4. Fangatahana — catalogue et filtres</w:t>
+        <w:t>17.4. Notifications</w:t>
+      </w:r>
+    </w:p>
+    <w:p>
+      <w:pPr/>
+      <w:r>
+        <w:rPr>
+          <w:rFonts w:ascii="Times New Roman" w:hAnsi="Times New Roman" w:eastAsia="Times New Roman" w:cs="Times New Roman"/>
+          <w:b w:val="0"/>
+          <w:sz w:val="22"/>
+        </w:rPr>
+        <w:t>Depuis l’accueil, la cloche ouvre les notifications. Filtres Rehetra, non lues, fangatahana.</w:t>
+      </w:r>
+    </w:p>
+    <w:tbl>
+      <w:tblPr>
+        <w:tblW w:type="auto" w:w="0"/>
+        <w:tblLook w:firstColumn="1" w:firstRow="1" w:lastColumn="0" w:lastRow="0" w:noHBand="0" w:noVBand="1" w:val="04A0"/>
+      </w:tblPr>
+      <w:tblGrid>
+        <w:gridCol w:w="2436"/>
+        <w:gridCol w:w="2436"/>
+        <w:gridCol w:w="2436"/>
+      </w:tblGrid>
+      <w:tr>
+        <w:tc>
+          <w:tcPr>
+            <w:tcW w:type="dxa" w:w="2436"/>
+            <w:tcBorders>
+              <w:top w:val="nil"/>
+              <w:left w:val="nil"/>
+              <w:bottom w:val="nil"/>
+              <w:right w:val="nil"/>
+            </w:tcBorders>
+          </w:tcPr>
+          <w:p>
+            <w:pPr>
+              <w:jc w:val="center"/>
+            </w:pPr>
+            <w:r>
+              <w:drawing>
+                <wp:inline xmlns:a="http://schemas.openxmlformats.org/drawingml/2006/main" xmlns:pic="http://schemas.openxmlformats.org/drawingml/2006/picture">
+                  <wp:extent cx="1395000" cy="3100000"/>
+                  <wp:docPr id="45" name="Picture 45"/>
+                  <wp:cNvGraphicFramePr>
+                    <a:graphicFrameLocks noChangeAspect="1"/>
+                  </wp:cNvGraphicFramePr>
+                  <a:graphic>
+                    <a:graphicData uri="http://schemas.openxmlformats.org/drawingml/2006/picture">
+                      <pic:pic>
+                        <pic:nvPicPr>
+                          <pic:cNvPr id="0" name="image.jpg"/>
+                          <pic:cNvPicPr/>
+                        </pic:nvPicPr>
+                        <pic:blipFill>
+                          <a:blip r:embed="rId12"/>
+                          <a:stretch>
+                            <a:fillRect/>
+                          </a:stretch>
+                        </pic:blipFill>
+                        <pic:spPr>
+                          <a:xfrm>
+                            <a:off x="0" y="0"/>
+                            <a:ext cx="1395000" cy="3100000"/>
+                          </a:xfrm>
+                          <a:prstGeom prst="rect"/>
+                        </pic:spPr>
+                      </pic:pic>
+                    </a:graphicData>
+                  </a:graphic>
+                </wp:inline>
+              </w:drawing>
+            </w:r>
+          </w:p>
+          <w:p>
+            <w:pPr>
+              <w:jc w:val="center"/>
+            </w:pPr>
+            <w:r>
+              <w:rPr>
+                <w:rFonts w:ascii="Times New Roman" w:hAnsi="Times New Roman" w:eastAsia="Times New Roman" w:cs="Times New Roman"/>
+                <w:b w:val="0"/>
+                <w:color w:val="161616"/>
+                <w:sz w:val="16"/>
+              </w:rPr>
+              <w:t>Notifications</w:t>
+            </w:r>
+          </w:p>
+        </w:tc>
+        <w:tc>
+          <w:tcPr>
+            <w:tcW w:type="dxa" w:w="2436"/>
+            <w:tcBorders>
+              <w:top w:val="nil"/>
+              <w:left w:val="nil"/>
+              <w:bottom w:val="nil"/>
+              <w:right w:val="nil"/>
+            </w:tcBorders>
+          </w:tcPr>
+          <w:p>
+            <w:pPr>
+              <w:jc w:val="center"/>
+            </w:pPr>
+            <w:r>
+              <w:drawing>
+                <wp:inline xmlns:a="http://schemas.openxmlformats.org/drawingml/2006/main" xmlns:pic="http://schemas.openxmlformats.org/drawingml/2006/picture">
+                  <wp:extent cx="1395000" cy="3100000"/>
+                  <wp:docPr id="46" name="Picture 46"/>
+                  <wp:cNvGraphicFramePr>
+                    <a:graphicFrameLocks noChangeAspect="1"/>
+                  </wp:cNvGraphicFramePr>
+                  <a:graphic>
+                    <a:graphicData uri="http://schemas.openxmlformats.org/drawingml/2006/picture">
+                      <pic:pic>
+                        <pic:nvPicPr>
+                          <pic:cNvPr id="0" name="image.jpg"/>
+                          <pic:cNvPicPr/>
+                        </pic:nvPicPr>
+                        <pic:blipFill>
+                          <a:blip r:embed="rId13"/>
+                          <a:stretch>
+                            <a:fillRect/>
+                          </a:stretch>
+                        </pic:blipFill>
+                        <pic:spPr>
+                          <a:xfrm>
+                            <a:off x="0" y="0"/>
+                            <a:ext cx="1395000" cy="3100000"/>
+                          </a:xfrm>
+                          <a:prstGeom prst="rect"/>
+                        </pic:spPr>
+                      </pic:pic>
+                    </a:graphicData>
+                  </a:graphic>
+                </wp:inline>
+              </w:drawing>
+            </w:r>
+          </w:p>
+          <w:p>
+            <w:pPr>
+              <w:jc w:val="center"/>
+            </w:pPr>
+            <w:r>
+              <w:rPr>
+                <w:rFonts w:ascii="Times New Roman" w:hAnsi="Times New Roman" w:eastAsia="Times New Roman" w:cs="Times New Roman"/>
+                <w:b w:val="0"/>
+                <w:color w:val="161616"/>
+                <w:sz w:val="16"/>
+              </w:rPr>
+              <w:t>Non lues</w:t>
+            </w:r>
+          </w:p>
+        </w:tc>
+        <w:tc>
+          <w:tcPr>
+            <w:tcW w:type="dxa" w:w="2436"/>
+            <w:tcBorders>
+              <w:top w:val="nil"/>
+              <w:left w:val="nil"/>
+              <w:bottom w:val="nil"/>
+              <w:right w:val="nil"/>
+            </w:tcBorders>
+          </w:tcPr>
+          <w:p>
+            <w:pPr>
+              <w:jc w:val="center"/>
+            </w:pPr>
+            <w:r>
+              <w:drawing>
+                <wp:inline xmlns:a="http://schemas.openxmlformats.org/drawingml/2006/main" xmlns:pic="http://schemas.openxmlformats.org/drawingml/2006/picture">
+                  <wp:extent cx="1395000" cy="3100000"/>
+                  <wp:docPr id="47" name="Picture 47"/>
+                  <wp:cNvGraphicFramePr>
+                    <a:graphicFrameLocks noChangeAspect="1"/>
+                  </wp:cNvGraphicFramePr>
+                  <a:graphic>
+                    <a:graphicData uri="http://schemas.openxmlformats.org/drawingml/2006/picture">
+                      <pic:pic>
+                        <pic:nvPicPr>
+                          <pic:cNvPr id="0" name="image.jpg"/>
+                          <pic:cNvPicPr/>
+                        </pic:nvPicPr>
+                        <pic:blipFill>
+                          <a:blip r:embed="rId14"/>
+                          <a:stretch>
+                            <a:fillRect/>
+                          </a:stretch>
+                        </pic:blipFill>
+                        <pic:spPr>
+                          <a:xfrm>
+                            <a:off x="0" y="0"/>
+                            <a:ext cx="1395000" cy="3100000"/>
+                          </a:xfrm>
+                          <a:prstGeom prst="rect"/>
+                        </pic:spPr>
+                      </pic:pic>
+                    </a:graphicData>
+                  </a:graphic>
+                </wp:inline>
+              </w:drawing>
+            </w:r>
+          </w:p>
+          <w:p>
+            <w:pPr>
+              <w:jc w:val="center"/>
+            </w:pPr>
+            <w:r>
+              <w:rPr>
+                <w:rFonts w:ascii="Times New Roman" w:hAnsi="Times New Roman" w:eastAsia="Times New Roman" w:cs="Times New Roman"/>
+                <w:b w:val="0"/>
+                <w:color w:val="161616"/>
+                <w:sz w:val="16"/>
+              </w:rPr>
+              <w:t>Filtre fangatahana</w:t>
+            </w:r>
+          </w:p>
+        </w:tc>
+      </w:tr>
+    </w:tbl>
+    <w:p/>
+    <w:p>
+      <w:pPr>
+        <w:pStyle w:val="Titre2"/>
+      </w:pPr>
+      <w:r>
+        <w:rPr>
+          <w:rFonts w:ascii="Times New Roman" w:hAnsi="Times New Roman" w:eastAsia="Times New Roman" w:cs="Times New Roman"/>
+          <w:b/>
+          <w:sz w:val="22"/>
+        </w:rPr>
+        <w:t>17.5. Fangatahana — catalogue et filtres</w:t>
       </w:r>
     </w:p>
     <w:p>
@@ -5254,7 +5203,7 @@
           <w:b/>
           <w:sz w:val="22"/>
         </w:rPr>
-        <w:t>17.5. Fangatahana — dépôt d’une demande</w:t>
+        <w:t>17.6. Fangatahana — dépôt d’une demande</w:t>
       </w:r>
     </w:p>
     <w:p>
@@ -5755,7 +5704,7 @@
           <w:b/>
           <w:sz w:val="22"/>
         </w:rPr>
-        <w:t>17.6. Mes démarches (Ny fangatahana)</w:t>
+        <w:t>17.7. Mes démarches (Ny fangatahana)</w:t>
       </w:r>
     </w:p>
     <w:p>
@@ -5920,7 +5869,7 @@
           <w:b/>
           <w:sz w:val="22"/>
         </w:rPr>
-        <w:t>17.7. Tatitra — catégories</w:t>
+        <w:t>17.8. Tatitra — catégories</w:t>
       </w:r>
     </w:p>
     <w:p>
@@ -6150,7 +6099,7 @@
           <w:b/>
           <w:sz w:val="22"/>
         </w:rPr>
-        <w:t>17.8. Tatitra — Toerana (carte et GPS)</w:t>
+        <w:t>17.9. Tatitra — Toerana (carte et GPS)</w:t>
       </w:r>
     </w:p>
     <w:p>
@@ -6445,7 +6394,7 @@
           <w:b/>
           <w:sz w:val="22"/>
         </w:rPr>
-        <w:t>17.9. Tatitra — détails, envoi et succès</w:t>
+        <w:t>17.10. Tatitra — détails, envoi et succès</w:t>
       </w:r>
     </w:p>
     <w:p>
@@ -6675,7 +6624,7 @@
           <w:b/>
           <w:sz w:val="22"/>
         </w:rPr>
-        <w:t>17.10. Mes signalements (Ny tatitra)</w:t>
+        <w:t>17.11. Mes signalements (Ny tatitra)</w:t>
       </w:r>
     </w:p>
     <w:p>
@@ -6905,7 +6854,7 @@
           <w:b/>
           <w:sz w:val="22"/>
         </w:rPr>
-        <w:t>17.11. Notifications et Mon profil</w:t>
+        <w:t>17.12. Mon profil</w:t>
       </w:r>
     </w:p>
     <w:p>
@@ -6916,7 +6865,7 @@
           <w:b w:val="0"/>
           <w:sz w:val="22"/>
         </w:rPr>
-        <w:t>Écrans transverses hors parcours de dépôt.</w:t>
+        <w:t>Consultation du profil une fois l’identité et le faritra renseignés.</w:t>
       </w:r>
     </w:p>
     <w:tbl>
@@ -6926,203 +6875,8 @@
       </w:tblPr>
       <w:tblGrid>
         <w:gridCol w:w="2436"/>
-        <w:gridCol w:w="2436"/>
-        <w:gridCol w:w="2436"/>
-        <w:gridCol w:w="2436"/>
       </w:tblGrid>
       <w:tr>
-        <w:tc>
-          <w:tcPr>
-            <w:tcW w:type="dxa" w:w="2436"/>
-            <w:tcBorders>
-              <w:top w:val="nil"/>
-              <w:left w:val="nil"/>
-              <w:bottom w:val="nil"/>
-              <w:right w:val="nil"/>
-            </w:tcBorders>
-          </w:tcPr>
-          <w:p>
-            <w:pPr>
-              <w:jc w:val="center"/>
-            </w:pPr>
-            <w:r>
-              <w:drawing>
-                <wp:inline xmlns:a="http://schemas.openxmlformats.org/drawingml/2006/main" xmlns:pic="http://schemas.openxmlformats.org/drawingml/2006/picture">
-                  <wp:extent cx="1395000" cy="3100000"/>
-                  <wp:docPr id="45" name="Picture 45"/>
-                  <wp:cNvGraphicFramePr>
-                    <a:graphicFrameLocks noChangeAspect="1"/>
-                  </wp:cNvGraphicFramePr>
-                  <a:graphic>
-                    <a:graphicData uri="http://schemas.openxmlformats.org/drawingml/2006/picture">
-                      <pic:pic>
-                        <pic:nvPicPr>
-                          <pic:cNvPr id="0" name="image.jpg"/>
-                          <pic:cNvPicPr/>
-                        </pic:nvPicPr>
-                        <pic:blipFill>
-                          <a:blip r:embed="rId12"/>
-                          <a:stretch>
-                            <a:fillRect/>
-                          </a:stretch>
-                        </pic:blipFill>
-                        <pic:spPr>
-                          <a:xfrm>
-                            <a:off x="0" y="0"/>
-                            <a:ext cx="1395000" cy="3100000"/>
-                          </a:xfrm>
-                          <a:prstGeom prst="rect"/>
-                        </pic:spPr>
-                      </pic:pic>
-                    </a:graphicData>
-                  </a:graphic>
-                </wp:inline>
-              </w:drawing>
-            </w:r>
-          </w:p>
-          <w:p>
-            <w:pPr>
-              <w:jc w:val="center"/>
-            </w:pPr>
-            <w:r>
-              <w:rPr>
-                <w:rFonts w:ascii="Times New Roman" w:hAnsi="Times New Roman" w:eastAsia="Times New Roman" w:cs="Times New Roman"/>
-                <w:b w:val="0"/>
-                <w:color w:val="161616"/>
-                <w:sz w:val="16"/>
-              </w:rPr>
-              <w:t>Notifications</w:t>
-            </w:r>
-          </w:p>
-        </w:tc>
-        <w:tc>
-          <w:tcPr>
-            <w:tcW w:type="dxa" w:w="2436"/>
-            <w:tcBorders>
-              <w:top w:val="nil"/>
-              <w:left w:val="nil"/>
-              <w:bottom w:val="nil"/>
-              <w:right w:val="nil"/>
-            </w:tcBorders>
-          </w:tcPr>
-          <w:p>
-            <w:pPr>
-              <w:jc w:val="center"/>
-            </w:pPr>
-            <w:r>
-              <w:drawing>
-                <wp:inline xmlns:a="http://schemas.openxmlformats.org/drawingml/2006/main" xmlns:pic="http://schemas.openxmlformats.org/drawingml/2006/picture">
-                  <wp:extent cx="1395000" cy="3100000"/>
-                  <wp:docPr id="46" name="Picture 46"/>
-                  <wp:cNvGraphicFramePr>
-                    <a:graphicFrameLocks noChangeAspect="1"/>
-                  </wp:cNvGraphicFramePr>
-                  <a:graphic>
-                    <a:graphicData uri="http://schemas.openxmlformats.org/drawingml/2006/picture">
-                      <pic:pic>
-                        <pic:nvPicPr>
-                          <pic:cNvPr id="0" name="image.jpg"/>
-                          <pic:cNvPicPr/>
-                        </pic:nvPicPr>
-                        <pic:blipFill>
-                          <a:blip r:embed="rId13"/>
-                          <a:stretch>
-                            <a:fillRect/>
-                          </a:stretch>
-                        </pic:blipFill>
-                        <pic:spPr>
-                          <a:xfrm>
-                            <a:off x="0" y="0"/>
-                            <a:ext cx="1395000" cy="3100000"/>
-                          </a:xfrm>
-                          <a:prstGeom prst="rect"/>
-                        </pic:spPr>
-                      </pic:pic>
-                    </a:graphicData>
-                  </a:graphic>
-                </wp:inline>
-              </w:drawing>
-            </w:r>
-          </w:p>
-          <w:p>
-            <w:pPr>
-              <w:jc w:val="center"/>
-            </w:pPr>
-            <w:r>
-              <w:rPr>
-                <w:rFonts w:ascii="Times New Roman" w:hAnsi="Times New Roman" w:eastAsia="Times New Roman" w:cs="Times New Roman"/>
-                <w:b w:val="0"/>
-                <w:color w:val="161616"/>
-                <w:sz w:val="16"/>
-              </w:rPr>
-              <w:t>Non lues</w:t>
-            </w:r>
-          </w:p>
-        </w:tc>
-        <w:tc>
-          <w:tcPr>
-            <w:tcW w:type="dxa" w:w="2436"/>
-            <w:tcBorders>
-              <w:top w:val="nil"/>
-              <w:left w:val="nil"/>
-              <w:bottom w:val="nil"/>
-              <w:right w:val="nil"/>
-            </w:tcBorders>
-          </w:tcPr>
-          <w:p>
-            <w:pPr>
-              <w:jc w:val="center"/>
-            </w:pPr>
-            <w:r>
-              <w:drawing>
-                <wp:inline xmlns:a="http://schemas.openxmlformats.org/drawingml/2006/main" xmlns:pic="http://schemas.openxmlformats.org/drawingml/2006/picture">
-                  <wp:extent cx="1395000" cy="3100000"/>
-                  <wp:docPr id="47" name="Picture 47"/>
-                  <wp:cNvGraphicFramePr>
-                    <a:graphicFrameLocks noChangeAspect="1"/>
-                  </wp:cNvGraphicFramePr>
-                  <a:graphic>
-                    <a:graphicData uri="http://schemas.openxmlformats.org/drawingml/2006/picture">
-                      <pic:pic>
-                        <pic:nvPicPr>
-                          <pic:cNvPr id="0" name="image.jpg"/>
-                          <pic:cNvPicPr/>
-                        </pic:nvPicPr>
-                        <pic:blipFill>
-                          <a:blip r:embed="rId14"/>
-                          <a:stretch>
-                            <a:fillRect/>
-                          </a:stretch>
-                        </pic:blipFill>
-                        <pic:spPr>
-                          <a:xfrm>
-                            <a:off x="0" y="0"/>
-                            <a:ext cx="1395000" cy="3100000"/>
-                          </a:xfrm>
-                          <a:prstGeom prst="rect"/>
-                        </pic:spPr>
-                      </pic:pic>
-                    </a:graphicData>
-                  </a:graphic>
-                </wp:inline>
-              </w:drawing>
-            </w:r>
-          </w:p>
-          <w:p>
-            <w:pPr>
-              <w:jc w:val="center"/>
-            </w:pPr>
-            <w:r>
-              <w:rPr>
-                <w:rFonts w:ascii="Times New Roman" w:hAnsi="Times New Roman" w:eastAsia="Times New Roman" w:cs="Times New Roman"/>
-                <w:b w:val="0"/>
-                <w:color w:val="161616"/>
-                <w:sz w:val="16"/>
-              </w:rPr>
-              <w:t>Filtre fangatahana</w:t>
-            </w:r>
-          </w:p>
-        </w:tc>
         <w:tc>
           <w:tcPr>
             <w:tcW w:type="dxa" w:w="2436"/>

</xml_diff>

<commit_message>
project doc w screens v3
</commit_message>
<xml_diff>
--- a/doc/documentation-projet-iray.docx
+++ b/doc/documentation-projet-iray.docx
@@ -4698,14 +4698,14 @@
         <w:tblLook w:firstColumn="1" w:firstRow="1" w:lastColumn="0" w:lastRow="0" w:noHBand="0" w:noVBand="1" w:val="04A0"/>
       </w:tblPr>
       <w:tblGrid>
-        <w:gridCol w:w="2436"/>
-        <w:gridCol w:w="2436"/>
-        <w:gridCol w:w="2436"/>
+        <w:gridCol w:w="3249"/>
+        <w:gridCol w:w="3249"/>
+        <w:gridCol w:w="3249"/>
       </w:tblGrid>
       <w:tr>
         <w:tc>
           <w:tcPr>
-            <w:tcW w:type="dxa" w:w="2436"/>
+            <w:tcW w:type="dxa" w:w="3249"/>
             <w:tcBorders>
               <w:top w:val="nil"/>
               <w:left w:val="nil"/>
@@ -4720,7 +4720,7 @@
             <w:r>
               <w:drawing>
                 <wp:inline xmlns:a="http://schemas.openxmlformats.org/drawingml/2006/main" xmlns:pic="http://schemas.openxmlformats.org/drawingml/2006/picture">
-                  <wp:extent cx="1395000" cy="3100000"/>
+                  <wp:extent cx="1440000" cy="3200000"/>
                   <wp:docPr id="45" name="Picture 45"/>
                   <wp:cNvGraphicFramePr>
                     <a:graphicFrameLocks noChangeAspect="1"/>
@@ -4741,7 +4741,7 @@
                         <pic:spPr>
                           <a:xfrm>
                             <a:off x="0" y="0"/>
-                            <a:ext cx="1395000" cy="3100000"/>
+                            <a:ext cx="1440000" cy="3200000"/>
                           </a:xfrm>
                           <a:prstGeom prst="rect"/>
                         </pic:spPr>
@@ -4769,7 +4769,7 @@
         </w:tc>
         <w:tc>
           <w:tcPr>
-            <w:tcW w:type="dxa" w:w="2436"/>
+            <w:tcW w:type="dxa" w:w="3249"/>
             <w:tcBorders>
               <w:top w:val="nil"/>
               <w:left w:val="nil"/>
@@ -4784,7 +4784,7 @@
             <w:r>
               <w:drawing>
                 <wp:inline xmlns:a="http://schemas.openxmlformats.org/drawingml/2006/main" xmlns:pic="http://schemas.openxmlformats.org/drawingml/2006/picture">
-                  <wp:extent cx="1395000" cy="3100000"/>
+                  <wp:extent cx="1440000" cy="3200000"/>
                   <wp:docPr id="46" name="Picture 46"/>
                   <wp:cNvGraphicFramePr>
                     <a:graphicFrameLocks noChangeAspect="1"/>
@@ -4805,7 +4805,7 @@
                         <pic:spPr>
                           <a:xfrm>
                             <a:off x="0" y="0"/>
-                            <a:ext cx="1395000" cy="3100000"/>
+                            <a:ext cx="1440000" cy="3200000"/>
                           </a:xfrm>
                           <a:prstGeom prst="rect"/>
                         </pic:spPr>
@@ -4833,7 +4833,7 @@
         </w:tc>
         <w:tc>
           <w:tcPr>
-            <w:tcW w:type="dxa" w:w="2436"/>
+            <w:tcW w:type="dxa" w:w="3249"/>
             <w:tcBorders>
               <w:top w:val="nil"/>
               <w:left w:val="nil"/>
@@ -4848,7 +4848,7 @@
             <w:r>
               <w:drawing>
                 <wp:inline xmlns:a="http://schemas.openxmlformats.org/drawingml/2006/main" xmlns:pic="http://schemas.openxmlformats.org/drawingml/2006/picture">
-                  <wp:extent cx="1395000" cy="3100000"/>
+                  <wp:extent cx="1440000" cy="3200000"/>
                   <wp:docPr id="47" name="Picture 47"/>
                   <wp:cNvGraphicFramePr>
                     <a:graphicFrameLocks noChangeAspect="1"/>
@@ -4869,7 +4869,7 @@
                         <pic:spPr>
                           <a:xfrm>
                             <a:off x="0" y="0"/>
-                            <a:ext cx="1395000" cy="3100000"/>
+                            <a:ext cx="1440000" cy="3200000"/>
                           </a:xfrm>
                           <a:prstGeom prst="rect"/>
                         </pic:spPr>
@@ -6944,6 +6944,288 @@
       </w:tr>
     </w:tbl>
     <w:p/>
+    <w:p>
+      <w:pPr>
+        <w:pStyle w:val="Titre2"/>
+      </w:pPr>
+      <w:r>
+        <w:rPr>
+          <w:rFonts w:ascii="Times New Roman" w:hAnsi="Times New Roman" w:eastAsia="Times New Roman" w:cs="Times New Roman"/>
+          <w:b/>
+          <w:sz w:val="22"/>
+        </w:rPr>
+        <w:t>17.13. Backend Firebase (Firestore)</w:t>
+      </w:r>
+    </w:p>
+    <w:p>
+      <w:pPr/>
+      <w:r>
+        <w:rPr>
+          <w:rFonts w:ascii="Times New Roman" w:hAnsi="Times New Roman" w:eastAsia="Times New Roman" w:cs="Times New Roman"/>
+          <w:b w:val="0"/>
+          <w:sz w:val="22"/>
+        </w:rPr>
+        <w:t>Captures Firebase Console (Cloud Firestore). Chaque image est en pleine largeur pour rester lisible.</w:t>
+      </w:r>
+    </w:p>
+    <w:tbl>
+      <w:tblPr>
+        <w:tblW w:type="auto" w:w="0"/>
+        <w:tblLook w:firstColumn="1" w:firstRow="1" w:lastColumn="0" w:lastRow="0" w:noHBand="0" w:noVBand="1" w:val="04A0"/>
+      </w:tblPr>
+      <w:tblGrid>
+        <w:gridCol w:w="9752"/>
+      </w:tblGrid>
+      <w:tr>
+        <w:tc>
+          <w:tcPr>
+            <w:tcW w:type="dxa" w:w="9752"/>
+            <w:tcBorders>
+              <w:top w:val="nil"/>
+              <w:left w:val="nil"/>
+              <w:bottom w:val="nil"/>
+              <w:right w:val="nil"/>
+            </w:tcBorders>
+          </w:tcPr>
+          <w:p>
+            <w:pPr>
+              <w:jc w:val="center"/>
+            </w:pPr>
+            <w:r>
+              <w:drawing>
+                <wp:inline xmlns:a="http://schemas.openxmlformats.org/drawingml/2006/main" xmlns:pic="http://schemas.openxmlformats.org/drawingml/2006/picture">
+                  <wp:extent cx="5750000" cy="3211394"/>
+                  <wp:docPr id="52" name="Firebase 1"/>
+                  <wp:cNvGraphicFramePr>
+                    <a:graphicFrameLocks noChangeAspect="1"/>
+                  </wp:cNvGraphicFramePr>
+                  <a:graphic>
+                    <a:graphicData uri="http://schemas.openxmlformats.org/drawingml/2006/picture">
+                      <pic:pic>
+                        <pic:nvPicPr>
+                          <pic:cNvPr id="0" name="image.jpg"/>
+                          <pic:cNvPicPr/>
+                        </pic:nvPicPr>
+                        <pic:blipFill>
+                          <a:blip r:embed="rId56"/>
+                          <a:stretch>
+                            <a:fillRect/>
+                          </a:stretch>
+                        </pic:blipFill>
+                        <pic:spPr>
+                          <a:xfrm>
+                            <a:off x="0" y="0"/>
+                            <a:ext cx="5750000" cy="3211394"/>
+                          </a:xfrm>
+                          <a:prstGeom prst="rect"/>
+                        </pic:spPr>
+                      </pic:pic>
+                    </a:graphicData>
+                  </a:graphic>
+                </wp:inline>
+              </w:drawing>
+            </w:r>
+          </w:p>
+          <w:p>
+            <w:pPr>
+              <w:jc w:val="center"/>
+            </w:pPr>
+            <w:r>
+              <w:rPr>
+                <w:rFonts w:ascii="Times New Roman" w:hAnsi="Times New Roman" w:eastAsia="Times New Roman" w:cs="Times New Roman"/>
+                <w:b w:val="0"/>
+                <w:color w:val="161616"/>
+                <w:sz w:val="20"/>
+              </w:rPr>
+              <w:t>1. Collection profile — profils citoyens synchronisés</w:t>
+            </w:r>
+          </w:p>
+        </w:tc>
+      </w:tr>
+    </w:tbl>
+    <w:p>
+      <w:pPr/>
+      <w:r>
+        <w:rPr>
+          <w:rFonts w:ascii="Times New Roman" w:hAnsi="Times New Roman" w:eastAsia="Times New Roman" w:cs="Times New Roman"/>
+          <w:b w:val="0"/>
+          <w:sz w:val="22"/>
+        </w:rPr>
+        <w:t/>
+      </w:r>
+    </w:p>
+    <w:tbl>
+      <w:tblPr>
+        <w:tblW w:type="auto" w:w="0"/>
+        <w:tblLook w:firstColumn="1" w:firstRow="1" w:lastColumn="0" w:lastRow="0" w:noHBand="0" w:noVBand="1" w:val="04A0"/>
+      </w:tblPr>
+      <w:tblGrid>
+        <w:gridCol w:w="9752"/>
+      </w:tblGrid>
+      <w:tr>
+        <w:tc>
+          <w:tcPr>
+            <w:tcW w:type="dxa" w:w="9752"/>
+            <w:tcBorders>
+              <w:top w:val="nil"/>
+              <w:left w:val="nil"/>
+              <w:bottom w:val="nil"/>
+              <w:right w:val="nil"/>
+            </w:tcBorders>
+          </w:tcPr>
+          <w:p>
+            <w:pPr>
+              <w:jc w:val="center"/>
+            </w:pPr>
+            <w:r>
+              <w:drawing>
+                <wp:inline xmlns:a="http://schemas.openxmlformats.org/drawingml/2006/main" xmlns:pic="http://schemas.openxmlformats.org/drawingml/2006/picture">
+                  <wp:extent cx="5750000" cy="3322923"/>
+                  <wp:docPr id="53" name="Firebase 2"/>
+                  <wp:cNvGraphicFramePr>
+                    <a:graphicFrameLocks noChangeAspect="1"/>
+                  </wp:cNvGraphicFramePr>
+                  <a:graphic>
+                    <a:graphicData uri="http://schemas.openxmlformats.org/drawingml/2006/picture">
+                      <pic:pic>
+                        <pic:nvPicPr>
+                          <pic:cNvPr id="0" name="image.jpg"/>
+                          <pic:cNvPicPr/>
+                        </pic:nvPicPr>
+                        <pic:blipFill>
+                          <a:blip r:embed="rId57"/>
+                          <a:stretch>
+                            <a:fillRect/>
+                          </a:stretch>
+                        </pic:blipFill>
+                        <pic:spPr>
+                          <a:xfrm>
+                            <a:off x="0" y="0"/>
+                            <a:ext cx="5750000" cy="3322923"/>
+                          </a:xfrm>
+                          <a:prstGeom prst="rect"/>
+                        </pic:spPr>
+                      </pic:pic>
+                    </a:graphicData>
+                  </a:graphic>
+                </wp:inline>
+              </w:drawing>
+            </w:r>
+          </w:p>
+          <w:p>
+            <w:pPr>
+              <w:jc w:val="center"/>
+            </w:pPr>
+            <w:r>
+              <w:rPr>
+                <w:rFonts w:ascii="Times New Roman" w:hAnsi="Times New Roman" w:eastAsia="Times New Roman" w:cs="Times New Roman"/>
+                <w:b w:val="0"/>
+                <w:color w:val="161616"/>
+                <w:sz w:val="20"/>
+              </w:rPr>
+              <w:t>2. Collection signalements — tatitra (catégorie, GPS, statut)</w:t>
+            </w:r>
+          </w:p>
+        </w:tc>
+      </w:tr>
+    </w:tbl>
+    <w:p>
+      <w:pPr/>
+      <w:r>
+        <w:rPr>
+          <w:rFonts w:ascii="Times New Roman" w:hAnsi="Times New Roman" w:eastAsia="Times New Roman" w:cs="Times New Roman"/>
+          <w:b w:val="0"/>
+          <w:sz w:val="22"/>
+        </w:rPr>
+        <w:t/>
+      </w:r>
+    </w:p>
+    <w:tbl>
+      <w:tblPr>
+        <w:tblW w:type="auto" w:w="0"/>
+        <w:tblLook w:firstColumn="1" w:firstRow="1" w:lastColumn="0" w:lastRow="0" w:noHBand="0" w:noVBand="1" w:val="04A0"/>
+      </w:tblPr>
+      <w:tblGrid>
+        <w:gridCol w:w="9752"/>
+      </w:tblGrid>
+      <w:tr>
+        <w:tc>
+          <w:tcPr>
+            <w:tcW w:type="dxa" w:w="9752"/>
+            <w:tcBorders>
+              <w:top w:val="nil"/>
+              <w:left w:val="nil"/>
+              <w:bottom w:val="nil"/>
+              <w:right w:val="nil"/>
+            </w:tcBorders>
+          </w:tcPr>
+          <w:p>
+            <w:pPr>
+              <w:jc w:val="center"/>
+            </w:pPr>
+            <w:r>
+              <w:drawing>
+                <wp:inline xmlns:a="http://schemas.openxmlformats.org/drawingml/2006/main" xmlns:pic="http://schemas.openxmlformats.org/drawingml/2006/picture">
+                  <wp:extent cx="5750000" cy="2923400"/>
+                  <wp:docPr id="54" name="Firebase 3"/>
+                  <wp:cNvGraphicFramePr>
+                    <a:graphicFrameLocks noChangeAspect="1"/>
+                  </wp:cNvGraphicFramePr>
+                  <a:graphic>
+                    <a:graphicData uri="http://schemas.openxmlformats.org/drawingml/2006/picture">
+                      <pic:pic>
+                        <pic:nvPicPr>
+                          <pic:cNvPr id="0" name="image.jpg"/>
+                          <pic:cNvPicPr/>
+                        </pic:nvPicPr>
+                        <pic:blipFill>
+                          <a:blip r:embed="rId58"/>
+                          <a:stretch>
+                            <a:fillRect/>
+                          </a:stretch>
+                        </pic:blipFill>
+                        <pic:spPr>
+                          <a:xfrm>
+                            <a:off x="0" y="0"/>
+                            <a:ext cx="5750000" cy="2923400"/>
+                          </a:xfrm>
+                          <a:prstGeom prst="rect"/>
+                        </pic:spPr>
+                      </pic:pic>
+                    </a:graphicData>
+                  </a:graphic>
+                </wp:inline>
+              </w:drawing>
+            </w:r>
+          </w:p>
+          <w:p>
+            <w:pPr>
+              <w:jc w:val="center"/>
+            </w:pPr>
+            <w:r>
+              <w:rPr>
+                <w:rFonts w:ascii="Times New Roman" w:hAnsi="Times New Roman" w:eastAsia="Times New Roman" w:cs="Times New Roman"/>
+                <w:b w:val="0"/>
+                <w:color w:val="161616"/>
+                <w:sz w:val="20"/>
+              </w:rPr>
+              <w:t>3. Collection requests — fangatahana (formulaire, pièces, statut)</w:t>
+            </w:r>
+          </w:p>
+        </w:tc>
+      </w:tr>
+    </w:tbl>
+    <w:p>
+      <w:pPr/>
+      <w:r>
+        <w:rPr>
+          <w:rFonts w:ascii="Times New Roman" w:hAnsi="Times New Roman" w:eastAsia="Times New Roman" w:cs="Times New Roman"/>
+          <w:b w:val="0"/>
+          <w:sz w:val="22"/>
+        </w:rPr>
+        <w:t/>
+      </w:r>
+    </w:p>
     <w:p>
       <w:pPr>
         <w:pStyle w:val="Titre1"/>

</xml_diff>

<commit_message>
docs: update project documentation with technology stack and offline-first principles
</commit_message>
<xml_diff>
--- a/doc/documentation-projet-iray.docx
+++ b/doc/documentation-projet-iray.docx
@@ -717,15 +717,614 @@
     <w:p>
       <w:pPr>
         <w:pStyle w:val="Titre2"/>
+      </w:pPr>
+      <w:r>
+        <w:rPr>
+          <w:rFonts w:ascii="Times New Roman" w:hAnsi="Times New Roman" w:eastAsia="Times New Roman" w:cs="Times New Roman"/>
+          <w:b/>
+          <w:sz w:val="22"/>
+        </w:rPr>
+        <w:t>4.1. Technologies utilisées</w:t>
+      </w:r>
+    </w:p>
+    <w:p>
+      <w:pPr/>
+      <w:r>
+        <w:rPr>
+          <w:rFonts w:ascii="Times New Roman" w:hAnsi="Times New Roman" w:eastAsia="Times New Roman" w:cs="Times New Roman"/>
+          <w:b w:val="0"/>
+          <w:sz w:val="22"/>
+        </w:rPr>
+        <w:t>Tableau des technologies effectivement utilisées dans le dépôt iray (versions issues de gradle/libs.versions.toml et app/build.gradle.kts).</w:t>
+      </w:r>
+    </w:p>
+    <w:tbl>
+      <w:tblPr>
+        <w:tblStyle w:val="Grilledutableau"/>
+        <w:tblW w:type="auto" w:w="0"/>
+        <w:tblLook w:firstColumn="1" w:firstRow="1" w:lastColumn="0" w:lastRow="0" w:noHBand="0" w:noVBand="1" w:val="04A0"/>
+      </w:tblPr>
+      <w:tblGrid>
+        <w:gridCol w:w="4873"/>
+        <w:gridCol w:w="4873"/>
+      </w:tblGrid>
+      <w:tr>
+        <w:tc>
+          <w:tcPr>
+            <w:tcW w:type="dxa" w:w="4873"/>
+            <w:shd w:fill="1F4E79" w:val="clear"/>
+          </w:tcPr>
+          <w:p>
+            <w:r/>
+            <w:r>
+              <w:rPr>
+                <w:rFonts w:ascii="Times New Roman" w:hAnsi="Times New Roman" w:eastAsia="Times New Roman" w:cs="Times New Roman"/>
+                <w:b/>
+                <w:color w:val="FFFFFF"/>
+                <w:sz w:val="22"/>
+              </w:rPr>
+              <w:t>Couche</w:t>
+            </w:r>
+          </w:p>
+        </w:tc>
+        <w:tc>
+          <w:tcPr>
+            <w:tcW w:type="dxa" w:w="4873"/>
+            <w:shd w:fill="1F4E79" w:val="clear"/>
+          </w:tcPr>
+          <w:p>
+            <w:r/>
+            <w:r>
+              <w:rPr>
+                <w:rFonts w:ascii="Times New Roman" w:hAnsi="Times New Roman" w:eastAsia="Times New Roman" w:cs="Times New Roman"/>
+                <w:b/>
+                <w:color w:val="FFFFFF"/>
+                <w:sz w:val="22"/>
+              </w:rPr>
+              <w:t>Technologie</w:t>
+            </w:r>
+          </w:p>
+        </w:tc>
+      </w:tr>
+      <w:tr>
+        <w:tc>
+          <w:tcPr>
+            <w:tcW w:type="dxa" w:w="4873"/>
+          </w:tcPr>
+          <w:p>
+            <w:r/>
+            <w:r>
+              <w:rPr>
+                <w:rFonts w:ascii="Times New Roman" w:hAnsi="Times New Roman" w:eastAsia="Times New Roman" w:cs="Times New Roman"/>
+                <w:b w:val="0"/>
+                <w:sz w:val="22"/>
+              </w:rPr>
+              <w:t>Langage</w:t>
+            </w:r>
+          </w:p>
+        </w:tc>
+        <w:tc>
+          <w:tcPr>
+            <w:tcW w:type="dxa" w:w="4873"/>
+          </w:tcPr>
+          <w:p>
+            <w:r/>
+            <w:r>
+              <w:rPr>
+                <w:rFonts w:ascii="Times New Roman" w:hAnsi="Times New Roman" w:eastAsia="Times New Roman" w:cs="Times New Roman"/>
+                <w:b w:val="0"/>
+                <w:sz w:val="22"/>
+              </w:rPr>
+              <w:t>Kotlin 2.1</w:t>
+            </w:r>
+          </w:p>
+        </w:tc>
+      </w:tr>
+      <w:tr>
+        <w:tc>
+          <w:tcPr>
+            <w:tcW w:type="dxa" w:w="4873"/>
+            <w:shd w:fill="E9EFF5" w:val="clear"/>
+          </w:tcPr>
+          <w:p>
+            <w:r/>
+            <w:r>
+              <w:rPr>
+                <w:rFonts w:ascii="Times New Roman" w:hAnsi="Times New Roman" w:eastAsia="Times New Roman" w:cs="Times New Roman"/>
+                <w:b w:val="0"/>
+                <w:sz w:val="22"/>
+              </w:rPr>
+              <w:t>UI</w:t>
+            </w:r>
+          </w:p>
+        </w:tc>
+        <w:tc>
+          <w:tcPr>
+            <w:tcW w:type="dxa" w:w="4873"/>
+            <w:shd w:fill="E9EFF5" w:val="clear"/>
+          </w:tcPr>
+          <w:p>
+            <w:r/>
+            <w:r>
+              <w:rPr>
+                <w:rFonts w:ascii="Times New Roman" w:hAnsi="Times New Roman" w:eastAsia="Times New Roman" w:cs="Times New Roman"/>
+                <w:b w:val="0"/>
+                <w:sz w:val="22"/>
+              </w:rPr>
+              <w:t>Jetpack Compose, Material 3, Compose BOM 2024.12.01</w:t>
+            </w:r>
+          </w:p>
+        </w:tc>
+      </w:tr>
+      <w:tr>
+        <w:tc>
+          <w:tcPr>
+            <w:tcW w:type="dxa" w:w="4873"/>
+          </w:tcPr>
+          <w:p>
+            <w:r/>
+            <w:r>
+              <w:rPr>
+                <w:rFonts w:ascii="Times New Roman" w:hAnsi="Times New Roman" w:eastAsia="Times New Roman" w:cs="Times New Roman"/>
+                <w:b w:val="0"/>
+                <w:sz w:val="22"/>
+              </w:rPr>
+              <w:t>Navigation</w:t>
+            </w:r>
+          </w:p>
+        </w:tc>
+        <w:tc>
+          <w:tcPr>
+            <w:tcW w:type="dxa" w:w="4873"/>
+          </w:tcPr>
+          <w:p>
+            <w:r/>
+            <w:r>
+              <w:rPr>
+                <w:rFonts w:ascii="Times New Roman" w:hAnsi="Times New Roman" w:eastAsia="Times New Roman" w:cs="Times New Roman"/>
+                <w:b w:val="0"/>
+                <w:sz w:val="22"/>
+              </w:rPr>
+              <w:t>Navigation Compose 2.8.4</w:t>
+            </w:r>
+          </w:p>
+        </w:tc>
+      </w:tr>
+      <w:tr>
+        <w:tc>
+          <w:tcPr>
+            <w:tcW w:type="dxa" w:w="4873"/>
+            <w:shd w:fill="E9EFF5" w:val="clear"/>
+          </w:tcPr>
+          <w:p>
+            <w:r/>
+            <w:r>
+              <w:rPr>
+                <w:rFonts w:ascii="Times New Roman" w:hAnsi="Times New Roman" w:eastAsia="Times New Roman" w:cs="Times New Roman"/>
+                <w:b w:val="0"/>
+                <w:sz w:val="22"/>
+              </w:rPr>
+              <w:t>Architecture UI</w:t>
+            </w:r>
+          </w:p>
+        </w:tc>
+        <w:tc>
+          <w:tcPr>
+            <w:tcW w:type="dxa" w:w="4873"/>
+            <w:shd w:fill="E9EFF5" w:val="clear"/>
+          </w:tcPr>
+          <w:p>
+            <w:r/>
+            <w:r>
+              <w:rPr>
+                <w:rFonts w:ascii="Times New Roman" w:hAnsi="Times New Roman" w:eastAsia="Times New Roman" w:cs="Times New Roman"/>
+                <w:b w:val="0"/>
+                <w:sz w:val="22"/>
+              </w:rPr>
+              <w:t>Lifecycle / ViewModel Compose, Activity Compose</w:t>
+            </w:r>
+          </w:p>
+        </w:tc>
+      </w:tr>
+      <w:tr>
+        <w:tc>
+          <w:tcPr>
+            <w:tcW w:type="dxa" w:w="4873"/>
+          </w:tcPr>
+          <w:p>
+            <w:r/>
+            <w:r>
+              <w:rPr>
+                <w:rFonts w:ascii="Times New Roman" w:hAnsi="Times New Roman" w:eastAsia="Times New Roman" w:cs="Times New Roman"/>
+                <w:b w:val="0"/>
+                <w:sz w:val="22"/>
+              </w:rPr>
+              <w:t>Base locale</w:t>
+            </w:r>
+          </w:p>
+        </w:tc>
+        <w:tc>
+          <w:tcPr>
+            <w:tcW w:type="dxa" w:w="4873"/>
+          </w:tcPr>
+          <w:p>
+            <w:r/>
+            <w:r>
+              <w:rPr>
+                <w:rFonts w:ascii="Times New Roman" w:hAnsi="Times New Roman" w:eastAsia="Times New Roman" w:cs="Times New Roman"/>
+                <w:b w:val="0"/>
+                <w:sz w:val="22"/>
+              </w:rPr>
+              <w:t>Room 2.6.1 (KSP), base app_db</w:t>
+            </w:r>
+          </w:p>
+        </w:tc>
+      </w:tr>
+      <w:tr>
+        <w:tc>
+          <w:tcPr>
+            <w:tcW w:type="dxa" w:w="4873"/>
+            <w:shd w:fill="E9EFF5" w:val="clear"/>
+          </w:tcPr>
+          <w:p>
+            <w:r/>
+            <w:r>
+              <w:rPr>
+                <w:rFonts w:ascii="Times New Roman" w:hAnsi="Times New Roman" w:eastAsia="Times New Roman" w:cs="Times New Roman"/>
+                <w:b w:val="0"/>
+                <w:sz w:val="22"/>
+              </w:rPr>
+              <w:t>Backend / sync</w:t>
+            </w:r>
+          </w:p>
+        </w:tc>
+        <w:tc>
+          <w:tcPr>
+            <w:tcW w:type="dxa" w:w="4873"/>
+            <w:shd w:fill="E9EFF5" w:val="clear"/>
+          </w:tcPr>
+          <w:p>
+            <w:r/>
+            <w:r>
+              <w:rPr>
+                <w:rFonts w:ascii="Times New Roman" w:hAnsi="Times New Roman" w:eastAsia="Times New Roman" w:cs="Times New Roman"/>
+                <w:b w:val="0"/>
+                <w:sz w:val="22"/>
+              </w:rPr>
+              <w:t>Firebase Auth, Firestore, Storage, Analytics (BOM 33.16.0)</w:t>
+            </w:r>
+          </w:p>
+        </w:tc>
+      </w:tr>
+      <w:tr>
+        <w:tc>
+          <w:tcPr>
+            <w:tcW w:type="dxa" w:w="4873"/>
+          </w:tcPr>
+          <w:p>
+            <w:r/>
+            <w:r>
+              <w:rPr>
+                <w:rFonts w:ascii="Times New Roman" w:hAnsi="Times New Roman" w:eastAsia="Times New Roman" w:cs="Times New Roman"/>
+                <w:b w:val="0"/>
+                <w:sz w:val="22"/>
+              </w:rPr>
+              <w:t>Tâches de fond</w:t>
+            </w:r>
+          </w:p>
+        </w:tc>
+        <w:tc>
+          <w:tcPr>
+            <w:tcW w:type="dxa" w:w="4873"/>
+          </w:tcPr>
+          <w:p>
+            <w:r/>
+            <w:r>
+              <w:rPr>
+                <w:rFonts w:ascii="Times New Roman" w:hAnsi="Times New Roman" w:eastAsia="Times New Roman" w:cs="Times New Roman"/>
+                <w:b w:val="0"/>
+                <w:sz w:val="22"/>
+              </w:rPr>
+              <w:t>WorkManager 2.9.1 (SyncWorker, MediaUploadWorker)</w:t>
+            </w:r>
+          </w:p>
+        </w:tc>
+      </w:tr>
+      <w:tr>
+        <w:tc>
+          <w:tcPr>
+            <w:tcW w:type="dxa" w:w="4873"/>
+            <w:shd w:fill="E9EFF5" w:val="clear"/>
+          </w:tcPr>
+          <w:p>
+            <w:r/>
+            <w:r>
+              <w:rPr>
+                <w:rFonts w:ascii="Times New Roman" w:hAnsi="Times New Roman" w:eastAsia="Times New Roman" w:cs="Times New Roman"/>
+                <w:b w:val="0"/>
+                <w:sz w:val="22"/>
+              </w:rPr>
+              <w:t>Carte</w:t>
+            </w:r>
+          </w:p>
+        </w:tc>
+        <w:tc>
+          <w:tcPr>
+            <w:tcW w:type="dxa" w:w="4873"/>
+            <w:shd w:fill="E9EFF5" w:val="clear"/>
+          </w:tcPr>
+          <w:p>
+            <w:r/>
+            <w:r>
+              <w:rPr>
+                <w:rFonts w:ascii="Times New Roman" w:hAnsi="Times New Roman" w:eastAsia="Times New Roman" w:cs="Times New Roman"/>
+                <w:b w:val="0"/>
+                <w:sz w:val="22"/>
+              </w:rPr>
+              <w:t>MapLibre Native Android SDK 11.13.1 + tuiles OpenStreetMap</w:t>
+            </w:r>
+          </w:p>
+        </w:tc>
+      </w:tr>
+      <w:tr>
+        <w:tc>
+          <w:tcPr>
+            <w:tcW w:type="dxa" w:w="4873"/>
+          </w:tcPr>
+          <w:p>
+            <w:r/>
+            <w:r>
+              <w:rPr>
+                <w:rFonts w:ascii="Times New Roman" w:hAnsi="Times New Roman" w:eastAsia="Times New Roman" w:cs="Times New Roman"/>
+                <w:b w:val="0"/>
+                <w:sz w:val="22"/>
+              </w:rPr>
+              <w:t>GPS</w:t>
+            </w:r>
+          </w:p>
+        </w:tc>
+        <w:tc>
+          <w:tcPr>
+            <w:tcW w:type="dxa" w:w="4873"/>
+          </w:tcPr>
+          <w:p>
+            <w:r/>
+            <w:r>
+              <w:rPr>
+                <w:rFonts w:ascii="Times New Roman" w:hAnsi="Times New Roman" w:eastAsia="Times New Roman" w:cs="Times New Roman"/>
+                <w:b w:val="0"/>
+                <w:sz w:val="22"/>
+              </w:rPr>
+              <w:t>Google Play Services Location 21.3.0</w:t>
+            </w:r>
+          </w:p>
+        </w:tc>
+      </w:tr>
+      <w:tr>
+        <w:tc>
+          <w:tcPr>
+            <w:tcW w:type="dxa" w:w="4873"/>
+            <w:shd w:fill="E9EFF5" w:val="clear"/>
+          </w:tcPr>
+          <w:p>
+            <w:r/>
+            <w:r>
+              <w:rPr>
+                <w:rFonts w:ascii="Times New Roman" w:hAnsi="Times New Roman" w:eastAsia="Times New Roman" w:cs="Times New Roman"/>
+                <w:b w:val="0"/>
+                <w:sz w:val="22"/>
+              </w:rPr>
+              <w:t>Réseau HTTP</w:t>
+            </w:r>
+          </w:p>
+        </w:tc>
+        <w:tc>
+          <w:tcPr>
+            <w:tcW w:type="dxa" w:w="4873"/>
+            <w:shd w:fill="E9EFF5" w:val="clear"/>
+          </w:tcPr>
+          <w:p>
+            <w:r/>
+            <w:r>
+              <w:rPr>
+                <w:rFonts w:ascii="Times New Roman" w:hAnsi="Times New Roman" w:eastAsia="Times New Roman" w:cs="Times New Roman"/>
+                <w:b w:val="0"/>
+                <w:sz w:val="22"/>
+              </w:rPr>
+              <w:t>Retrofit 2.11, OkHttp 4.12, Gson converter</w:t>
+            </w:r>
+          </w:p>
+        </w:tc>
+      </w:tr>
+      <w:tr>
+        <w:tc>
+          <w:tcPr>
+            <w:tcW w:type="dxa" w:w="4873"/>
+          </w:tcPr>
+          <w:p>
+            <w:r/>
+            <w:r>
+              <w:rPr>
+                <w:rFonts w:ascii="Times New Roman" w:hAnsi="Times New Roman" w:eastAsia="Times New Roman" w:cs="Times New Roman"/>
+                <w:b w:val="0"/>
+                <w:sz w:val="22"/>
+              </w:rPr>
+              <w:t>Asynchrone</w:t>
+            </w:r>
+          </w:p>
+        </w:tc>
+        <w:tc>
+          <w:tcPr>
+            <w:tcW w:type="dxa" w:w="4873"/>
+          </w:tcPr>
+          <w:p>
+            <w:r/>
+            <w:r>
+              <w:rPr>
+                <w:rFonts w:ascii="Times New Roman" w:hAnsi="Times New Roman" w:eastAsia="Times New Roman" w:cs="Times New Roman"/>
+                <w:b w:val="0"/>
+                <w:sz w:val="22"/>
+              </w:rPr>
+              <w:t>Kotlin Coroutines (+ Play Services)</w:t>
+            </w:r>
+          </w:p>
+        </w:tc>
+      </w:tr>
+      <w:tr>
+        <w:tc>
+          <w:tcPr>
+            <w:tcW w:type="dxa" w:w="4873"/>
+            <w:shd w:fill="E9EFF5" w:val="clear"/>
+          </w:tcPr>
+          <w:p>
+            <w:r/>
+            <w:r>
+              <w:rPr>
+                <w:rFonts w:ascii="Times New Roman" w:hAnsi="Times New Roman" w:eastAsia="Times New Roman" w:cs="Times New Roman"/>
+                <w:b w:val="0"/>
+                <w:sz w:val="22"/>
+              </w:rPr>
+              <w:t>Build</w:t>
+            </w:r>
+          </w:p>
+        </w:tc>
+        <w:tc>
+          <w:tcPr>
+            <w:tcW w:type="dxa" w:w="4873"/>
+            <w:shd w:fill="E9EFF5" w:val="clear"/>
+          </w:tcPr>
+          <w:p>
+            <w:r/>
+            <w:r>
+              <w:rPr>
+                <w:rFonts w:ascii="Times New Roman" w:hAnsi="Times New Roman" w:eastAsia="Times New Roman" w:cs="Times New Roman"/>
+                <w:b w:val="0"/>
+                <w:sz w:val="22"/>
+              </w:rPr>
+              <w:t>Android Gradle Plugin 8.7.3, Gradle 8.9, JDK 17</w:t>
+            </w:r>
+          </w:p>
+        </w:tc>
+      </w:tr>
+      <w:tr>
+        <w:tc>
+          <w:tcPr>
+            <w:tcW w:type="dxa" w:w="4873"/>
+          </w:tcPr>
+          <w:p>
+            <w:r/>
+            <w:r>
+              <w:rPr>
+                <w:rFonts w:ascii="Times New Roman" w:hAnsi="Times New Roman" w:eastAsia="Times New Roman" w:cs="Times New Roman"/>
+                <w:b w:val="0"/>
+                <w:sz w:val="22"/>
+              </w:rPr>
+              <w:t>SDK Android</w:t>
+            </w:r>
+          </w:p>
+        </w:tc>
+        <w:tc>
+          <w:tcPr>
+            <w:tcW w:type="dxa" w:w="4873"/>
+          </w:tcPr>
+          <w:p>
+            <w:r/>
+            <w:r>
+              <w:rPr>
+                <w:rFonts w:ascii="Times New Roman" w:hAnsi="Times New Roman" w:eastAsia="Times New Roman" w:cs="Times New Roman"/>
+                <w:b w:val="0"/>
+                <w:sz w:val="22"/>
+              </w:rPr>
+              <w:t>minSdk 24, compileSdk / targetSdk 35</w:t>
+            </w:r>
+          </w:p>
+        </w:tc>
+      </w:tr>
+      <w:tr>
+        <w:tc>
+          <w:tcPr>
+            <w:tcW w:type="dxa" w:w="4873"/>
+            <w:shd w:fill="E9EFF5" w:val="clear"/>
+          </w:tcPr>
+          <w:p>
+            <w:r/>
+            <w:r>
+              <w:rPr>
+                <w:rFonts w:ascii="Times New Roman" w:hAnsi="Times New Roman" w:eastAsia="Times New Roman" w:cs="Times New Roman"/>
+                <w:b w:val="0"/>
+                <w:sz w:val="22"/>
+              </w:rPr>
+              <w:t>Package</w:t>
+            </w:r>
+          </w:p>
+        </w:tc>
+        <w:tc>
+          <w:tcPr>
+            <w:tcW w:type="dxa" w:w="4873"/>
+            <w:shd w:fill="E9EFF5" w:val="clear"/>
+          </w:tcPr>
+          <w:p>
+            <w:r/>
+            <w:r>
+              <w:rPr>
+                <w:rFonts w:ascii="Times New Roman" w:hAnsi="Times New Roman" w:eastAsia="Times New Roman" w:cs="Times New Roman"/>
+                <w:b w:val="0"/>
+                <w:sz w:val="22"/>
+              </w:rPr>
+              <w:t>mg.iray.app (module unique :app)</w:t>
+            </w:r>
+          </w:p>
+        </w:tc>
+      </w:tr>
+      <w:tr>
+        <w:tc>
+          <w:tcPr>
+            <w:tcW w:type="dxa" w:w="4873"/>
+          </w:tcPr>
+          <w:p>
+            <w:r/>
+            <w:r>
+              <w:rPr>
+                <w:rFonts w:ascii="Times New Roman" w:hAnsi="Times New Roman" w:eastAsia="Times New Roman" w:cs="Times New Roman"/>
+                <w:b w:val="0"/>
+                <w:sz w:val="22"/>
+              </w:rPr>
+              <w:t>Tests</w:t>
+            </w:r>
+          </w:p>
+        </w:tc>
+        <w:tc>
+          <w:tcPr>
+            <w:tcW w:type="dxa" w:w="4873"/>
+          </w:tcPr>
+          <w:p>
+            <w:r/>
+            <w:r>
+              <w:rPr>
+                <w:rFonts w:ascii="Times New Roman" w:hAnsi="Times New Roman" w:eastAsia="Times New Roman" w:cs="Times New Roman"/>
+                <w:b w:val="0"/>
+                <w:sz w:val="22"/>
+              </w:rPr>
+              <w:t>JUnit, Espresso, WorkManager Testing, MockWebServer</w:t>
+            </w:r>
+          </w:p>
+        </w:tc>
+      </w:tr>
+    </w:tbl>
+    <w:p>
+      <w:pPr>
+        <w:pStyle w:val="Titre2"/>
         <w:rPr>
           <w:rFonts w:ascii="Times New Roman" w:hAnsi="Times New Roman" w:cs="Times New Roman"/>
         </w:rPr>
       </w:pPr>
       <w:r>
         <w:rPr>
-          <w:rFonts w:ascii="Times New Roman" w:eastAsia="Times New Roman" w:hAnsi="Times New Roman" w:cs="Times New Roman"/>
-        </w:rPr>
-        <w:t>4.1. Offline-first</w:t>
+          <w:rFonts w:ascii="Times New Roman" w:hAnsi="Times New Roman" w:eastAsia="Times New Roman" w:cs="Times New Roman"/>
+          <w:b/>
+          <w:sz w:val="22"/>
+        </w:rPr>
+        <w:t>4.2. Offline-first</w:t>
       </w:r>
     </w:p>
     <w:p>
@@ -827,9 +1426,11 @@
       </w:pPr>
       <w:r>
         <w:rPr>
-          <w:rFonts w:ascii="Times New Roman" w:eastAsia="Times New Roman" w:hAnsi="Times New Roman" w:cs="Times New Roman"/>
-        </w:rPr>
-        <w:t>4.2. Principe une seule application</w:t>
+          <w:rFonts w:ascii="Times New Roman" w:hAnsi="Times New Roman" w:eastAsia="Times New Roman" w:cs="Times New Roman"/>
+          <w:b/>
+          <w:sz w:val="22"/>
+        </w:rPr>
+        <w:t>4.3. Principe une seule application</w:t>
       </w:r>
     </w:p>
     <w:p>

</xml_diff>